<commit_message>
Doc Sprint 1 quasi finita
</commit_message>
<xml_diff>
--- a/3_Documentazione/Documentazione-Sprint1.docx
+++ b/3_Documentazione/Documentazione-Sprint1.docx
@@ -10,6 +10,7 @@
           <w:docPartUnique/>
         </w:docPartObj>
       </w:sdtPr>
+      <w:sdtEndPr/>
       <w:sdtContent>
         <w:p/>
         <w:p>
@@ -108,6 +109,7 @@
                                     <w:dataBinding w:prefixMappings="xmlns:ns0='http://purl.org/dc/elements/1.1/' xmlns:ns1='http://schemas.openxmlformats.org/package/2006/metadata/core-properties' " w:xpath="/ns1:coreProperties[1]/ns0:title[1]" w:storeItemID="{6C3C8BC8-F283-45AE-878A-BAB7291924A1}"/>
                                     <w:text/>
                                   </w:sdtPr>
+                                  <w:sdtEndPr/>
                                   <w:sdtContent>
                                     <w:r>
                                       <w:rPr>
@@ -134,6 +136,7 @@
                                   <w:dataBinding w:prefixMappings="xmlns:ns0='http://purl.org/dc/elements/1.1/' xmlns:ns1='http://schemas.openxmlformats.org/package/2006/metadata/core-properties' " w:xpath="/ns1:coreProperties[1]/ns0:subject[1]" w:storeItemID="{6C3C8BC8-F283-45AE-878A-BAB7291924A1}"/>
                                   <w:text/>
                                 </w:sdtPr>
+                                <w:sdtEndPr/>
                                 <w:sdtContent>
                                   <w:p>
                                     <w:pPr>
@@ -172,6 +175,7 @@
                                   <w:dataBinding w:prefixMappings="xmlns:ns0='http://purl.org/dc/elements/1.1/' xmlns:ns1='http://schemas.openxmlformats.org/package/2006/metadata/core-properties' " w:xpath="/ns1:coreProperties[1]/ns0:creator[1]" w:storeItemID="{6C3C8BC8-F283-45AE-878A-BAB7291924A1}"/>
                                   <w:text/>
                                 </w:sdtPr>
+                                <w:sdtEndPr/>
                                 <w:sdtContent>
                                   <w:p>
                                     <w:pPr>
@@ -248,6 +252,7 @@
                               <w:dataBinding w:prefixMappings="xmlns:ns0='http://purl.org/dc/elements/1.1/' xmlns:ns1='http://schemas.openxmlformats.org/package/2006/metadata/core-properties' " w:xpath="/ns1:coreProperties[1]/ns0:title[1]" w:storeItemID="{6C3C8BC8-F283-45AE-878A-BAB7291924A1}"/>
                               <w:text/>
                             </w:sdtPr>
+                            <w:sdtEndPr/>
                             <w:sdtContent>
                               <w:r>
                                 <w:rPr>
@@ -274,6 +279,7 @@
                             <w:dataBinding w:prefixMappings="xmlns:ns0='http://purl.org/dc/elements/1.1/' xmlns:ns1='http://schemas.openxmlformats.org/package/2006/metadata/core-properties' " w:xpath="/ns1:coreProperties[1]/ns0:subject[1]" w:storeItemID="{6C3C8BC8-F283-45AE-878A-BAB7291924A1}"/>
                             <w:text/>
                           </w:sdtPr>
+                          <w:sdtEndPr/>
                           <w:sdtContent>
                             <w:p>
                               <w:pPr>
@@ -312,6 +318,7 @@
                             <w:dataBinding w:prefixMappings="xmlns:ns0='http://purl.org/dc/elements/1.1/' xmlns:ns1='http://schemas.openxmlformats.org/package/2006/metadata/core-properties' " w:xpath="/ns1:coreProperties[1]/ns0:creator[1]" w:storeItemID="{6C3C8BC8-F283-45AE-878A-BAB7291924A1}"/>
                             <w:text/>
                           </w:sdtPr>
+                          <w:sdtEndPr/>
                           <w:sdtContent>
                             <w:p>
                               <w:pPr>
@@ -429,6 +436,7 @@
                                     <w:calendar w:val="gregorian"/>
                                   </w:date>
                                 </w:sdtPr>
+                                <w:sdtEndPr/>
                                 <w:sdtContent>
                                   <w:p>
                                     <w:pPr>
@@ -495,6 +503,7 @@
                               <w:calendar w:val="gregorian"/>
                             </w:date>
                           </w:sdtPr>
+                          <w:sdtEndPr/>
                           <w:sdtContent>
                             <w:p>
                               <w:pPr>
@@ -529,12 +538,18 @@
             <w:br w:type="page"/>
           </w:r>
         </w:p>
+        <w:bookmarkStart w:id="0" w:name="_GoBack" w:displacedByCustomXml="next"/>
+        <w:bookmarkEnd w:id="0" w:displacedByCustomXml="next"/>
       </w:sdtContent>
     </w:sdt>
     <w:sdt>
       <w:sdtPr>
         <w:rPr>
-          <w:lang w:val="it-IT"/>
+          <w:rFonts w:asciiTheme="minorHAnsi" w:eastAsiaTheme="minorHAnsi" w:hAnsiTheme="minorHAnsi" w:cstheme="minorBidi"/>
+          <w:color w:val="auto"/>
+          <w:sz w:val="22"/>
+          <w:szCs w:val="22"/>
+          <w:lang w:val="it-IT" w:eastAsia="en-US"/>
         </w:rPr>
         <w:id w:val="-2027702213"/>
         <w:docPartObj>
@@ -544,13 +559,8 @@
       </w:sdtPr>
       <w:sdtEndPr>
         <w:rPr>
-          <w:rFonts w:asciiTheme="minorHAnsi" w:eastAsiaTheme="minorHAnsi" w:hAnsiTheme="minorHAnsi" w:cstheme="minorBidi"/>
           <w:b/>
           <w:bCs/>
-          <w:color w:val="auto"/>
-          <w:sz w:val="22"/>
-          <w:szCs w:val="22"/>
-          <w:lang w:eastAsia="en-US"/>
         </w:rPr>
       </w:sdtEndPr>
       <w:sdtContent>
@@ -566,32 +576,17 @@
           </w:r>
         </w:p>
         <w:p>
-          <w:r>
-            <w:fldChar w:fldCharType="begin"/>
-          </w:r>
-          <w:r>
-            <w:instrText xml:space="preserve"> TOC \o "1-3" \h \z \u </w:instrText>
-          </w:r>
-          <w:r>
-            <w:fldChar w:fldCharType="separate"/>
-          </w:r>
-          <w:r>
-            <w:rPr>
-              <w:b/>
-              <w:bCs/>
-              <w:noProof/>
-              <w:lang w:val="it-IT"/>
-            </w:rPr>
-            <w:t>Nessuna voce di sommario trovata.</w:t>
-          </w:r>
-          <w:r>
-            <w:rPr>
-              <w:b/>
-              <w:bCs/>
-              <w:lang w:val="it-IT"/>
-            </w:rPr>
-            <w:fldChar w:fldCharType="end"/>
-          </w:r>
+          <w:fldSimple w:instr=" TOC \o &quot;1-3&quot; \h \z \u ">
+            <w:r>
+              <w:rPr>
+                <w:b/>
+                <w:bCs/>
+                <w:noProof/>
+                <w:lang w:val="it-IT"/>
+              </w:rPr>
+              <w:t>Nessuna voce di sommario trovata.</w:t>
+            </w:r>
+          </w:fldSimple>
         </w:p>
       </w:sdtContent>
     </w:sdt>
@@ -811,13 +806,7 @@
     </w:p>
     <w:p>
       <w:r>
-        <w:t>Descrive le operazioni che deve intraprendere</w:t>
-      </w:r>
-      <w:r>
-        <w:t xml:space="preserve"> </w:t>
-      </w:r>
-      <w:r>
-        <w:t>il cliente per poter effettuare il login.</w:t>
+        <w:t>Descrive le operazioni che deve intraprendere il cliente per poter effettuare il login.</w:t>
       </w:r>
     </w:p>
     <w:p>
@@ -897,30 +886,27 @@
       </w:r>
     </w:p>
     <w:p>
-      <w:r>
+      <w:pPr>
         <w:rPr>
           <w:noProof/>
         </w:rPr>
+      </w:pPr>
+      <w:r>
+        <w:t>Descrive tutte le operazioni che deve svolgere il cliente per crearsi un account.</w:t>
+      </w:r>
+    </w:p>
+    <w:p>
+      <w:pPr>
+        <w:jc w:val="center"/>
+      </w:pPr>
+      <w:r>
+        <w:rPr>
+          <w:noProof/>
+        </w:rPr>
         <w:drawing>
-          <wp:anchor distT="0" distB="0" distL="114300" distR="114300" simplePos="0" relativeHeight="251663360" behindDoc="0" locked="0" layoutInCell="1" allowOverlap="1" wp14:anchorId="2CC1C7F7" wp14:editId="2216A981">
-            <wp:simplePos x="0" y="0"/>
-            <wp:positionH relativeFrom="margin">
-              <wp:align>center</wp:align>
-            </wp:positionH>
-            <wp:positionV relativeFrom="paragraph">
-              <wp:posOffset>249499</wp:posOffset>
-            </wp:positionV>
+          <wp:inline distT="0" distB="0" distL="0" distR="0" wp14:anchorId="144D23C8" wp14:editId="1290818E">
             <wp:extent cx="3515360" cy="4023360"/>
-            <wp:effectExtent l="0" t="0" r="8890" b="0"/>
-            <wp:wrapThrough wrapText="bothSides">
-              <wp:wrapPolygon edited="0">
-                <wp:start x="0" y="0"/>
-                <wp:lineTo x="0" y="21477"/>
-                <wp:lineTo x="21538" y="21477"/>
-                <wp:lineTo x="21538" y="0"/>
-                <wp:lineTo x="0" y="0"/>
-              </wp:wrapPolygon>
-            </wp:wrapThrough>
+            <wp:effectExtent l="95250" t="114300" r="104140" b="110490"/>
             <wp:docPr id="4" name="Immagine 4"/>
             <wp:cNvGraphicFramePr>
               <a:graphicFrameLocks xmlns:a="http://schemas.openxmlformats.org/drawingml/2006/main" noChangeAspect="1"/>
@@ -952,22 +938,20 @@
                     <a:prstGeom prst="rect">
                       <a:avLst/>
                     </a:prstGeom>
+                    <a:effectLst>
+                      <a:outerShdw blurRad="63500" sx="102000" sy="102000" algn="ctr" rotWithShape="0">
+                        <a:prstClr val="black">
+                          <a:alpha val="40000"/>
+                        </a:prstClr>
+                      </a:outerShdw>
+                    </a:effectLst>
                   </pic:spPr>
                 </pic:pic>
               </a:graphicData>
             </a:graphic>
-            <wp14:sizeRelH relativeFrom="margin">
-              <wp14:pctWidth>0</wp14:pctWidth>
-            </wp14:sizeRelH>
-            <wp14:sizeRelV relativeFrom="margin">
-              <wp14:pctHeight>0</wp14:pctHeight>
-            </wp14:sizeRelV>
-          </wp:anchor>
+          </wp:inline>
         </w:drawing>
       </w:r>
-      <w:r>
-        <w:t>Descrive tutte le operazioni che deve svolgere il cliente per crearsi un account.</w:t>
-      </w:r>
     </w:p>
     <w:p/>
     <w:p/>
@@ -995,45 +979,27 @@
         <w:rPr>
           <w:u w:val="single"/>
         </w:rPr>
+        <w:lastRenderedPageBreak/>
         <w:t>Cliente – Acquisto prodotti</w:t>
       </w:r>
     </w:p>
     <w:p>
       <w:r>
-        <w:t>Descrive tutte le operazioni che può svolgere</w:t>
-      </w:r>
-      <w:r>
-        <w:t xml:space="preserve"> </w:t>
-      </w:r>
-      <w:r>
-        <w:t>il cliente (riguardando l'acquisto di prodotti).</w:t>
-      </w:r>
-    </w:p>
-    <w:p>
+        <w:t>Descrive tutte le operazioni che può svolgere il cliente (riguardando l'acquisto di prodotti).</w:t>
+      </w:r>
+    </w:p>
+    <w:p>
+      <w:pPr>
+        <w:jc w:val="center"/>
+      </w:pPr>
       <w:r>
         <w:rPr>
           <w:noProof/>
         </w:rPr>
         <w:drawing>
-          <wp:anchor distT="0" distB="0" distL="114300" distR="114300" simplePos="0" relativeHeight="251664384" behindDoc="0" locked="0" layoutInCell="1" allowOverlap="1" wp14:anchorId="76F29EF5" wp14:editId="477B1C6D">
-            <wp:simplePos x="0" y="0"/>
-            <wp:positionH relativeFrom="margin">
-              <wp:align>center</wp:align>
-            </wp:positionH>
-            <wp:positionV relativeFrom="paragraph">
-              <wp:posOffset>11264</wp:posOffset>
-            </wp:positionV>
+          <wp:inline distT="0" distB="0" distL="0" distR="0" wp14:anchorId="76F29EF5" wp14:editId="677BE46F">
             <wp:extent cx="2999740" cy="3641090"/>
-            <wp:effectExtent l="0" t="0" r="0" b="0"/>
-            <wp:wrapThrough wrapText="bothSides">
-              <wp:wrapPolygon edited="0">
-                <wp:start x="0" y="0"/>
-                <wp:lineTo x="0" y="21472"/>
-                <wp:lineTo x="21399" y="21472"/>
-                <wp:lineTo x="21399" y="0"/>
-                <wp:lineTo x="0" y="0"/>
-              </wp:wrapPolygon>
-            </wp:wrapThrough>
+            <wp:effectExtent l="95250" t="114300" r="86360" b="111760"/>
             <wp:docPr id="5" name="Immagine 5"/>
             <wp:cNvGraphicFramePr>
               <a:graphicFrameLocks xmlns:a="http://schemas.openxmlformats.org/drawingml/2006/main" noChangeAspect="1"/>
@@ -1065,36 +1031,21 @@
                     <a:prstGeom prst="rect">
                       <a:avLst/>
                     </a:prstGeom>
+                    <a:effectLst>
+                      <a:outerShdw blurRad="63500" sx="102000" sy="102000" algn="ctr" rotWithShape="0">
+                        <a:prstClr val="black">
+                          <a:alpha val="40000"/>
+                        </a:prstClr>
+                      </a:outerShdw>
+                    </a:effectLst>
                   </pic:spPr>
                 </pic:pic>
               </a:graphicData>
             </a:graphic>
-            <wp14:sizeRelH relativeFrom="margin">
-              <wp14:pctWidth>0</wp14:pctWidth>
-            </wp14:sizeRelH>
-            <wp14:sizeRelV relativeFrom="margin">
-              <wp14:pctHeight>0</wp14:pctHeight>
-            </wp14:sizeRelV>
-          </wp:anchor>
+          </wp:inline>
         </w:drawing>
       </w:r>
     </w:p>
-    <w:p/>
-    <w:p/>
-    <w:p/>
-    <w:p/>
-    <w:p/>
-    <w:p/>
-    <w:p/>
-    <w:p/>
-    <w:p/>
-    <w:p/>
-    <w:p/>
-    <w:p>
-      <w:r>
-        <w:br w:type="page"/>
-      </w:r>
-    </w:p>
     <w:p>
       <w:pPr>
         <w:pStyle w:val="Titolo3"/>
@@ -1106,7 +1057,6 @@
         <w:rPr>
           <w:u w:val="single"/>
         </w:rPr>
-        <w:lastRenderedPageBreak/>
         <w:t xml:space="preserve">Vendor </w:t>
       </w:r>
       <w:r>
@@ -1124,41 +1074,21 @@
     </w:p>
     <w:p>
       <w:r>
-        <w:t>Descrive le operazioni che deve intraprendere</w:t>
-      </w:r>
-      <w:r>
-        <w:t xml:space="preserve"> </w:t>
-      </w:r>
-      <w:r>
-        <w:t>il vendor per poter effettuare il login.</w:t>
-      </w:r>
-    </w:p>
-    <w:p/>
-    <w:p>
+        <w:t>Descrive le operazioni che deve intraprendere il vendor per poter effettuare il login.</w:t>
+      </w:r>
+    </w:p>
+    <w:p>
+      <w:pPr>
+        <w:jc w:val="center"/>
+      </w:pPr>
       <w:r>
         <w:rPr>
           <w:noProof/>
         </w:rPr>
         <w:drawing>
-          <wp:anchor distT="0" distB="0" distL="114300" distR="114300" simplePos="0" relativeHeight="251665408" behindDoc="0" locked="0" layoutInCell="1" allowOverlap="1" wp14:anchorId="73CB8152" wp14:editId="0374533F">
-            <wp:simplePos x="0" y="0"/>
-            <wp:positionH relativeFrom="margin">
-              <wp:align>center</wp:align>
-            </wp:positionH>
-            <wp:positionV relativeFrom="paragraph">
-              <wp:posOffset>4307</wp:posOffset>
-            </wp:positionV>
-            <wp:extent cx="3315335" cy="4026535"/>
-            <wp:effectExtent l="0" t="0" r="0" b="0"/>
-            <wp:wrapThrough wrapText="bothSides">
-              <wp:wrapPolygon edited="0">
-                <wp:start x="0" y="0"/>
-                <wp:lineTo x="0" y="21460"/>
-                <wp:lineTo x="21472" y="21460"/>
-                <wp:lineTo x="21472" y="0"/>
-                <wp:lineTo x="0" y="0"/>
-              </wp:wrapPolygon>
-            </wp:wrapThrough>
+          <wp:inline distT="0" distB="0" distL="0" distR="0" wp14:anchorId="73CB8152" wp14:editId="62A4DFA8">
+            <wp:extent cx="2989691" cy="3631034"/>
+            <wp:effectExtent l="95250" t="114300" r="96520" b="121920"/>
             <wp:docPr id="6" name="Immagine 6"/>
             <wp:cNvGraphicFramePr>
               <a:graphicFrameLocks xmlns:a="http://schemas.openxmlformats.org/drawingml/2006/main" noChangeAspect="1"/>
@@ -1185,42 +1115,30 @@
                   <pic:spPr>
                     <a:xfrm>
                       <a:off x="0" y="0"/>
-                      <a:ext cx="3315335" cy="4026535"/>
+                      <a:ext cx="2999455" cy="3642893"/>
                     </a:xfrm>
                     <a:prstGeom prst="rect">
                       <a:avLst/>
                     </a:prstGeom>
+                    <a:effectLst>
+                      <a:outerShdw blurRad="63500" sx="102000" sy="102000" algn="ctr" rotWithShape="0">
+                        <a:prstClr val="black">
+                          <a:alpha val="40000"/>
+                        </a:prstClr>
+                      </a:outerShdw>
+                    </a:effectLst>
                   </pic:spPr>
                 </pic:pic>
               </a:graphicData>
             </a:graphic>
-            <wp14:sizeRelH relativeFrom="margin">
-              <wp14:pctWidth>0</wp14:pctWidth>
-            </wp14:sizeRelH>
-            <wp14:sizeRelV relativeFrom="margin">
-              <wp14:pctHeight>0</wp14:pctHeight>
-            </wp14:sizeRelV>
-          </wp:anchor>
+          </wp:inline>
         </w:drawing>
       </w:r>
     </w:p>
-    <w:p/>
-    <w:p/>
-    <w:p/>
-    <w:p/>
-    <w:p/>
-    <w:p/>
-    <w:p/>
-    <w:p/>
-    <w:p/>
-    <w:p/>
-    <w:p/>
-    <w:p/>
-    <w:p/>
-    <w:p>
-      <w:pPr>
-        <w:rPr>
-          <w:rFonts w:asciiTheme="majorHAnsi" w:eastAsiaTheme="majorEastAsia" w:hAnsiTheme="majorHAnsi" w:cstheme="majorBidi"/>
+    <w:p>
+      <w:pPr>
+        <w:pStyle w:val="Titolo3"/>
+        <w:rPr>
           <w:color w:val="2F5496" w:themeColor="accent1" w:themeShade="BF"/>
           <w:sz w:val="26"/>
           <w:szCs w:val="26"/>
@@ -1231,49 +1149,27 @@
         <w:rPr>
           <w:u w:val="single"/>
         </w:rPr>
-        <w:br w:type="page"/>
-      </w:r>
-    </w:p>
-    <w:p>
-      <w:pPr>
-        <w:pStyle w:val="Titolo3"/>
-        <w:rPr>
-          <w:u w:val="single"/>
-        </w:rPr>
-      </w:pPr>
-      <w:r>
-        <w:rPr>
-          <w:u w:val="single"/>
-        </w:rPr>
         <w:lastRenderedPageBreak/>
         <w:t>Vendor – Gestione prodotti</w:t>
       </w:r>
     </w:p>
     <w:p>
       <w:r>
+        <w:t>Descrive tutte le operazioni che può svolgere il vendor (sui prodotti).</w:t>
+      </w:r>
+    </w:p>
+    <w:p>
+      <w:pPr>
+        <w:jc w:val="center"/>
+      </w:pPr>
+      <w:r>
         <w:rPr>
           <w:noProof/>
         </w:rPr>
         <w:drawing>
-          <wp:anchor distT="0" distB="0" distL="114300" distR="114300" simplePos="0" relativeHeight="251666432" behindDoc="0" locked="0" layoutInCell="1" allowOverlap="1" wp14:anchorId="1B66B6CC" wp14:editId="1EEDD3BA">
-            <wp:simplePos x="0" y="0"/>
-            <wp:positionH relativeFrom="margin">
-              <wp:align>center</wp:align>
-            </wp:positionH>
-            <wp:positionV relativeFrom="paragraph">
-              <wp:posOffset>273298</wp:posOffset>
-            </wp:positionV>
+          <wp:inline distT="0" distB="0" distL="0" distR="0" wp14:anchorId="62982F14" wp14:editId="3311E3F0">
             <wp:extent cx="3383915" cy="5525770"/>
-            <wp:effectExtent l="0" t="0" r="6985" b="0"/>
-            <wp:wrapThrough wrapText="bothSides">
-              <wp:wrapPolygon edited="0">
-                <wp:start x="0" y="0"/>
-                <wp:lineTo x="0" y="21521"/>
-                <wp:lineTo x="21523" y="21521"/>
-                <wp:lineTo x="21523" y="0"/>
-                <wp:lineTo x="0" y="0"/>
-              </wp:wrapPolygon>
-            </wp:wrapThrough>
+            <wp:effectExtent l="95250" t="133350" r="102235" b="132080"/>
             <wp:docPr id="7" name="Immagine 7"/>
             <wp:cNvGraphicFramePr>
               <a:graphicFrameLocks xmlns:a="http://schemas.openxmlformats.org/drawingml/2006/main" noChangeAspect="1"/>
@@ -1305,47 +1201,34 @@
                     <a:prstGeom prst="rect">
                       <a:avLst/>
                     </a:prstGeom>
+                    <a:effectLst>
+                      <a:outerShdw blurRad="63500" sx="102000" sy="102000" algn="ctr" rotWithShape="0">
+                        <a:prstClr val="black">
+                          <a:alpha val="40000"/>
+                        </a:prstClr>
+                      </a:outerShdw>
+                    </a:effectLst>
                   </pic:spPr>
                 </pic:pic>
               </a:graphicData>
             </a:graphic>
-            <wp14:sizeRelH relativeFrom="margin">
-              <wp14:pctWidth>0</wp14:pctWidth>
-            </wp14:sizeRelH>
-            <wp14:sizeRelV relativeFrom="margin">
-              <wp14:pctHeight>0</wp14:pctHeight>
-            </wp14:sizeRelV>
-          </wp:anchor>
+          </wp:inline>
         </w:drawing>
       </w:r>
-      <w:r>
-        <w:t>Descrive tutte le operazioni che può svolgere il vendor (sui prodotti).</w:t>
-      </w:r>
-    </w:p>
-    <w:p/>
-    <w:p/>
-    <w:p/>
-    <w:p/>
-    <w:p/>
-    <w:p/>
-    <w:p/>
-    <w:p/>
-    <w:p/>
-    <w:p/>
-    <w:p/>
-    <w:p/>
-    <w:p/>
-    <w:p/>
-    <w:p/>
-    <w:p/>
-    <w:p/>
-    <w:p/>
-    <w:p/>
-    <w:p/>
-    <w:p>
-      <w:pPr>
-        <w:rPr>
-          <w:rFonts w:asciiTheme="majorHAnsi" w:eastAsiaTheme="majorEastAsia" w:hAnsiTheme="majorHAnsi" w:cstheme="majorBidi"/>
+    </w:p>
+    <w:p/>
+    <w:p/>
+    <w:p/>
+    <w:p/>
+    <w:p/>
+    <w:p/>
+    <w:p/>
+    <w:p/>
+    <w:p/>
+    <w:p>
+      <w:pPr>
+        <w:pStyle w:val="Titolo3"/>
+        <w:rPr>
           <w:color w:val="2F5496" w:themeColor="accent1" w:themeShade="BF"/>
           <w:sz w:val="26"/>
           <w:szCs w:val="26"/>
@@ -1356,49 +1239,27 @@
         <w:rPr>
           <w:u w:val="single"/>
         </w:rPr>
-        <w:br w:type="page"/>
-      </w:r>
-    </w:p>
-    <w:p>
-      <w:pPr>
-        <w:pStyle w:val="Titolo3"/>
-        <w:rPr>
-          <w:u w:val="single"/>
-        </w:rPr>
-      </w:pPr>
-      <w:r>
-        <w:rPr>
-          <w:u w:val="single"/>
-        </w:rPr>
         <w:lastRenderedPageBreak/>
         <w:t>Admin – Login</w:t>
       </w:r>
     </w:p>
     <w:p>
       <w:r>
+        <w:t>Descrive le operazioni che deve intraprendere l'admin per poter effettuare il login.</w:t>
+      </w:r>
+    </w:p>
+    <w:p>
+      <w:pPr>
+        <w:jc w:val="center"/>
+      </w:pPr>
+      <w:r>
         <w:rPr>
           <w:noProof/>
         </w:rPr>
         <w:drawing>
-          <wp:anchor distT="0" distB="0" distL="114300" distR="114300" simplePos="0" relativeHeight="251667456" behindDoc="0" locked="0" layoutInCell="1" allowOverlap="1" wp14:anchorId="4F8837C4" wp14:editId="7EF73DD9">
-            <wp:simplePos x="0" y="0"/>
-            <wp:positionH relativeFrom="margin">
-              <wp:align>center</wp:align>
-            </wp:positionH>
-            <wp:positionV relativeFrom="paragraph">
-              <wp:posOffset>280090</wp:posOffset>
-            </wp:positionV>
+          <wp:inline distT="0" distB="0" distL="0" distR="0" wp14:anchorId="4F8837C4" wp14:editId="3E9A35CB">
             <wp:extent cx="3505835" cy="3959225"/>
-            <wp:effectExtent l="0" t="0" r="0" b="3175"/>
-            <wp:wrapThrough wrapText="bothSides">
-              <wp:wrapPolygon edited="0">
-                <wp:start x="0" y="0"/>
-                <wp:lineTo x="0" y="21513"/>
-                <wp:lineTo x="21479" y="21513"/>
-                <wp:lineTo x="21479" y="0"/>
-                <wp:lineTo x="0" y="0"/>
-              </wp:wrapPolygon>
-            </wp:wrapThrough>
+            <wp:effectExtent l="95250" t="114300" r="94615" b="117475"/>
             <wp:docPr id="9" name="Immagine 9"/>
             <wp:cNvGraphicFramePr>
               <a:graphicFrameLocks xmlns:a="http://schemas.openxmlformats.org/drawingml/2006/main" noChangeAspect="1"/>
@@ -1430,44 +1291,21 @@
                     <a:prstGeom prst="rect">
                       <a:avLst/>
                     </a:prstGeom>
+                    <a:effectLst>
+                      <a:outerShdw blurRad="63500" sx="102000" sy="102000" algn="ctr" rotWithShape="0">
+                        <a:prstClr val="black">
+                          <a:alpha val="40000"/>
+                        </a:prstClr>
+                      </a:outerShdw>
+                    </a:effectLst>
                   </pic:spPr>
                 </pic:pic>
               </a:graphicData>
             </a:graphic>
-            <wp14:sizeRelH relativeFrom="margin">
-              <wp14:pctWidth>0</wp14:pctWidth>
-            </wp14:sizeRelH>
-            <wp14:sizeRelV relativeFrom="margin">
-              <wp14:pctHeight>0</wp14:pctHeight>
-            </wp14:sizeRelV>
-          </wp:anchor>
+          </wp:inline>
         </w:drawing>
       </w:r>
-      <w:r>
-        <w:t>Descrive le operazioni che deve intraprendere</w:t>
-      </w:r>
-      <w:r>
-        <w:t xml:space="preserve"> </w:t>
-      </w:r>
-      <w:r>
-        <w:t>l'admin per poter effettuare il login.</w:t>
-      </w:r>
-    </w:p>
-    <w:p/>
-    <w:p/>
-    <w:p/>
-    <w:p/>
-    <w:p/>
-    <w:p/>
-    <w:p/>
-    <w:p/>
-    <w:p/>
-    <w:p/>
-    <w:p/>
-    <w:p/>
-    <w:p/>
-    <w:p/>
-    <w:p/>
+    </w:p>
     <w:p>
       <w:pPr>
         <w:pStyle w:val="Titolo3"/>
@@ -1484,29 +1322,21 @@
     </w:p>
     <w:p>
       <w:r>
+        <w:t>Descrive tutte le operazioni che può svolgere l'admin (sugli utenti).</w:t>
+      </w:r>
+    </w:p>
+    <w:p>
+      <w:pPr>
+        <w:jc w:val="center"/>
+      </w:pPr>
+      <w:r>
         <w:rPr>
           <w:noProof/>
         </w:rPr>
         <w:drawing>
-          <wp:anchor distT="0" distB="0" distL="114300" distR="114300" simplePos="0" relativeHeight="251668480" behindDoc="0" locked="0" layoutInCell="1" allowOverlap="1" wp14:anchorId="3A0A71E7" wp14:editId="365609FB">
-            <wp:simplePos x="0" y="0"/>
-            <wp:positionH relativeFrom="margin">
-              <wp:align>center</wp:align>
-            </wp:positionH>
-            <wp:positionV relativeFrom="paragraph">
-              <wp:posOffset>233266</wp:posOffset>
-            </wp:positionV>
-            <wp:extent cx="2989690" cy="3673950"/>
-            <wp:effectExtent l="0" t="0" r="1270" b="3175"/>
-            <wp:wrapThrough wrapText="bothSides">
-              <wp:wrapPolygon edited="0">
-                <wp:start x="0" y="0"/>
-                <wp:lineTo x="0" y="21507"/>
-                <wp:lineTo x="21472" y="21507"/>
-                <wp:lineTo x="21472" y="0"/>
-                <wp:lineTo x="0" y="0"/>
-              </wp:wrapPolygon>
-            </wp:wrapThrough>
+          <wp:inline distT="0" distB="0" distL="0" distR="0" wp14:anchorId="3A0A71E7" wp14:editId="6904302B">
+            <wp:extent cx="2663687" cy="3273334"/>
+            <wp:effectExtent l="76200" t="114300" r="80010" b="118110"/>
             <wp:docPr id="10" name="Immagine 10"/>
             <wp:cNvGraphicFramePr>
               <a:graphicFrameLocks xmlns:a="http://schemas.openxmlformats.org/drawingml/2006/main" noChangeAspect="1"/>
@@ -1533,45 +1363,27 @@
                   <pic:spPr>
                     <a:xfrm>
                       <a:off x="0" y="0"/>
-                      <a:ext cx="2989690" cy="3673950"/>
+                      <a:ext cx="2674551" cy="3286685"/>
                     </a:xfrm>
                     <a:prstGeom prst="rect">
                       <a:avLst/>
                     </a:prstGeom>
+                    <a:effectLst>
+                      <a:outerShdw blurRad="63500" sx="102000" sy="102000" algn="ctr" rotWithShape="0">
+                        <a:prstClr val="black">
+                          <a:alpha val="40000"/>
+                        </a:prstClr>
+                      </a:outerShdw>
+                    </a:effectLst>
                   </pic:spPr>
                 </pic:pic>
               </a:graphicData>
             </a:graphic>
-          </wp:anchor>
+          </wp:inline>
         </w:drawing>
       </w:r>
-      <w:r>
-        <w:t>Descrive tutte le operazioni che può svolgere</w:t>
-      </w:r>
-      <w:r>
-        <w:t xml:space="preserve"> </w:t>
-      </w:r>
-      <w:r>
-        <w:t>l'admin (sugli utenti).</w:t>
-      </w:r>
-    </w:p>
-    <w:p/>
-    <w:p/>
-    <w:p/>
-    <w:p/>
-    <w:p/>
-    <w:p/>
-    <w:p/>
-    <w:p/>
-    <w:p/>
-    <w:p/>
-    <w:p/>
-    <w:p/>
-    <w:p>
-      <w:r>
-        <w:br w:type="page"/>
-      </w:r>
-    </w:p>
+    </w:p>
+    <w:p/>
     <w:p>
       <w:pPr>
         <w:pStyle w:val="Titolo2"/>
@@ -1607,8 +1419,6 @@
       <w:r>
         <w:t xml:space="preserve"> per l’applicativo.</w:t>
       </w:r>
-      <w:bookmarkStart w:id="0" w:name="_GoBack"/>
-      <w:bookmarkEnd w:id="0"/>
     </w:p>
     <w:p>
       <w:pPr>
@@ -1619,9 +1429,9 @@
           <w:noProof/>
         </w:rPr>
         <w:drawing>
-          <wp:inline distT="0" distB="0" distL="0" distR="0" wp14:anchorId="1F48CD23" wp14:editId="28426ED2">
+          <wp:inline distT="0" distB="0" distL="0" distR="0" wp14:anchorId="1F48CD23" wp14:editId="08832D52">
             <wp:extent cx="6120130" cy="6901815"/>
-            <wp:effectExtent l="0" t="0" r="0" b="0"/>
+            <wp:effectExtent l="114300" t="133350" r="109220" b="127635"/>
             <wp:docPr id="11" name="Immagine 11"/>
             <wp:cNvGraphicFramePr>
               <a:graphicFrameLocks xmlns:a="http://schemas.openxmlformats.org/drawingml/2006/main" noChangeAspect="1"/>
@@ -1653,6 +1463,13 @@
                     <a:prstGeom prst="rect">
                       <a:avLst/>
                     </a:prstGeom>
+                    <a:effectLst>
+                      <a:outerShdw blurRad="63500" sx="102000" sy="102000" algn="ctr" rotWithShape="0">
+                        <a:prstClr val="black">
+                          <a:alpha val="40000"/>
+                        </a:prstClr>
+                      </a:outerShdw>
+                    </a:effectLst>
                   </pic:spPr>
                 </pic:pic>
               </a:graphicData>
@@ -1717,29 +1534,27 @@
     </w:p>
     <w:p>
       <w:r>
+        <w:t>Design della Home Page (</w:t>
+      </w:r>
+      <w:r>
+        <w:t>senza aver effettuato il login)</w:t>
+      </w:r>
+      <w:r>
+        <w:t>.</w:t>
+      </w:r>
+    </w:p>
+    <w:p>
+      <w:pPr>
+        <w:jc w:val="center"/>
+      </w:pPr>
+      <w:r>
         <w:rPr>
           <w:noProof/>
         </w:rPr>
         <w:drawing>
-          <wp:anchor distT="0" distB="0" distL="114300" distR="114300" simplePos="0" relativeHeight="251670528" behindDoc="0" locked="0" layoutInCell="1" allowOverlap="1" wp14:anchorId="1D7AFEFC" wp14:editId="7DC1C8BC">
-            <wp:simplePos x="0" y="0"/>
-            <wp:positionH relativeFrom="margin">
-              <wp:align>center</wp:align>
-            </wp:positionH>
-            <wp:positionV relativeFrom="paragraph">
-              <wp:posOffset>227551</wp:posOffset>
-            </wp:positionV>
+          <wp:inline distT="0" distB="0" distL="0" distR="0" wp14:anchorId="1D7AFEFC" wp14:editId="324DB2C0">
             <wp:extent cx="4452620" cy="2440940"/>
-            <wp:effectExtent l="0" t="0" r="5080" b="0"/>
-            <wp:wrapThrough wrapText="bothSides">
-              <wp:wrapPolygon edited="0">
-                <wp:start x="0" y="0"/>
-                <wp:lineTo x="0" y="21409"/>
-                <wp:lineTo x="21532" y="21409"/>
-                <wp:lineTo x="21532" y="0"/>
-                <wp:lineTo x="0" y="0"/>
-              </wp:wrapPolygon>
-            </wp:wrapThrough>
+            <wp:effectExtent l="95250" t="95250" r="100330" b="92710"/>
             <wp:docPr id="12" name="Immagine 12"/>
             <wp:cNvGraphicFramePr>
               <a:graphicFrameLocks xmlns:a="http://schemas.openxmlformats.org/drawingml/2006/main" noChangeAspect="1"/>
@@ -1771,38 +1586,21 @@
                     <a:prstGeom prst="rect">
                       <a:avLst/>
                     </a:prstGeom>
+                    <a:effectLst>
+                      <a:outerShdw blurRad="63500" sx="102000" sy="102000" algn="ctr" rotWithShape="0">
+                        <a:prstClr val="black">
+                          <a:alpha val="40000"/>
+                        </a:prstClr>
+                      </a:outerShdw>
+                    </a:effectLst>
                   </pic:spPr>
                 </pic:pic>
               </a:graphicData>
             </a:graphic>
-            <wp14:sizeRelH relativeFrom="margin">
-              <wp14:pctWidth>0</wp14:pctWidth>
-            </wp14:sizeRelH>
-            <wp14:sizeRelV relativeFrom="margin">
-              <wp14:pctHeight>0</wp14:pctHeight>
-            </wp14:sizeRelV>
-          </wp:anchor>
+          </wp:inline>
         </w:drawing>
       </w:r>
-      <w:r>
-        <w:t>Design della Home Page (</w:t>
-      </w:r>
-      <w:r>
-        <w:t>senza aver effettuato il login)</w:t>
-      </w:r>
-      <w:r>
-        <w:t>.</w:t>
-      </w:r>
-    </w:p>
-    <w:p/>
-    <w:p/>
-    <w:p/>
-    <w:p/>
-    <w:p/>
-    <w:p/>
-    <w:p/>
-    <w:p/>
-    <w:p/>
+    </w:p>
     <w:p>
       <w:pPr>
         <w:pStyle w:val="Titolo3"/>
@@ -1823,30 +1621,17 @@
       </w:r>
     </w:p>
     <w:p>
+      <w:pPr>
+        <w:jc w:val="center"/>
+      </w:pPr>
       <w:r>
         <w:rPr>
           <w:noProof/>
         </w:rPr>
         <w:drawing>
-          <wp:anchor distT="0" distB="0" distL="114300" distR="114300" simplePos="0" relativeHeight="251671552" behindDoc="0" locked="0" layoutInCell="1" allowOverlap="1" wp14:anchorId="54404231" wp14:editId="52548BF3">
-            <wp:simplePos x="0" y="0"/>
-            <wp:positionH relativeFrom="margin">
-              <wp:align>center</wp:align>
-            </wp:positionH>
-            <wp:positionV relativeFrom="paragraph">
-              <wp:posOffset>24489</wp:posOffset>
-            </wp:positionV>
+          <wp:inline distT="0" distB="0" distL="0" distR="0" wp14:anchorId="54404231" wp14:editId="1DB02882">
             <wp:extent cx="4540885" cy="2488565"/>
-            <wp:effectExtent l="0" t="0" r="0" b="6985"/>
-            <wp:wrapThrough wrapText="bothSides">
-              <wp:wrapPolygon edited="0">
-                <wp:start x="0" y="0"/>
-                <wp:lineTo x="0" y="21495"/>
-                <wp:lineTo x="21476" y="21495"/>
-                <wp:lineTo x="21476" y="0"/>
-                <wp:lineTo x="0" y="0"/>
-              </wp:wrapPolygon>
-            </wp:wrapThrough>
+            <wp:effectExtent l="95250" t="95250" r="88265" b="102235"/>
             <wp:docPr id="13" name="Immagine 13"/>
             <wp:cNvGraphicFramePr>
               <a:graphicFrameLocks xmlns:a="http://schemas.openxmlformats.org/drawingml/2006/main" noChangeAspect="1"/>
@@ -1878,17 +1663,18 @@
                     <a:prstGeom prst="rect">
                       <a:avLst/>
                     </a:prstGeom>
+                    <a:effectLst>
+                      <a:outerShdw blurRad="63500" sx="102000" sy="102000" algn="ctr" rotWithShape="0">
+                        <a:prstClr val="black">
+                          <a:alpha val="40000"/>
+                        </a:prstClr>
+                      </a:outerShdw>
+                    </a:effectLst>
                   </pic:spPr>
                 </pic:pic>
               </a:graphicData>
             </a:graphic>
-            <wp14:sizeRelH relativeFrom="margin">
-              <wp14:pctWidth>0</wp14:pctWidth>
-            </wp14:sizeRelH>
-            <wp14:sizeRelV relativeFrom="margin">
-              <wp14:pctHeight>0</wp14:pctHeight>
-            </wp14:sizeRelV>
-          </wp:anchor>
+          </wp:inline>
         </w:drawing>
       </w:r>
     </w:p>
@@ -1900,13 +1686,6 @@
     <w:p/>
     <w:p/>
     <w:p/>
-    <w:p/>
-    <w:p/>
-    <w:p>
-      <w:r>
-        <w:br w:type="page"/>
-      </w:r>
-    </w:p>
     <w:p>
       <w:pPr>
         <w:pStyle w:val="Titolo3"/>
@@ -1924,29 +1703,21 @@
     </w:p>
     <w:p>
       <w:r>
+        <w:t>Design della pagina Catalogo che mostra tutti gli articoli.</w:t>
+      </w:r>
+    </w:p>
+    <w:p>
+      <w:pPr>
+        <w:jc w:val="center"/>
+      </w:pPr>
+      <w:r>
         <w:rPr>
           <w:noProof/>
         </w:rPr>
         <w:drawing>
-          <wp:anchor distT="0" distB="0" distL="114300" distR="114300" simplePos="0" relativeHeight="251672576" behindDoc="0" locked="0" layoutInCell="1" allowOverlap="1" wp14:anchorId="47496A94" wp14:editId="14D088F8">
-            <wp:simplePos x="0" y="0"/>
-            <wp:positionH relativeFrom="margin">
-              <wp:align>center</wp:align>
-            </wp:positionH>
-            <wp:positionV relativeFrom="paragraph">
-              <wp:posOffset>249389</wp:posOffset>
-            </wp:positionV>
+          <wp:inline distT="0" distB="0" distL="0" distR="0" wp14:anchorId="47496A94" wp14:editId="0D582EA8">
             <wp:extent cx="4063365" cy="2286635"/>
-            <wp:effectExtent l="0" t="0" r="0" b="0"/>
-            <wp:wrapThrough wrapText="bothSides">
-              <wp:wrapPolygon edited="0">
-                <wp:start x="0" y="0"/>
-                <wp:lineTo x="0" y="21414"/>
-                <wp:lineTo x="21468" y="21414"/>
-                <wp:lineTo x="21468" y="0"/>
-                <wp:lineTo x="0" y="0"/>
-              </wp:wrapPolygon>
-            </wp:wrapThrough>
+            <wp:effectExtent l="95250" t="95250" r="89535" b="94615"/>
             <wp:docPr id="14" name="Immagine 14"/>
             <wp:cNvGraphicFramePr>
               <a:graphicFrameLocks xmlns:a="http://schemas.openxmlformats.org/drawingml/2006/main" noChangeAspect="1"/>
@@ -1978,32 +1749,21 @@
                     <a:prstGeom prst="rect">
                       <a:avLst/>
                     </a:prstGeom>
+                    <a:effectLst>
+                      <a:outerShdw blurRad="63500" sx="102000" sy="102000" algn="ctr" rotWithShape="0">
+                        <a:prstClr val="black">
+                          <a:alpha val="40000"/>
+                        </a:prstClr>
+                      </a:outerShdw>
+                    </a:effectLst>
                   </pic:spPr>
                 </pic:pic>
               </a:graphicData>
             </a:graphic>
-            <wp14:sizeRelH relativeFrom="margin">
-              <wp14:pctWidth>0</wp14:pctWidth>
-            </wp14:sizeRelH>
-            <wp14:sizeRelV relativeFrom="margin">
-              <wp14:pctHeight>0</wp14:pctHeight>
-            </wp14:sizeRelV>
-          </wp:anchor>
+          </wp:inline>
         </w:drawing>
       </w:r>
-      <w:r>
-        <w:t>Design della pagina Catalogo che mostra tutti gli articoli.</w:t>
-      </w:r>
-    </w:p>
-    <w:p/>
-    <w:p/>
-    <w:p/>
-    <w:p/>
-    <w:p/>
-    <w:p/>
-    <w:p/>
-    <w:p/>
-    <w:p/>
+    </w:p>
     <w:p>
       <w:pPr>
         <w:pStyle w:val="Titolo3"/>
@@ -2024,30 +1784,17 @@
       </w:r>
     </w:p>
     <w:p>
+      <w:pPr>
+        <w:jc w:val="center"/>
+      </w:pPr>
       <w:r>
         <w:rPr>
           <w:noProof/>
         </w:rPr>
         <w:drawing>
-          <wp:anchor distT="0" distB="0" distL="114300" distR="114300" simplePos="0" relativeHeight="251673600" behindDoc="0" locked="0" layoutInCell="1" allowOverlap="1" wp14:anchorId="7734FBCA" wp14:editId="5B7E8170">
-            <wp:simplePos x="0" y="0"/>
-            <wp:positionH relativeFrom="margin">
-              <wp:align>center</wp:align>
-            </wp:positionH>
-            <wp:positionV relativeFrom="paragraph">
-              <wp:posOffset>23412</wp:posOffset>
-            </wp:positionV>
+          <wp:inline distT="0" distB="0" distL="0" distR="0" wp14:anchorId="7734FBCA" wp14:editId="7A0DB2F3">
             <wp:extent cx="4142105" cy="2247900"/>
-            <wp:effectExtent l="0" t="0" r="0" b="0"/>
-            <wp:wrapThrough wrapText="bothSides">
-              <wp:wrapPolygon edited="0">
-                <wp:start x="0" y="0"/>
-                <wp:lineTo x="0" y="21417"/>
-                <wp:lineTo x="21458" y="21417"/>
-                <wp:lineTo x="21458" y="0"/>
-                <wp:lineTo x="0" y="0"/>
-              </wp:wrapPolygon>
-            </wp:wrapThrough>
+            <wp:effectExtent l="95250" t="95250" r="86995" b="95250"/>
             <wp:docPr id="15" name="Immagine 15"/>
             <wp:cNvGraphicFramePr>
               <a:graphicFrameLocks xmlns:a="http://schemas.openxmlformats.org/drawingml/2006/main" noChangeAspect="1"/>
@@ -2079,17 +1826,18 @@
                     <a:prstGeom prst="rect">
                       <a:avLst/>
                     </a:prstGeom>
+                    <a:effectLst>
+                      <a:outerShdw blurRad="63500" sx="102000" sy="102000" algn="ctr" rotWithShape="0">
+                        <a:prstClr val="black">
+                          <a:alpha val="40000"/>
+                        </a:prstClr>
+                      </a:outerShdw>
+                    </a:effectLst>
                   </pic:spPr>
                 </pic:pic>
               </a:graphicData>
             </a:graphic>
-            <wp14:sizeRelH relativeFrom="margin">
-              <wp14:pctWidth>0</wp14:pctWidth>
-            </wp14:sizeRelH>
-            <wp14:sizeRelV relativeFrom="margin">
-              <wp14:pctHeight>0</wp14:pctHeight>
-            </wp14:sizeRelV>
-          </wp:anchor>
+          </wp:inline>
         </w:drawing>
       </w:r>
     </w:p>
@@ -2101,6 +1849,8 @@
     <w:p/>
     <w:p/>
     <w:p/>
+    <w:p/>
+    <w:p/>
     <w:p>
       <w:pPr>
         <w:pStyle w:val="Titolo3"/>
@@ -2112,34 +1862,27 @@
         <w:rPr>
           <w:u w:val="single"/>
         </w:rPr>
+        <w:lastRenderedPageBreak/>
         <w:t>Login</w:t>
       </w:r>
     </w:p>
     <w:p>
       <w:r>
+        <w:t>Design della pagina di Login.</w:t>
+      </w:r>
+    </w:p>
+    <w:p>
+      <w:pPr>
+        <w:jc w:val="center"/>
+      </w:pPr>
+      <w:r>
         <w:rPr>
           <w:noProof/>
         </w:rPr>
         <w:drawing>
-          <wp:anchor distT="0" distB="0" distL="114300" distR="114300" simplePos="0" relativeHeight="251674624" behindDoc="0" locked="0" layoutInCell="1" allowOverlap="1" wp14:anchorId="3DD87947" wp14:editId="77EAF60F">
-            <wp:simplePos x="0" y="0"/>
-            <wp:positionH relativeFrom="margin">
-              <wp:align>center</wp:align>
-            </wp:positionH>
-            <wp:positionV relativeFrom="paragraph">
-              <wp:posOffset>256816</wp:posOffset>
-            </wp:positionV>
+          <wp:inline distT="0" distB="0" distL="0" distR="0" wp14:anchorId="3DD87947" wp14:editId="623BBC5B">
             <wp:extent cx="4067175" cy="2233930"/>
-            <wp:effectExtent l="0" t="0" r="9525" b="0"/>
-            <wp:wrapThrough wrapText="bothSides">
-              <wp:wrapPolygon edited="0">
-                <wp:start x="0" y="0"/>
-                <wp:lineTo x="0" y="21367"/>
-                <wp:lineTo x="21549" y="21367"/>
-                <wp:lineTo x="21549" y="0"/>
-                <wp:lineTo x="0" y="0"/>
-              </wp:wrapPolygon>
-            </wp:wrapThrough>
+            <wp:effectExtent l="95250" t="95250" r="104775" b="90170"/>
             <wp:docPr id="16" name="Immagine 16"/>
             <wp:cNvGraphicFramePr>
               <a:graphicFrameLocks xmlns:a="http://schemas.openxmlformats.org/drawingml/2006/main" noChangeAspect="1"/>
@@ -2171,35 +1914,22 @@
                     <a:prstGeom prst="rect">
                       <a:avLst/>
                     </a:prstGeom>
+                    <a:effectLst>
+                      <a:outerShdw blurRad="63500" sx="102000" sy="102000" algn="ctr" rotWithShape="0">
+                        <a:prstClr val="black">
+                          <a:alpha val="40000"/>
+                        </a:prstClr>
+                      </a:outerShdw>
+                    </a:effectLst>
                   </pic:spPr>
                 </pic:pic>
               </a:graphicData>
             </a:graphic>
-            <wp14:sizeRelH relativeFrom="margin">
-              <wp14:pctWidth>0</wp14:pctWidth>
-            </wp14:sizeRelH>
-            <wp14:sizeRelV relativeFrom="margin">
-              <wp14:pctHeight>0</wp14:pctHeight>
-            </wp14:sizeRelV>
-          </wp:anchor>
+          </wp:inline>
         </w:drawing>
       </w:r>
-      <w:r>
-        <w:t>Design della pagina di Login.</w:t>
-      </w:r>
-    </w:p>
-    <w:p/>
-    <w:p/>
-    <w:p/>
-    <w:p/>
-    <w:p/>
-    <w:p/>
-    <w:p/>
-    <w:p>
-      <w:r>
-        <w:br w:type="page"/>
-      </w:r>
-    </w:p>
+    </w:p>
+    <w:p/>
     <w:p>
       <w:pPr>
         <w:pStyle w:val="Titolo3"/>
@@ -2211,35 +1941,35 @@
         <w:rPr>
           <w:u w:val="single"/>
         </w:rPr>
-        <w:lastRenderedPageBreak/>
         <w:t>Prodotto</w:t>
       </w:r>
     </w:p>
     <w:p>
       <w:r>
+        <w:t xml:space="preserve">Design della pagina </w:t>
+      </w:r>
+      <w:r>
+        <w:t>P</w:t>
+      </w:r>
+      <w:r>
+        <w:t>rodotto che mostra i dettagli dell’articolo scelto</w:t>
+      </w:r>
+      <w:r>
+        <w:t>.</w:t>
+      </w:r>
+    </w:p>
+    <w:p>
+      <w:pPr>
+        <w:jc w:val="center"/>
+      </w:pPr>
+      <w:r>
         <w:rPr>
           <w:noProof/>
         </w:rPr>
         <w:drawing>
-          <wp:anchor distT="0" distB="0" distL="114300" distR="114300" simplePos="0" relativeHeight="251675648" behindDoc="0" locked="0" layoutInCell="1" allowOverlap="1" wp14:anchorId="386DD6D2" wp14:editId="2162986F">
-            <wp:simplePos x="0" y="0"/>
-            <wp:positionH relativeFrom="margin">
-              <wp:align>center</wp:align>
-            </wp:positionH>
-            <wp:positionV relativeFrom="paragraph">
-              <wp:posOffset>233598</wp:posOffset>
-            </wp:positionV>
+          <wp:inline distT="0" distB="0" distL="0" distR="0" wp14:anchorId="1244CB03" wp14:editId="644C9ABD">
             <wp:extent cx="4594225" cy="2552065"/>
-            <wp:effectExtent l="0" t="0" r="0" b="635"/>
-            <wp:wrapThrough wrapText="bothSides">
-              <wp:wrapPolygon edited="0">
-                <wp:start x="0" y="0"/>
-                <wp:lineTo x="0" y="21444"/>
-                <wp:lineTo x="21496" y="21444"/>
-                <wp:lineTo x="21496" y="0"/>
-                <wp:lineTo x="0" y="0"/>
-              </wp:wrapPolygon>
-            </wp:wrapThrough>
+            <wp:effectExtent l="95250" t="95250" r="92075" b="95885"/>
             <wp:docPr id="17" name="Immagine 17"/>
             <wp:cNvGraphicFramePr>
               <a:graphicFrameLocks xmlns:a="http://schemas.openxmlformats.org/drawingml/2006/main" noChangeAspect="1"/>
@@ -2271,77 +2001,88 @@
                     <a:prstGeom prst="rect">
                       <a:avLst/>
                     </a:prstGeom>
+                    <a:effectLst>
+                      <a:outerShdw blurRad="63500" sx="102000" sy="102000" algn="ctr" rotWithShape="0">
+                        <a:prstClr val="black">
+                          <a:alpha val="40000"/>
+                        </a:prstClr>
+                      </a:outerShdw>
+                    </a:effectLst>
                   </pic:spPr>
                 </pic:pic>
               </a:graphicData>
             </a:graphic>
-            <wp14:sizeRelH relativeFrom="margin">
-              <wp14:pctWidth>0</wp14:pctWidth>
-            </wp14:sizeRelH>
-            <wp14:sizeRelV relativeFrom="margin">
-              <wp14:pctHeight>0</wp14:pctHeight>
-            </wp14:sizeRelV>
-          </wp:anchor>
+          </wp:inline>
         </w:drawing>
       </w:r>
+    </w:p>
+    <w:p/>
+    <w:p/>
+    <w:p/>
+    <w:p/>
+    <w:p/>
+    <w:p/>
+    <w:p/>
+    <w:p/>
+    <w:p>
+      <w:pPr>
+        <w:pStyle w:val="Titolo3"/>
+        <w:rPr>
+          <w:u w:val="single"/>
+        </w:rPr>
+      </w:pPr>
+      <w:r>
+        <w:rPr>
+          <w:u w:val="single"/>
+        </w:rPr>
+        <w:lastRenderedPageBreak/>
+        <w:t>Amministrazione</w:t>
+      </w:r>
+    </w:p>
+    <w:p>
       <w:r>
         <w:t xml:space="preserve">Design della pagina </w:t>
       </w:r>
       <w:r>
-        <w:t>P</w:t>
-      </w:r>
-      <w:r>
-        <w:t>rodotto che mostra i dettagli dell’articolo scelto.</w:t>
-      </w:r>
-    </w:p>
-    <w:p/>
-    <w:p/>
-    <w:p/>
-    <w:p/>
-    <w:p/>
-    <w:p/>
-    <w:p/>
-    <w:p/>
-    <w:p/>
-    <w:p>
-      <w:pPr>
-        <w:pStyle w:val="Titolo3"/>
-        <w:rPr>
-          <w:u w:val="single"/>
-        </w:rPr>
-      </w:pPr>
-      <w:r>
-        <w:rPr>
-          <w:u w:val="single"/>
-        </w:rPr>
-        <w:t>Amministrazione</w:t>
-      </w:r>
-    </w:p>
-    <w:p>
+        <w:t>Amministrazione in cui è possibile apportare modifiche</w:t>
+      </w:r>
+      <w:r>
+        <w:t xml:space="preserve"> o eliminare gli </w:t>
+      </w:r>
+      <w:r>
+        <w:t>utenti.</w:t>
+      </w:r>
+      <w:r>
+        <w:t xml:space="preserve"> </w:t>
+      </w:r>
+      <w:r>
+        <w:t>Solamente</w:t>
+      </w:r>
+      <w:r>
+        <w:t xml:space="preserve"> </w:t>
+      </w:r>
+      <w:r>
+        <w:t>l’Admin</w:t>
+      </w:r>
+      <w:r>
+        <w:t xml:space="preserve"> ha accesso a questa pagina</w:t>
+      </w:r>
+      <w:r>
+        <w:t>.</w:t>
+      </w:r>
+    </w:p>
+    <w:p>
+      <w:pPr>
+        <w:jc w:val="center"/>
+      </w:pPr>
       <w:r>
         <w:rPr>
           <w:noProof/>
         </w:rPr>
         <w:drawing>
-          <wp:anchor distT="0" distB="0" distL="114300" distR="114300" simplePos="0" relativeHeight="251676672" behindDoc="0" locked="0" layoutInCell="1" allowOverlap="1" wp14:anchorId="347C172B" wp14:editId="6BF894CF">
-            <wp:simplePos x="0" y="0"/>
-            <wp:positionH relativeFrom="margin">
-              <wp:align>left</wp:align>
-            </wp:positionH>
-            <wp:positionV relativeFrom="paragraph">
-              <wp:posOffset>420922</wp:posOffset>
-            </wp:positionV>
+          <wp:inline distT="0" distB="0" distL="0" distR="0" wp14:anchorId="31BAE77C" wp14:editId="7DB5A326">
             <wp:extent cx="6120130" cy="2056130"/>
-            <wp:effectExtent l="0" t="0" r="0" b="1270"/>
-            <wp:wrapThrough wrapText="bothSides">
-              <wp:wrapPolygon edited="0">
-                <wp:start x="0" y="0"/>
-                <wp:lineTo x="0" y="21413"/>
-                <wp:lineTo x="21515" y="21413"/>
-                <wp:lineTo x="21515" y="0"/>
-                <wp:lineTo x="0" y="0"/>
-              </wp:wrapPolygon>
-            </wp:wrapThrough>
+            <wp:effectExtent l="114300" t="95250" r="109220" b="96520"/>
             <wp:docPr id="18" name="Immagine 18"/>
             <wp:cNvGraphicFramePr>
               <a:graphicFrameLocks xmlns:a="http://schemas.openxmlformats.org/drawingml/2006/main" noChangeAspect="1"/>
@@ -2373,48 +2114,26 @@
                     <a:prstGeom prst="rect">
                       <a:avLst/>
                     </a:prstGeom>
+                    <a:effectLst>
+                      <a:outerShdw blurRad="63500" sx="102000" sy="102000" algn="ctr" rotWithShape="0">
+                        <a:prstClr val="black">
+                          <a:alpha val="40000"/>
+                        </a:prstClr>
+                      </a:outerShdw>
+                    </a:effectLst>
                   </pic:spPr>
                 </pic:pic>
               </a:graphicData>
             </a:graphic>
-          </wp:anchor>
+          </wp:inline>
         </w:drawing>
       </w:r>
-      <w:r>
-        <w:t xml:space="preserve">Design della pagina </w:t>
-      </w:r>
-      <w:r>
-        <w:t>Amministrazione in cui è possibile apportare modifiche</w:t>
-      </w:r>
-      <w:r>
-        <w:t xml:space="preserve"> o eliminare gli </w:t>
-      </w:r>
-      <w:r>
-        <w:t>utenti.</w:t>
-      </w:r>
-      <w:r>
-        <w:t xml:space="preserve"> </w:t>
-      </w:r>
-      <w:r>
-        <w:t>Solamente</w:t>
-      </w:r>
-      <w:r>
-        <w:t xml:space="preserve"> </w:t>
-      </w:r>
-      <w:r>
-        <w:t>l’Admin</w:t>
-      </w:r>
-      <w:r>
-        <w:t xml:space="preserve"> ha accesso a questa pagina</w:t>
-      </w:r>
-      <w:r>
-        <w:t>.</w:t>
-      </w:r>
-    </w:p>
-    <w:p>
-      <w:pPr>
-        <w:rPr>
-          <w:rFonts w:asciiTheme="majorHAnsi" w:eastAsiaTheme="majorEastAsia" w:hAnsiTheme="majorHAnsi" w:cstheme="majorBidi"/>
+    </w:p>
+    <w:p/>
+    <w:p>
+      <w:pPr>
+        <w:pStyle w:val="Titolo3"/>
+        <w:rPr>
           <w:color w:val="2F5496" w:themeColor="accent1" w:themeShade="BF"/>
           <w:sz w:val="26"/>
           <w:szCs w:val="26"/>
@@ -2425,49 +2144,26 @@
         <w:rPr>
           <w:u w:val="single"/>
         </w:rPr>
-        <w:br w:type="page"/>
-      </w:r>
-    </w:p>
-    <w:p>
-      <w:pPr>
-        <w:pStyle w:val="Titolo3"/>
-        <w:rPr>
-          <w:u w:val="single"/>
-        </w:rPr>
-      </w:pPr>
-      <w:r>
-        <w:rPr>
-          <w:u w:val="single"/>
-        </w:rPr>
-        <w:lastRenderedPageBreak/>
         <w:t>Vendor – Prodotti</w:t>
       </w:r>
     </w:p>
     <w:p>
       <w:r>
+        <w:t>Design della pagina Prodotti (accessibile solo a Vendor), nella quale è possibile visualizzare i prodotti messi in vendita con i loro rispettivi dettagli.</w:t>
+      </w:r>
+    </w:p>
+    <w:p>
+      <w:pPr>
+        <w:jc w:val="center"/>
+      </w:pPr>
+      <w:r>
         <w:rPr>
           <w:noProof/>
         </w:rPr>
         <w:drawing>
-          <wp:anchor distT="0" distB="0" distL="114300" distR="114300" simplePos="0" relativeHeight="251677696" behindDoc="0" locked="0" layoutInCell="1" allowOverlap="1" wp14:anchorId="6AF9BFE3" wp14:editId="75D22813">
-            <wp:simplePos x="0" y="0"/>
-            <wp:positionH relativeFrom="margin">
-              <wp:align>center</wp:align>
-            </wp:positionH>
-            <wp:positionV relativeFrom="paragraph">
-              <wp:posOffset>440634</wp:posOffset>
-            </wp:positionV>
+          <wp:inline distT="0" distB="0" distL="0" distR="0" wp14:anchorId="7D95234E" wp14:editId="1A04BD0F">
             <wp:extent cx="4563745" cy="2465705"/>
-            <wp:effectExtent l="0" t="0" r="8255" b="0"/>
-            <wp:wrapThrough wrapText="bothSides">
-              <wp:wrapPolygon edited="0">
-                <wp:start x="0" y="0"/>
-                <wp:lineTo x="0" y="21361"/>
-                <wp:lineTo x="21549" y="21361"/>
-                <wp:lineTo x="21549" y="0"/>
-                <wp:lineTo x="0" y="0"/>
-              </wp:wrapPolygon>
-            </wp:wrapThrough>
+            <wp:effectExtent l="95250" t="95250" r="103505" b="86995"/>
             <wp:docPr id="20" name="Immagine 20"/>
             <wp:cNvGraphicFramePr>
               <a:graphicFrameLocks xmlns:a="http://schemas.openxmlformats.org/drawingml/2006/main" noChangeAspect="1"/>
@@ -2499,24 +2195,21 @@
                     <a:prstGeom prst="rect">
                       <a:avLst/>
                     </a:prstGeom>
+                    <a:effectLst>
+                      <a:outerShdw blurRad="63500" sx="102000" sy="102000" algn="ctr" rotWithShape="0">
+                        <a:prstClr val="black">
+                          <a:alpha val="40000"/>
+                        </a:prstClr>
+                      </a:outerShdw>
+                    </a:effectLst>
                   </pic:spPr>
                 </pic:pic>
               </a:graphicData>
             </a:graphic>
-            <wp14:sizeRelH relativeFrom="margin">
-              <wp14:pctWidth>0</wp14:pctWidth>
-            </wp14:sizeRelH>
-            <wp14:sizeRelV relativeFrom="margin">
-              <wp14:pctHeight>0</wp14:pctHeight>
-            </wp14:sizeRelV>
-          </wp:anchor>
+          </wp:inline>
         </w:drawing>
       </w:r>
-      <w:r>
-        <w:t>Design della pagina Prodotti (accessibile solo a Vendor), nella quale è possibile visualizzare i prodotti messi in vendita con i loro rispettivi dettagli.</w:t>
-      </w:r>
-    </w:p>
-    <w:p/>
+    </w:p>
     <w:p/>
     <w:p/>
     <w:p/>
@@ -2536,34 +2229,27 @@
         <w:rPr>
           <w:u w:val="single"/>
         </w:rPr>
+        <w:lastRenderedPageBreak/>
         <w:t>Vendor – Vendite</w:t>
       </w:r>
     </w:p>
     <w:p>
       <w:r>
+        <w:t>Design della pagina Vendite (accessibile solamente a Vendor) nella quale è possibile visualizzare quali prodotti sono stati acquistati, con i relativi dettagli.</w:t>
+      </w:r>
+    </w:p>
+    <w:p>
+      <w:pPr>
+        <w:jc w:val="center"/>
+      </w:pPr>
+      <w:r>
         <w:rPr>
           <w:noProof/>
         </w:rPr>
         <w:drawing>
-          <wp:anchor distT="0" distB="0" distL="114300" distR="114300" simplePos="0" relativeHeight="251678720" behindDoc="0" locked="0" layoutInCell="1" allowOverlap="1" wp14:anchorId="08477BA2" wp14:editId="485913B4">
-            <wp:simplePos x="0" y="0"/>
-            <wp:positionH relativeFrom="margin">
-              <wp:posOffset>1025359</wp:posOffset>
-            </wp:positionH>
-            <wp:positionV relativeFrom="paragraph">
-              <wp:posOffset>426361</wp:posOffset>
-            </wp:positionV>
+          <wp:inline distT="0" distB="0" distL="0" distR="0" wp14:anchorId="68FEE61F" wp14:editId="48B8FB5B">
             <wp:extent cx="4276090" cy="2400935"/>
-            <wp:effectExtent l="0" t="0" r="0" b="0"/>
-            <wp:wrapThrough wrapText="bothSides">
-              <wp:wrapPolygon edited="0">
-                <wp:start x="0" y="0"/>
-                <wp:lineTo x="0" y="21423"/>
-                <wp:lineTo x="21459" y="21423"/>
-                <wp:lineTo x="21459" y="0"/>
-                <wp:lineTo x="0" y="0"/>
-              </wp:wrapPolygon>
-            </wp:wrapThrough>
+            <wp:effectExtent l="95250" t="95250" r="86360" b="94615"/>
             <wp:docPr id="21" name="Immagine 21"/>
             <wp:cNvGraphicFramePr>
               <a:graphicFrameLocks xmlns:a="http://schemas.openxmlformats.org/drawingml/2006/main" noChangeAspect="1"/>
@@ -2595,36 +2281,36 @@
                     <a:prstGeom prst="rect">
                       <a:avLst/>
                     </a:prstGeom>
+                    <a:effectLst>
+                      <a:outerShdw blurRad="63500" sx="102000" sy="102000" algn="ctr" rotWithShape="0">
+                        <a:prstClr val="black">
+                          <a:alpha val="40000"/>
+                        </a:prstClr>
+                      </a:outerShdw>
+                    </a:effectLst>
                   </pic:spPr>
                 </pic:pic>
               </a:graphicData>
             </a:graphic>
-            <wp14:sizeRelH relativeFrom="margin">
-              <wp14:pctWidth>0</wp14:pctWidth>
-            </wp14:sizeRelH>
-            <wp14:sizeRelV relativeFrom="margin">
-              <wp14:pctHeight>0</wp14:pctHeight>
-            </wp14:sizeRelV>
-          </wp:anchor>
+          </wp:inline>
         </w:drawing>
       </w:r>
-      <w:r>
-        <w:t>Design della pagina Vendite (accessibile solamente a Vendor) nella quale è possibile visualizzare quali prodotti sono stati acquistati, con i relativi dettagli.</w:t>
-      </w:r>
-    </w:p>
-    <w:p/>
-    <w:p/>
-    <w:p/>
-    <w:p/>
-    <w:p/>
-    <w:p/>
-    <w:p/>
-    <w:p/>
-    <w:p/>
+    </w:p>
     <w:p>
       <w:pPr>
         <w:pStyle w:val="Titolo3"/>
         <w:rPr>
+          <w:rFonts w:asciiTheme="minorHAnsi" w:eastAsiaTheme="minorHAnsi" w:hAnsiTheme="minorHAnsi" w:cstheme="minorBidi"/>
+          <w:color w:val="auto"/>
+          <w:sz w:val="22"/>
+          <w:szCs w:val="22"/>
+        </w:rPr>
+      </w:pPr>
+    </w:p>
+    <w:p>
+      <w:pPr>
+        <w:pStyle w:val="Titolo3"/>
+        <w:rPr>
           <w:u w:val="single"/>
         </w:rPr>
       </w:pPr>
@@ -2637,29 +2323,21 @@
     </w:p>
     <w:p>
       <w:r>
+        <w:t>Design della pagina Impostazioni nella quale è possibile modificare i dettagli del proprio account.</w:t>
+      </w:r>
+    </w:p>
+    <w:p>
+      <w:pPr>
+        <w:jc w:val="center"/>
+      </w:pPr>
+      <w:r>
         <w:rPr>
           <w:noProof/>
         </w:rPr>
         <w:drawing>
-          <wp:anchor distT="0" distB="0" distL="114300" distR="114300" simplePos="0" relativeHeight="251679744" behindDoc="0" locked="0" layoutInCell="1" allowOverlap="1" wp14:anchorId="14D1EF3D" wp14:editId="00A467E4">
-            <wp:simplePos x="0" y="0"/>
-            <wp:positionH relativeFrom="margin">
-              <wp:align>center</wp:align>
-            </wp:positionH>
-            <wp:positionV relativeFrom="paragraph">
-              <wp:posOffset>254469</wp:posOffset>
-            </wp:positionV>
+          <wp:inline distT="0" distB="0" distL="0" distR="0" wp14:anchorId="26DC669A" wp14:editId="37A64B9C">
             <wp:extent cx="3510280" cy="1979295"/>
-            <wp:effectExtent l="0" t="0" r="0" b="1905"/>
-            <wp:wrapThrough wrapText="bothSides">
-              <wp:wrapPolygon edited="0">
-                <wp:start x="0" y="0"/>
-                <wp:lineTo x="0" y="21413"/>
-                <wp:lineTo x="21452" y="21413"/>
-                <wp:lineTo x="21452" y="0"/>
-                <wp:lineTo x="0" y="0"/>
-              </wp:wrapPolygon>
-            </wp:wrapThrough>
+            <wp:effectExtent l="95250" t="95250" r="90170" b="97155"/>
             <wp:docPr id="22" name="Immagine 22"/>
             <wp:cNvGraphicFramePr>
               <a:graphicFrameLocks xmlns:a="http://schemas.openxmlformats.org/drawingml/2006/main" noChangeAspect="1"/>
@@ -2691,18 +2369,20 @@
                     <a:prstGeom prst="rect">
                       <a:avLst/>
                     </a:prstGeom>
+                    <a:effectLst>
+                      <a:outerShdw blurRad="63500" sx="102000" sy="102000" algn="ctr" rotWithShape="0">
+                        <a:prstClr val="black">
+                          <a:alpha val="40000"/>
+                        </a:prstClr>
+                      </a:outerShdw>
+                    </a:effectLst>
                   </pic:spPr>
                 </pic:pic>
               </a:graphicData>
             </a:graphic>
-          </wp:anchor>
+          </wp:inline>
         </w:drawing>
       </w:r>
-      <w:r>
-        <w:t>Design della pagina Impostazioni nella quale è possibile modificare i dettagli del proprio account.</w:t>
-      </w:r>
-    </w:p>
-    <w:p>
       <w:r>
         <w:br w:type="page"/>
       </w:r>
@@ -3115,8 +2795,89 @@
         <w:t>”, ovvero la documentazione di tutte le cose che sono state fatte all’interno dello Sprint.</w:t>
       </w:r>
     </w:p>
+    <w:p>
+      <w:r>
+        <w:br w:type="page"/>
+      </w:r>
+    </w:p>
+    <w:p>
+      <w:pPr>
+        <w:pStyle w:val="Titolo1"/>
+        <w:rPr>
+          <w:u w:val="single"/>
+        </w:rPr>
+      </w:pPr>
+      <w:r>
+        <w:rPr>
+          <w:u w:val="single"/>
+        </w:rPr>
+        <w:lastRenderedPageBreak/>
+        <w:t>Implementazione</w:t>
+      </w:r>
+    </w:p>
+    <w:p>
+      <w:pPr>
+        <w:pStyle w:val="Titolo2"/>
+        <w:rPr>
+          <w:u w:val="single"/>
+        </w:rPr>
+      </w:pPr>
+      <w:r>
+        <w:rPr>
+          <w:u w:val="single"/>
+        </w:rPr>
+        <w:t>Visualizzare pagina Home</w:t>
+      </w:r>
+    </w:p>
+    <w:p/>
+    <w:p>
+      <w:pPr>
+        <w:pStyle w:val="Titolo2"/>
+        <w:rPr>
+          <w:u w:val="single"/>
+        </w:rPr>
+      </w:pPr>
+      <w:r>
+        <w:rPr>
+          <w:u w:val="single"/>
+        </w:rPr>
+        <w:t>Visualizzare pagina Login</w:t>
+      </w:r>
+    </w:p>
+    <w:p/>
+    <w:p>
+      <w:pPr>
+        <w:pStyle w:val="Titolo2"/>
+        <w:rPr>
+          <w:u w:val="single"/>
+        </w:rPr>
+      </w:pPr>
+      <w:r>
+        <w:rPr>
+          <w:u w:val="single"/>
+        </w:rPr>
+        <w:t>Visualizzare pagina Catalogo</w:t>
+      </w:r>
+    </w:p>
+    <w:p/>
+    <w:p>
+      <w:pPr>
+        <w:pStyle w:val="Titolo2"/>
+        <w:rPr>
+          <w:u w:val="single"/>
+        </w:rPr>
+      </w:pPr>
+      <w:r>
+        <w:rPr>
+          <w:u w:val="single"/>
+        </w:rPr>
+        <w:t>Visualizzare pagina Prodotto Specifico</w:t>
+      </w:r>
+    </w:p>
+    <w:p/>
     <w:sectPr>
-      <w:footerReference w:type="default" r:id="rId29"/>
+      <w:headerReference w:type="default" r:id="rId29"/>
+      <w:footerReference w:type="default" r:id="rId30"/>
       <w:pgSz w:w="11906" w:h="16838"/>
       <w:pgMar w:top="1417" w:right="1134" w:bottom="1134" w:left="1134" w:header="708" w:footer="708" w:gutter="0"/>
       <w:pgNumType w:start="0"/>
@@ -3183,14 +2944,27 @@
     <w:r>
       <w:t>/</w:t>
     </w:r>
-    <w:fldSimple w:instr=" NUMPAGES   \* MERGEFORMAT ">
-      <w:r>
-        <w:rPr>
-          <w:noProof/>
-        </w:rPr>
-        <w:t>2</w:t>
-      </w:r>
-    </w:fldSimple>
+    <w:r>
+      <w:fldChar w:fldCharType="begin"/>
+    </w:r>
+    <w:r>
+      <w:instrText xml:space="preserve"> NUMPAGES   \* MERGEFORMAT </w:instrText>
+    </w:r>
+    <w:r>
+      <w:fldChar w:fldCharType="separate"/>
+    </w:r>
+    <w:r>
+      <w:rPr>
+        <w:noProof/>
+      </w:rPr>
+      <w:t>2</w:t>
+    </w:r>
+    <w:r>
+      <w:rPr>
+        <w:noProof/>
+      </w:rPr>
+      <w:fldChar w:fldCharType="end"/>
+    </w:r>
   </w:p>
 </w:ftr>
 </file>
@@ -3218,6 +2992,26 @@
     </w:p>
   </w:footnote>
 </w:footnotes>
+</file>
+
+<file path=word/header1.xml><?xml version="1.0" encoding="utf-8"?>
+<w:hdr xmlns:wpc="http://schemas.microsoft.com/office/word/2010/wordprocessingCanvas" xmlns:cx="http://schemas.microsoft.com/office/drawing/2014/chartex" xmlns:cx1="http://schemas.microsoft.com/office/drawing/2015/9/8/chartex" xmlns:cx2="http://schemas.microsoft.com/office/drawing/2015/10/21/chartex" xmlns:cx3="http://schemas.microsoft.com/office/drawing/2016/5/9/chartex" xmlns:cx4="http://schemas.microsoft.com/office/drawing/2016/5/10/chartex" xmlns:cx5="http://schemas.microsoft.com/office/drawing/2016/5/11/chartex" xmlns:cx6="http://schemas.microsoft.com/office/drawing/2016/5/12/chartex" xmlns:cx7="http://schemas.microsoft.com/office/drawing/2016/5/13/chartex" xmlns:cx8="http://schemas.microsoft.com/office/drawing/2016/5/14/chartex" xmlns:mc="http://schemas.openxmlformats.org/markup-compatibility/2006" xmlns:aink="http://schemas.microsoft.com/office/drawing/2016/ink" xmlns:am3d="http://schemas.microsoft.com/office/drawing/2017/model3d" xmlns:o="urn:schemas-microsoft-com:office:office" xmlns:r="http://schemas.openxmlformats.org/officeDocument/2006/relationships" xmlns:m="http://schemas.openxmlformats.org/officeDocument/2006/math" xmlns:v="urn:schemas-microsoft-com:vml" xmlns:wp14="http://schemas.microsoft.com/office/word/2010/wordprocessingDrawing" xmlns:wp="http://schemas.openxmlformats.org/drawingml/2006/wordprocessingDrawing" xmlns:w10="urn:schemas-microsoft-com:office:word" xmlns:w="http://schemas.openxmlformats.org/wordprocessingml/2006/main" xmlns:w14="http://schemas.microsoft.com/office/word/2010/wordml" xmlns:w15="http://schemas.microsoft.com/office/word/2012/wordml" xmlns:w16cid="http://schemas.microsoft.com/office/word/2016/wordml/cid" xmlns:w16se="http://schemas.microsoft.com/office/word/2015/wordml/symex" xmlns:wpg="http://schemas.microsoft.com/office/word/2010/wordprocessingGroup" xmlns:wpi="http://schemas.microsoft.com/office/word/2010/wordprocessingInk" xmlns:wne="http://schemas.microsoft.com/office/word/2006/wordml" xmlns:wps="http://schemas.microsoft.com/office/word/2010/wordprocessingShape" mc:Ignorable="w14 w15 w16se w16cid wp14">
+  <w:p>
+    <w:pPr>
+      <w:pStyle w:val="Intestazione"/>
+    </w:pPr>
+    <w:r>
+      <w:t>M306</w:t>
+    </w:r>
+    <w:r>
+      <w:tab/>
+    </w:r>
+    <w:r>
+      <w:tab/>
+      <w:t>Documentazione Sprint 1</w:t>
+    </w:r>
+  </w:p>
+</w:hdr>
 </file>
 
 <file path=word/numbering.xml><?xml version="1.0" encoding="utf-8"?>
@@ -4751,7 +4545,7 @@
 </file>
 
 <file path=customXml/itemProps2.xml><?xml version="1.0" encoding="utf-8"?>
-<ds:datastoreItem xmlns:ds="http://schemas.openxmlformats.org/officeDocument/2006/customXml" ds:itemID="{DA87501A-12E9-4C45-AF68-50244FBF6724}">
+<ds:datastoreItem xmlns:ds="http://schemas.openxmlformats.org/officeDocument/2006/customXml" ds:itemID="{FD99B1B1-A6D8-4AE5-8D65-A082FC999186}">
   <ds:schemaRefs>
     <ds:schemaRef ds:uri="http://schemas.openxmlformats.org/officeDocument/2006/bibliography"/>
   </ds:schemaRefs>

</xml_diff>

<commit_message>
Test finiti (da aggiungere alla doc finale)
</commit_message>
<xml_diff>
--- a/3_Documentazione/Documentazione-Sprint1.docx
+++ b/3_Documentazione/Documentazione-Sprint1.docx
@@ -538,8 +538,6 @@
             <w:br w:type="page"/>
           </w:r>
         </w:p>
-        <w:bookmarkStart w:id="0" w:name="_GoBack" w:displacedByCustomXml="next"/>
-        <w:bookmarkEnd w:id="0" w:displacedByCustomXml="next"/>
       </w:sdtContent>
     </w:sdt>
     <w:sdt>
@@ -576,17 +574,1928 @@
           </w:r>
         </w:p>
         <w:p>
-          <w:fldSimple w:instr=" TOC \o &quot;1-3&quot; \h \z \u ">
-            <w:r>
-              <w:rPr>
-                <w:b/>
-                <w:bCs/>
-                <w:noProof/>
-                <w:lang w:val="it-IT"/>
-              </w:rPr>
-              <w:t>Nessuna voce di sommario trovata.</w:t>
-            </w:r>
-          </w:fldSimple>
+          <w:pPr>
+            <w:pStyle w:val="Sommario1"/>
+            <w:tabs>
+              <w:tab w:val="right" w:leader="dot" w:pos="9628"/>
+            </w:tabs>
+            <w:rPr>
+              <w:noProof/>
+            </w:rPr>
+          </w:pPr>
+          <w:r>
+            <w:fldChar w:fldCharType="begin"/>
+          </w:r>
+          <w:r>
+            <w:instrText xml:space="preserve"> TOC \o "1-3" \h \z \u </w:instrText>
+          </w:r>
+          <w:r>
+            <w:fldChar w:fldCharType="separate"/>
+          </w:r>
+          <w:hyperlink w:anchor="_Toc199316933" w:history="1">
+            <w:r>
+              <w:rPr>
+                <w:rStyle w:val="Collegamentoipertestuale"/>
+                <w:noProof/>
+              </w:rPr>
+              <w:t>Progettazione</w:t>
+            </w:r>
+            <w:r>
+              <w:rPr>
+                <w:noProof/>
+                <w:webHidden/>
+              </w:rPr>
+              <w:tab/>
+            </w:r>
+            <w:r>
+              <w:rPr>
+                <w:noProof/>
+                <w:webHidden/>
+              </w:rPr>
+              <w:fldChar w:fldCharType="begin"/>
+            </w:r>
+            <w:r>
+              <w:rPr>
+                <w:noProof/>
+                <w:webHidden/>
+              </w:rPr>
+              <w:instrText xml:space="preserve"> PAGEREF _Toc199316933 \h </w:instrText>
+            </w:r>
+            <w:r>
+              <w:rPr>
+                <w:noProof/>
+                <w:webHidden/>
+              </w:rPr>
+            </w:r>
+            <w:r>
+              <w:rPr>
+                <w:noProof/>
+                <w:webHidden/>
+              </w:rPr>
+              <w:fldChar w:fldCharType="separate"/>
+            </w:r>
+            <w:r>
+              <w:rPr>
+                <w:noProof/>
+                <w:webHidden/>
+              </w:rPr>
+              <w:t>2</w:t>
+            </w:r>
+            <w:r>
+              <w:rPr>
+                <w:noProof/>
+                <w:webHidden/>
+              </w:rPr>
+              <w:fldChar w:fldCharType="end"/>
+            </w:r>
+          </w:hyperlink>
+        </w:p>
+        <w:p>
+          <w:pPr>
+            <w:pStyle w:val="Sommario2"/>
+            <w:tabs>
+              <w:tab w:val="right" w:leader="dot" w:pos="9628"/>
+            </w:tabs>
+            <w:rPr>
+              <w:noProof/>
+            </w:rPr>
+          </w:pPr>
+          <w:hyperlink w:anchor="_Toc199316934" w:history="1">
+            <w:r>
+              <w:rPr>
+                <w:rStyle w:val="Collegamentoipertestuale"/>
+                <w:noProof/>
+              </w:rPr>
+              <w:t>Architettura</w:t>
+            </w:r>
+            <w:r>
+              <w:rPr>
+                <w:noProof/>
+                <w:webHidden/>
+              </w:rPr>
+              <w:tab/>
+            </w:r>
+            <w:r>
+              <w:rPr>
+                <w:noProof/>
+                <w:webHidden/>
+              </w:rPr>
+              <w:fldChar w:fldCharType="begin"/>
+            </w:r>
+            <w:r>
+              <w:rPr>
+                <w:noProof/>
+                <w:webHidden/>
+              </w:rPr>
+              <w:instrText xml:space="preserve"> PAGEREF _Toc199316934 \h </w:instrText>
+            </w:r>
+            <w:r>
+              <w:rPr>
+                <w:noProof/>
+                <w:webHidden/>
+              </w:rPr>
+            </w:r>
+            <w:r>
+              <w:rPr>
+                <w:noProof/>
+                <w:webHidden/>
+              </w:rPr>
+              <w:fldChar w:fldCharType="separate"/>
+            </w:r>
+            <w:r>
+              <w:rPr>
+                <w:noProof/>
+                <w:webHidden/>
+              </w:rPr>
+              <w:t>2</w:t>
+            </w:r>
+            <w:r>
+              <w:rPr>
+                <w:noProof/>
+                <w:webHidden/>
+              </w:rPr>
+              <w:fldChar w:fldCharType="end"/>
+            </w:r>
+          </w:hyperlink>
+        </w:p>
+        <w:p>
+          <w:pPr>
+            <w:pStyle w:val="Sommario2"/>
+            <w:tabs>
+              <w:tab w:val="right" w:leader="dot" w:pos="9628"/>
+            </w:tabs>
+            <w:rPr>
+              <w:noProof/>
+            </w:rPr>
+          </w:pPr>
+          <w:hyperlink w:anchor="_Toc199316935" w:history="1">
+            <w:r>
+              <w:rPr>
+                <w:rStyle w:val="Collegamentoipertestuale"/>
+                <w:noProof/>
+              </w:rPr>
+              <w:t>Swimlanes</w:t>
+            </w:r>
+            <w:r>
+              <w:rPr>
+                <w:noProof/>
+                <w:webHidden/>
+              </w:rPr>
+              <w:tab/>
+            </w:r>
+            <w:r>
+              <w:rPr>
+                <w:noProof/>
+                <w:webHidden/>
+              </w:rPr>
+              <w:fldChar w:fldCharType="begin"/>
+            </w:r>
+            <w:r>
+              <w:rPr>
+                <w:noProof/>
+                <w:webHidden/>
+              </w:rPr>
+              <w:instrText xml:space="preserve"> PAGEREF _Toc199316935 \h </w:instrText>
+            </w:r>
+            <w:r>
+              <w:rPr>
+                <w:noProof/>
+                <w:webHidden/>
+              </w:rPr>
+            </w:r>
+            <w:r>
+              <w:rPr>
+                <w:noProof/>
+                <w:webHidden/>
+              </w:rPr>
+              <w:fldChar w:fldCharType="separate"/>
+            </w:r>
+            <w:r>
+              <w:rPr>
+                <w:noProof/>
+                <w:webHidden/>
+              </w:rPr>
+              <w:t>2</w:t>
+            </w:r>
+            <w:r>
+              <w:rPr>
+                <w:noProof/>
+                <w:webHidden/>
+              </w:rPr>
+              <w:fldChar w:fldCharType="end"/>
+            </w:r>
+          </w:hyperlink>
+        </w:p>
+        <w:p>
+          <w:pPr>
+            <w:pStyle w:val="Sommario3"/>
+            <w:tabs>
+              <w:tab w:val="right" w:leader="dot" w:pos="9628"/>
+            </w:tabs>
+            <w:rPr>
+              <w:noProof/>
+            </w:rPr>
+          </w:pPr>
+          <w:hyperlink w:anchor="_Toc199316936" w:history="1">
+            <w:r>
+              <w:rPr>
+                <w:rStyle w:val="Collegamentoipertestuale"/>
+                <w:noProof/>
+              </w:rPr>
+              <w:t>Cliente – Login</w:t>
+            </w:r>
+            <w:r>
+              <w:rPr>
+                <w:noProof/>
+                <w:webHidden/>
+              </w:rPr>
+              <w:tab/>
+            </w:r>
+            <w:r>
+              <w:rPr>
+                <w:noProof/>
+                <w:webHidden/>
+              </w:rPr>
+              <w:fldChar w:fldCharType="begin"/>
+            </w:r>
+            <w:r>
+              <w:rPr>
+                <w:noProof/>
+                <w:webHidden/>
+              </w:rPr>
+              <w:instrText xml:space="preserve"> PAGEREF _Toc199316936 \h </w:instrText>
+            </w:r>
+            <w:r>
+              <w:rPr>
+                <w:noProof/>
+                <w:webHidden/>
+              </w:rPr>
+            </w:r>
+            <w:r>
+              <w:rPr>
+                <w:noProof/>
+                <w:webHidden/>
+              </w:rPr>
+              <w:fldChar w:fldCharType="separate"/>
+            </w:r>
+            <w:r>
+              <w:rPr>
+                <w:noProof/>
+                <w:webHidden/>
+              </w:rPr>
+              <w:t>2</w:t>
+            </w:r>
+            <w:r>
+              <w:rPr>
+                <w:noProof/>
+                <w:webHidden/>
+              </w:rPr>
+              <w:fldChar w:fldCharType="end"/>
+            </w:r>
+          </w:hyperlink>
+        </w:p>
+        <w:p>
+          <w:pPr>
+            <w:pStyle w:val="Sommario3"/>
+            <w:tabs>
+              <w:tab w:val="right" w:leader="dot" w:pos="9628"/>
+            </w:tabs>
+            <w:rPr>
+              <w:noProof/>
+            </w:rPr>
+          </w:pPr>
+          <w:hyperlink w:anchor="_Toc199316937" w:history="1">
+            <w:r>
+              <w:rPr>
+                <w:rStyle w:val="Collegamentoipertestuale"/>
+                <w:noProof/>
+              </w:rPr>
+              <w:t>Cliente – Creazione Utente</w:t>
+            </w:r>
+            <w:r>
+              <w:rPr>
+                <w:noProof/>
+                <w:webHidden/>
+              </w:rPr>
+              <w:tab/>
+            </w:r>
+            <w:r>
+              <w:rPr>
+                <w:noProof/>
+                <w:webHidden/>
+              </w:rPr>
+              <w:fldChar w:fldCharType="begin"/>
+            </w:r>
+            <w:r>
+              <w:rPr>
+                <w:noProof/>
+                <w:webHidden/>
+              </w:rPr>
+              <w:instrText xml:space="preserve"> PAGEREF _Toc199316937 \h </w:instrText>
+            </w:r>
+            <w:r>
+              <w:rPr>
+                <w:noProof/>
+                <w:webHidden/>
+              </w:rPr>
+            </w:r>
+            <w:r>
+              <w:rPr>
+                <w:noProof/>
+                <w:webHidden/>
+              </w:rPr>
+              <w:fldChar w:fldCharType="separate"/>
+            </w:r>
+            <w:r>
+              <w:rPr>
+                <w:noProof/>
+                <w:webHidden/>
+              </w:rPr>
+              <w:t>3</w:t>
+            </w:r>
+            <w:r>
+              <w:rPr>
+                <w:noProof/>
+                <w:webHidden/>
+              </w:rPr>
+              <w:fldChar w:fldCharType="end"/>
+            </w:r>
+          </w:hyperlink>
+        </w:p>
+        <w:p>
+          <w:pPr>
+            <w:pStyle w:val="Sommario3"/>
+            <w:tabs>
+              <w:tab w:val="right" w:leader="dot" w:pos="9628"/>
+            </w:tabs>
+            <w:rPr>
+              <w:noProof/>
+            </w:rPr>
+          </w:pPr>
+          <w:hyperlink w:anchor="_Toc199316938" w:history="1">
+            <w:r>
+              <w:rPr>
+                <w:rStyle w:val="Collegamentoipertestuale"/>
+                <w:noProof/>
+              </w:rPr>
+              <w:t>Cliente – Acquisto prodotti</w:t>
+            </w:r>
+            <w:r>
+              <w:rPr>
+                <w:noProof/>
+                <w:webHidden/>
+              </w:rPr>
+              <w:tab/>
+            </w:r>
+            <w:r>
+              <w:rPr>
+                <w:noProof/>
+                <w:webHidden/>
+              </w:rPr>
+              <w:fldChar w:fldCharType="begin"/>
+            </w:r>
+            <w:r>
+              <w:rPr>
+                <w:noProof/>
+                <w:webHidden/>
+              </w:rPr>
+              <w:instrText xml:space="preserve"> PAGEREF _Toc199316938 \h </w:instrText>
+            </w:r>
+            <w:r>
+              <w:rPr>
+                <w:noProof/>
+                <w:webHidden/>
+              </w:rPr>
+            </w:r>
+            <w:r>
+              <w:rPr>
+                <w:noProof/>
+                <w:webHidden/>
+              </w:rPr>
+              <w:fldChar w:fldCharType="separate"/>
+            </w:r>
+            <w:r>
+              <w:rPr>
+                <w:noProof/>
+                <w:webHidden/>
+              </w:rPr>
+              <w:t>4</w:t>
+            </w:r>
+            <w:r>
+              <w:rPr>
+                <w:noProof/>
+                <w:webHidden/>
+              </w:rPr>
+              <w:fldChar w:fldCharType="end"/>
+            </w:r>
+          </w:hyperlink>
+        </w:p>
+        <w:p>
+          <w:pPr>
+            <w:pStyle w:val="Sommario3"/>
+            <w:tabs>
+              <w:tab w:val="right" w:leader="dot" w:pos="9628"/>
+            </w:tabs>
+            <w:rPr>
+              <w:noProof/>
+            </w:rPr>
+          </w:pPr>
+          <w:hyperlink w:anchor="_Toc199316939" w:history="1">
+            <w:r>
+              <w:rPr>
+                <w:rStyle w:val="Collegamentoipertestuale"/>
+                <w:noProof/>
+              </w:rPr>
+              <w:t>Vendor – Login</w:t>
+            </w:r>
+            <w:r>
+              <w:rPr>
+                <w:noProof/>
+                <w:webHidden/>
+              </w:rPr>
+              <w:tab/>
+            </w:r>
+            <w:r>
+              <w:rPr>
+                <w:noProof/>
+                <w:webHidden/>
+              </w:rPr>
+              <w:fldChar w:fldCharType="begin"/>
+            </w:r>
+            <w:r>
+              <w:rPr>
+                <w:noProof/>
+                <w:webHidden/>
+              </w:rPr>
+              <w:instrText xml:space="preserve"> PAGEREF _Toc199316939 \h </w:instrText>
+            </w:r>
+            <w:r>
+              <w:rPr>
+                <w:noProof/>
+                <w:webHidden/>
+              </w:rPr>
+            </w:r>
+            <w:r>
+              <w:rPr>
+                <w:noProof/>
+                <w:webHidden/>
+              </w:rPr>
+              <w:fldChar w:fldCharType="separate"/>
+            </w:r>
+            <w:r>
+              <w:rPr>
+                <w:noProof/>
+                <w:webHidden/>
+              </w:rPr>
+              <w:t>4</w:t>
+            </w:r>
+            <w:r>
+              <w:rPr>
+                <w:noProof/>
+                <w:webHidden/>
+              </w:rPr>
+              <w:fldChar w:fldCharType="end"/>
+            </w:r>
+          </w:hyperlink>
+        </w:p>
+        <w:p>
+          <w:pPr>
+            <w:pStyle w:val="Sommario3"/>
+            <w:tabs>
+              <w:tab w:val="right" w:leader="dot" w:pos="9628"/>
+            </w:tabs>
+            <w:rPr>
+              <w:noProof/>
+            </w:rPr>
+          </w:pPr>
+          <w:hyperlink w:anchor="_Toc199316940" w:history="1">
+            <w:r>
+              <w:rPr>
+                <w:rStyle w:val="Collegamentoipertestuale"/>
+                <w:noProof/>
+              </w:rPr>
+              <w:t>Vendor – Gestione prodotti</w:t>
+            </w:r>
+            <w:r>
+              <w:rPr>
+                <w:noProof/>
+                <w:webHidden/>
+              </w:rPr>
+              <w:tab/>
+            </w:r>
+            <w:r>
+              <w:rPr>
+                <w:noProof/>
+                <w:webHidden/>
+              </w:rPr>
+              <w:fldChar w:fldCharType="begin"/>
+            </w:r>
+            <w:r>
+              <w:rPr>
+                <w:noProof/>
+                <w:webHidden/>
+              </w:rPr>
+              <w:instrText xml:space="preserve"> PAGEREF _Toc199316940 \h </w:instrText>
+            </w:r>
+            <w:r>
+              <w:rPr>
+                <w:noProof/>
+                <w:webHidden/>
+              </w:rPr>
+            </w:r>
+            <w:r>
+              <w:rPr>
+                <w:noProof/>
+                <w:webHidden/>
+              </w:rPr>
+              <w:fldChar w:fldCharType="separate"/>
+            </w:r>
+            <w:r>
+              <w:rPr>
+                <w:noProof/>
+                <w:webHidden/>
+              </w:rPr>
+              <w:t>5</w:t>
+            </w:r>
+            <w:r>
+              <w:rPr>
+                <w:noProof/>
+                <w:webHidden/>
+              </w:rPr>
+              <w:fldChar w:fldCharType="end"/>
+            </w:r>
+          </w:hyperlink>
+        </w:p>
+        <w:p>
+          <w:pPr>
+            <w:pStyle w:val="Sommario3"/>
+            <w:tabs>
+              <w:tab w:val="right" w:leader="dot" w:pos="9628"/>
+            </w:tabs>
+            <w:rPr>
+              <w:noProof/>
+            </w:rPr>
+          </w:pPr>
+          <w:hyperlink w:anchor="_Toc199316941" w:history="1">
+            <w:r>
+              <w:rPr>
+                <w:rStyle w:val="Collegamentoipertestuale"/>
+                <w:noProof/>
+              </w:rPr>
+              <w:t>Admin – Login</w:t>
+            </w:r>
+            <w:r>
+              <w:rPr>
+                <w:noProof/>
+                <w:webHidden/>
+              </w:rPr>
+              <w:tab/>
+            </w:r>
+            <w:r>
+              <w:rPr>
+                <w:noProof/>
+                <w:webHidden/>
+              </w:rPr>
+              <w:fldChar w:fldCharType="begin"/>
+            </w:r>
+            <w:r>
+              <w:rPr>
+                <w:noProof/>
+                <w:webHidden/>
+              </w:rPr>
+              <w:instrText xml:space="preserve"> PAGEREF _Toc199316941 \h </w:instrText>
+            </w:r>
+            <w:r>
+              <w:rPr>
+                <w:noProof/>
+                <w:webHidden/>
+              </w:rPr>
+            </w:r>
+            <w:r>
+              <w:rPr>
+                <w:noProof/>
+                <w:webHidden/>
+              </w:rPr>
+              <w:fldChar w:fldCharType="separate"/>
+            </w:r>
+            <w:r>
+              <w:rPr>
+                <w:noProof/>
+                <w:webHidden/>
+              </w:rPr>
+              <w:t>6</w:t>
+            </w:r>
+            <w:r>
+              <w:rPr>
+                <w:noProof/>
+                <w:webHidden/>
+              </w:rPr>
+              <w:fldChar w:fldCharType="end"/>
+            </w:r>
+          </w:hyperlink>
+        </w:p>
+        <w:p>
+          <w:pPr>
+            <w:pStyle w:val="Sommario3"/>
+            <w:tabs>
+              <w:tab w:val="right" w:leader="dot" w:pos="9628"/>
+            </w:tabs>
+            <w:rPr>
+              <w:noProof/>
+            </w:rPr>
+          </w:pPr>
+          <w:hyperlink w:anchor="_Toc199316942" w:history="1">
+            <w:r>
+              <w:rPr>
+                <w:rStyle w:val="Collegamentoipertestuale"/>
+                <w:noProof/>
+              </w:rPr>
+              <w:t>Admin – Gestione Utenti</w:t>
+            </w:r>
+            <w:r>
+              <w:rPr>
+                <w:noProof/>
+                <w:webHidden/>
+              </w:rPr>
+              <w:tab/>
+            </w:r>
+            <w:r>
+              <w:rPr>
+                <w:noProof/>
+                <w:webHidden/>
+              </w:rPr>
+              <w:fldChar w:fldCharType="begin"/>
+            </w:r>
+            <w:r>
+              <w:rPr>
+                <w:noProof/>
+                <w:webHidden/>
+              </w:rPr>
+              <w:instrText xml:space="preserve"> PAGEREF _Toc199316942 \h </w:instrText>
+            </w:r>
+            <w:r>
+              <w:rPr>
+                <w:noProof/>
+                <w:webHidden/>
+              </w:rPr>
+            </w:r>
+            <w:r>
+              <w:rPr>
+                <w:noProof/>
+                <w:webHidden/>
+              </w:rPr>
+              <w:fldChar w:fldCharType="separate"/>
+            </w:r>
+            <w:r>
+              <w:rPr>
+                <w:noProof/>
+                <w:webHidden/>
+              </w:rPr>
+              <w:t>6</w:t>
+            </w:r>
+            <w:r>
+              <w:rPr>
+                <w:noProof/>
+                <w:webHidden/>
+              </w:rPr>
+              <w:fldChar w:fldCharType="end"/>
+            </w:r>
+          </w:hyperlink>
+        </w:p>
+        <w:p>
+          <w:pPr>
+            <w:pStyle w:val="Sommario2"/>
+            <w:tabs>
+              <w:tab w:val="right" w:leader="dot" w:pos="9628"/>
+            </w:tabs>
+            <w:rPr>
+              <w:noProof/>
+            </w:rPr>
+          </w:pPr>
+          <w:hyperlink w:anchor="_Toc199316943" w:history="1">
+            <w:r>
+              <w:rPr>
+                <w:rStyle w:val="Collegamentoipertestuale"/>
+                <w:noProof/>
+              </w:rPr>
+              <w:t>Class Diagram</w:t>
+            </w:r>
+            <w:r>
+              <w:rPr>
+                <w:noProof/>
+                <w:webHidden/>
+              </w:rPr>
+              <w:tab/>
+            </w:r>
+            <w:r>
+              <w:rPr>
+                <w:noProof/>
+                <w:webHidden/>
+              </w:rPr>
+              <w:fldChar w:fldCharType="begin"/>
+            </w:r>
+            <w:r>
+              <w:rPr>
+                <w:noProof/>
+                <w:webHidden/>
+              </w:rPr>
+              <w:instrText xml:space="preserve"> PAGEREF _Toc199316943 \h </w:instrText>
+            </w:r>
+            <w:r>
+              <w:rPr>
+                <w:noProof/>
+                <w:webHidden/>
+              </w:rPr>
+            </w:r>
+            <w:r>
+              <w:rPr>
+                <w:noProof/>
+                <w:webHidden/>
+              </w:rPr>
+              <w:fldChar w:fldCharType="separate"/>
+            </w:r>
+            <w:r>
+              <w:rPr>
+                <w:noProof/>
+                <w:webHidden/>
+              </w:rPr>
+              <w:t>7</w:t>
+            </w:r>
+            <w:r>
+              <w:rPr>
+                <w:noProof/>
+                <w:webHidden/>
+              </w:rPr>
+              <w:fldChar w:fldCharType="end"/>
+            </w:r>
+          </w:hyperlink>
+        </w:p>
+        <w:p>
+          <w:pPr>
+            <w:pStyle w:val="Sommario2"/>
+            <w:tabs>
+              <w:tab w:val="right" w:leader="dot" w:pos="9628"/>
+            </w:tabs>
+            <w:rPr>
+              <w:noProof/>
+            </w:rPr>
+          </w:pPr>
+          <w:hyperlink w:anchor="_Toc199316944" w:history="1">
+            <w:r>
+              <w:rPr>
+                <w:rStyle w:val="Collegamentoipertestuale"/>
+                <w:noProof/>
+              </w:rPr>
+              <w:t>GUI</w:t>
+            </w:r>
+            <w:r>
+              <w:rPr>
+                <w:noProof/>
+                <w:webHidden/>
+              </w:rPr>
+              <w:tab/>
+            </w:r>
+            <w:r>
+              <w:rPr>
+                <w:noProof/>
+                <w:webHidden/>
+              </w:rPr>
+              <w:fldChar w:fldCharType="begin"/>
+            </w:r>
+            <w:r>
+              <w:rPr>
+                <w:noProof/>
+                <w:webHidden/>
+              </w:rPr>
+              <w:instrText xml:space="preserve"> PAGEREF _Toc199316944 \h </w:instrText>
+            </w:r>
+            <w:r>
+              <w:rPr>
+                <w:noProof/>
+                <w:webHidden/>
+              </w:rPr>
+            </w:r>
+            <w:r>
+              <w:rPr>
+                <w:noProof/>
+                <w:webHidden/>
+              </w:rPr>
+              <w:fldChar w:fldCharType="separate"/>
+            </w:r>
+            <w:r>
+              <w:rPr>
+                <w:noProof/>
+                <w:webHidden/>
+              </w:rPr>
+              <w:t>8</w:t>
+            </w:r>
+            <w:r>
+              <w:rPr>
+                <w:noProof/>
+                <w:webHidden/>
+              </w:rPr>
+              <w:fldChar w:fldCharType="end"/>
+            </w:r>
+          </w:hyperlink>
+        </w:p>
+        <w:p>
+          <w:pPr>
+            <w:pStyle w:val="Sommario3"/>
+            <w:tabs>
+              <w:tab w:val="right" w:leader="dot" w:pos="9628"/>
+            </w:tabs>
+            <w:rPr>
+              <w:noProof/>
+            </w:rPr>
+          </w:pPr>
+          <w:hyperlink w:anchor="_Toc199316945" w:history="1">
+            <w:r>
+              <w:rPr>
+                <w:rStyle w:val="Collegamentoipertestuale"/>
+                <w:noProof/>
+              </w:rPr>
+              <w:t>Home (without login)</w:t>
+            </w:r>
+            <w:r>
+              <w:rPr>
+                <w:noProof/>
+                <w:webHidden/>
+              </w:rPr>
+              <w:tab/>
+            </w:r>
+            <w:r>
+              <w:rPr>
+                <w:noProof/>
+                <w:webHidden/>
+              </w:rPr>
+              <w:fldChar w:fldCharType="begin"/>
+            </w:r>
+            <w:r>
+              <w:rPr>
+                <w:noProof/>
+                <w:webHidden/>
+              </w:rPr>
+              <w:instrText xml:space="preserve"> PAGEREF _Toc199316945 \h </w:instrText>
+            </w:r>
+            <w:r>
+              <w:rPr>
+                <w:noProof/>
+                <w:webHidden/>
+              </w:rPr>
+            </w:r>
+            <w:r>
+              <w:rPr>
+                <w:noProof/>
+                <w:webHidden/>
+              </w:rPr>
+              <w:fldChar w:fldCharType="separate"/>
+            </w:r>
+            <w:r>
+              <w:rPr>
+                <w:noProof/>
+                <w:webHidden/>
+              </w:rPr>
+              <w:t>8</w:t>
+            </w:r>
+            <w:r>
+              <w:rPr>
+                <w:noProof/>
+                <w:webHidden/>
+              </w:rPr>
+              <w:fldChar w:fldCharType="end"/>
+            </w:r>
+          </w:hyperlink>
+        </w:p>
+        <w:p>
+          <w:pPr>
+            <w:pStyle w:val="Sommario3"/>
+            <w:tabs>
+              <w:tab w:val="right" w:leader="dot" w:pos="9628"/>
+            </w:tabs>
+            <w:rPr>
+              <w:noProof/>
+            </w:rPr>
+          </w:pPr>
+          <w:hyperlink w:anchor="_Toc199316946" w:history="1">
+            <w:r>
+              <w:rPr>
+                <w:rStyle w:val="Collegamentoipertestuale"/>
+                <w:noProof/>
+              </w:rPr>
+              <w:t>Home (with login)</w:t>
+            </w:r>
+            <w:r>
+              <w:rPr>
+                <w:noProof/>
+                <w:webHidden/>
+              </w:rPr>
+              <w:tab/>
+            </w:r>
+            <w:r>
+              <w:rPr>
+                <w:noProof/>
+                <w:webHidden/>
+              </w:rPr>
+              <w:fldChar w:fldCharType="begin"/>
+            </w:r>
+            <w:r>
+              <w:rPr>
+                <w:noProof/>
+                <w:webHidden/>
+              </w:rPr>
+              <w:instrText xml:space="preserve"> PAGEREF _Toc199316946 \h </w:instrText>
+            </w:r>
+            <w:r>
+              <w:rPr>
+                <w:noProof/>
+                <w:webHidden/>
+              </w:rPr>
+            </w:r>
+            <w:r>
+              <w:rPr>
+                <w:noProof/>
+                <w:webHidden/>
+              </w:rPr>
+              <w:fldChar w:fldCharType="separate"/>
+            </w:r>
+            <w:r>
+              <w:rPr>
+                <w:noProof/>
+                <w:webHidden/>
+              </w:rPr>
+              <w:t>8</w:t>
+            </w:r>
+            <w:r>
+              <w:rPr>
+                <w:noProof/>
+                <w:webHidden/>
+              </w:rPr>
+              <w:fldChar w:fldCharType="end"/>
+            </w:r>
+          </w:hyperlink>
+        </w:p>
+        <w:p>
+          <w:pPr>
+            <w:pStyle w:val="Sommario3"/>
+            <w:tabs>
+              <w:tab w:val="right" w:leader="dot" w:pos="9628"/>
+            </w:tabs>
+            <w:rPr>
+              <w:noProof/>
+            </w:rPr>
+          </w:pPr>
+          <w:hyperlink w:anchor="_Toc199316947" w:history="1">
+            <w:r>
+              <w:rPr>
+                <w:rStyle w:val="Collegamentoipertestuale"/>
+                <w:noProof/>
+              </w:rPr>
+              <w:t>Catalogo</w:t>
+            </w:r>
+            <w:r>
+              <w:rPr>
+                <w:noProof/>
+                <w:webHidden/>
+              </w:rPr>
+              <w:tab/>
+            </w:r>
+            <w:r>
+              <w:rPr>
+                <w:noProof/>
+                <w:webHidden/>
+              </w:rPr>
+              <w:fldChar w:fldCharType="begin"/>
+            </w:r>
+            <w:r>
+              <w:rPr>
+                <w:noProof/>
+                <w:webHidden/>
+              </w:rPr>
+              <w:instrText xml:space="preserve"> PAGEREF _Toc199316947 \h </w:instrText>
+            </w:r>
+            <w:r>
+              <w:rPr>
+                <w:noProof/>
+                <w:webHidden/>
+              </w:rPr>
+            </w:r>
+            <w:r>
+              <w:rPr>
+                <w:noProof/>
+                <w:webHidden/>
+              </w:rPr>
+              <w:fldChar w:fldCharType="separate"/>
+            </w:r>
+            <w:r>
+              <w:rPr>
+                <w:noProof/>
+                <w:webHidden/>
+              </w:rPr>
+              <w:t>9</w:t>
+            </w:r>
+            <w:r>
+              <w:rPr>
+                <w:noProof/>
+                <w:webHidden/>
+              </w:rPr>
+              <w:fldChar w:fldCharType="end"/>
+            </w:r>
+          </w:hyperlink>
+        </w:p>
+        <w:p>
+          <w:pPr>
+            <w:pStyle w:val="Sommario3"/>
+            <w:tabs>
+              <w:tab w:val="right" w:leader="dot" w:pos="9628"/>
+            </w:tabs>
+            <w:rPr>
+              <w:noProof/>
+            </w:rPr>
+          </w:pPr>
+          <w:hyperlink w:anchor="_Toc199316948" w:history="1">
+            <w:r>
+              <w:rPr>
+                <w:rStyle w:val="Collegamentoipertestuale"/>
+                <w:noProof/>
+              </w:rPr>
+              <w:t>Registrazione</w:t>
+            </w:r>
+            <w:r>
+              <w:rPr>
+                <w:noProof/>
+                <w:webHidden/>
+              </w:rPr>
+              <w:tab/>
+            </w:r>
+            <w:r>
+              <w:rPr>
+                <w:noProof/>
+                <w:webHidden/>
+              </w:rPr>
+              <w:fldChar w:fldCharType="begin"/>
+            </w:r>
+            <w:r>
+              <w:rPr>
+                <w:noProof/>
+                <w:webHidden/>
+              </w:rPr>
+              <w:instrText xml:space="preserve"> PAGEREF _Toc199316948 \h </w:instrText>
+            </w:r>
+            <w:r>
+              <w:rPr>
+                <w:noProof/>
+                <w:webHidden/>
+              </w:rPr>
+            </w:r>
+            <w:r>
+              <w:rPr>
+                <w:noProof/>
+                <w:webHidden/>
+              </w:rPr>
+              <w:fldChar w:fldCharType="separate"/>
+            </w:r>
+            <w:r>
+              <w:rPr>
+                <w:noProof/>
+                <w:webHidden/>
+              </w:rPr>
+              <w:t>9</w:t>
+            </w:r>
+            <w:r>
+              <w:rPr>
+                <w:noProof/>
+                <w:webHidden/>
+              </w:rPr>
+              <w:fldChar w:fldCharType="end"/>
+            </w:r>
+          </w:hyperlink>
+        </w:p>
+        <w:p>
+          <w:pPr>
+            <w:pStyle w:val="Sommario3"/>
+            <w:tabs>
+              <w:tab w:val="right" w:leader="dot" w:pos="9628"/>
+            </w:tabs>
+            <w:rPr>
+              <w:noProof/>
+            </w:rPr>
+          </w:pPr>
+          <w:hyperlink w:anchor="_Toc199316949" w:history="1">
+            <w:r>
+              <w:rPr>
+                <w:rStyle w:val="Collegamentoipertestuale"/>
+                <w:noProof/>
+              </w:rPr>
+              <w:t>Login</w:t>
+            </w:r>
+            <w:r>
+              <w:rPr>
+                <w:noProof/>
+                <w:webHidden/>
+              </w:rPr>
+              <w:tab/>
+            </w:r>
+            <w:r>
+              <w:rPr>
+                <w:noProof/>
+                <w:webHidden/>
+              </w:rPr>
+              <w:fldChar w:fldCharType="begin"/>
+            </w:r>
+            <w:r>
+              <w:rPr>
+                <w:noProof/>
+                <w:webHidden/>
+              </w:rPr>
+              <w:instrText xml:space="preserve"> PAGEREF _Toc199316949 \h </w:instrText>
+            </w:r>
+            <w:r>
+              <w:rPr>
+                <w:noProof/>
+                <w:webHidden/>
+              </w:rPr>
+            </w:r>
+            <w:r>
+              <w:rPr>
+                <w:noProof/>
+                <w:webHidden/>
+              </w:rPr>
+              <w:fldChar w:fldCharType="separate"/>
+            </w:r>
+            <w:r>
+              <w:rPr>
+                <w:noProof/>
+                <w:webHidden/>
+              </w:rPr>
+              <w:t>10</w:t>
+            </w:r>
+            <w:r>
+              <w:rPr>
+                <w:noProof/>
+                <w:webHidden/>
+              </w:rPr>
+              <w:fldChar w:fldCharType="end"/>
+            </w:r>
+          </w:hyperlink>
+        </w:p>
+        <w:p>
+          <w:pPr>
+            <w:pStyle w:val="Sommario3"/>
+            <w:tabs>
+              <w:tab w:val="right" w:leader="dot" w:pos="9628"/>
+            </w:tabs>
+            <w:rPr>
+              <w:noProof/>
+            </w:rPr>
+          </w:pPr>
+          <w:hyperlink w:anchor="_Toc199316950" w:history="1">
+            <w:r>
+              <w:rPr>
+                <w:rStyle w:val="Collegamentoipertestuale"/>
+                <w:noProof/>
+              </w:rPr>
+              <w:t>Prodotto</w:t>
+            </w:r>
+            <w:r>
+              <w:rPr>
+                <w:noProof/>
+                <w:webHidden/>
+              </w:rPr>
+              <w:tab/>
+            </w:r>
+            <w:r>
+              <w:rPr>
+                <w:noProof/>
+                <w:webHidden/>
+              </w:rPr>
+              <w:fldChar w:fldCharType="begin"/>
+            </w:r>
+            <w:r>
+              <w:rPr>
+                <w:noProof/>
+                <w:webHidden/>
+              </w:rPr>
+              <w:instrText xml:space="preserve"> PAGEREF _Toc199316950 \h </w:instrText>
+            </w:r>
+            <w:r>
+              <w:rPr>
+                <w:noProof/>
+                <w:webHidden/>
+              </w:rPr>
+            </w:r>
+            <w:r>
+              <w:rPr>
+                <w:noProof/>
+                <w:webHidden/>
+              </w:rPr>
+              <w:fldChar w:fldCharType="separate"/>
+            </w:r>
+            <w:r>
+              <w:rPr>
+                <w:noProof/>
+                <w:webHidden/>
+              </w:rPr>
+              <w:t>10</w:t>
+            </w:r>
+            <w:r>
+              <w:rPr>
+                <w:noProof/>
+                <w:webHidden/>
+              </w:rPr>
+              <w:fldChar w:fldCharType="end"/>
+            </w:r>
+          </w:hyperlink>
+        </w:p>
+        <w:p>
+          <w:pPr>
+            <w:pStyle w:val="Sommario3"/>
+            <w:tabs>
+              <w:tab w:val="right" w:leader="dot" w:pos="9628"/>
+            </w:tabs>
+            <w:rPr>
+              <w:noProof/>
+            </w:rPr>
+          </w:pPr>
+          <w:hyperlink w:anchor="_Toc199316951" w:history="1">
+            <w:r>
+              <w:rPr>
+                <w:rStyle w:val="Collegamentoipertestuale"/>
+                <w:noProof/>
+              </w:rPr>
+              <w:t>Amministrazione</w:t>
+            </w:r>
+            <w:r>
+              <w:rPr>
+                <w:noProof/>
+                <w:webHidden/>
+              </w:rPr>
+              <w:tab/>
+            </w:r>
+            <w:r>
+              <w:rPr>
+                <w:noProof/>
+                <w:webHidden/>
+              </w:rPr>
+              <w:fldChar w:fldCharType="begin"/>
+            </w:r>
+            <w:r>
+              <w:rPr>
+                <w:noProof/>
+                <w:webHidden/>
+              </w:rPr>
+              <w:instrText xml:space="preserve"> PAGEREF _Toc199316951 \h </w:instrText>
+            </w:r>
+            <w:r>
+              <w:rPr>
+                <w:noProof/>
+                <w:webHidden/>
+              </w:rPr>
+            </w:r>
+            <w:r>
+              <w:rPr>
+                <w:noProof/>
+                <w:webHidden/>
+              </w:rPr>
+              <w:fldChar w:fldCharType="separate"/>
+            </w:r>
+            <w:r>
+              <w:rPr>
+                <w:noProof/>
+                <w:webHidden/>
+              </w:rPr>
+              <w:t>11</w:t>
+            </w:r>
+            <w:r>
+              <w:rPr>
+                <w:noProof/>
+                <w:webHidden/>
+              </w:rPr>
+              <w:fldChar w:fldCharType="end"/>
+            </w:r>
+          </w:hyperlink>
+        </w:p>
+        <w:p>
+          <w:pPr>
+            <w:pStyle w:val="Sommario3"/>
+            <w:tabs>
+              <w:tab w:val="right" w:leader="dot" w:pos="9628"/>
+            </w:tabs>
+            <w:rPr>
+              <w:noProof/>
+            </w:rPr>
+          </w:pPr>
+          <w:hyperlink w:anchor="_Toc199316952" w:history="1">
+            <w:r>
+              <w:rPr>
+                <w:rStyle w:val="Collegamentoipertestuale"/>
+                <w:noProof/>
+              </w:rPr>
+              <w:t>Vendor – Prodotti</w:t>
+            </w:r>
+            <w:r>
+              <w:rPr>
+                <w:noProof/>
+                <w:webHidden/>
+              </w:rPr>
+              <w:tab/>
+            </w:r>
+            <w:r>
+              <w:rPr>
+                <w:noProof/>
+                <w:webHidden/>
+              </w:rPr>
+              <w:fldChar w:fldCharType="begin"/>
+            </w:r>
+            <w:r>
+              <w:rPr>
+                <w:noProof/>
+                <w:webHidden/>
+              </w:rPr>
+              <w:instrText xml:space="preserve"> PAGEREF _Toc199316952 \h </w:instrText>
+            </w:r>
+            <w:r>
+              <w:rPr>
+                <w:noProof/>
+                <w:webHidden/>
+              </w:rPr>
+            </w:r>
+            <w:r>
+              <w:rPr>
+                <w:noProof/>
+                <w:webHidden/>
+              </w:rPr>
+              <w:fldChar w:fldCharType="separate"/>
+            </w:r>
+            <w:r>
+              <w:rPr>
+                <w:noProof/>
+                <w:webHidden/>
+              </w:rPr>
+              <w:t>11</w:t>
+            </w:r>
+            <w:r>
+              <w:rPr>
+                <w:noProof/>
+                <w:webHidden/>
+              </w:rPr>
+              <w:fldChar w:fldCharType="end"/>
+            </w:r>
+          </w:hyperlink>
+        </w:p>
+        <w:p>
+          <w:pPr>
+            <w:pStyle w:val="Sommario3"/>
+            <w:tabs>
+              <w:tab w:val="right" w:leader="dot" w:pos="9628"/>
+            </w:tabs>
+            <w:rPr>
+              <w:noProof/>
+            </w:rPr>
+          </w:pPr>
+          <w:hyperlink w:anchor="_Toc199316953" w:history="1">
+            <w:r>
+              <w:rPr>
+                <w:rStyle w:val="Collegamentoipertestuale"/>
+                <w:noProof/>
+              </w:rPr>
+              <w:t>Vendor – Vendite</w:t>
+            </w:r>
+            <w:r>
+              <w:rPr>
+                <w:noProof/>
+                <w:webHidden/>
+              </w:rPr>
+              <w:tab/>
+            </w:r>
+            <w:r>
+              <w:rPr>
+                <w:noProof/>
+                <w:webHidden/>
+              </w:rPr>
+              <w:fldChar w:fldCharType="begin"/>
+            </w:r>
+            <w:r>
+              <w:rPr>
+                <w:noProof/>
+                <w:webHidden/>
+              </w:rPr>
+              <w:instrText xml:space="preserve"> PAGEREF _Toc199316953 \h </w:instrText>
+            </w:r>
+            <w:r>
+              <w:rPr>
+                <w:noProof/>
+                <w:webHidden/>
+              </w:rPr>
+            </w:r>
+            <w:r>
+              <w:rPr>
+                <w:noProof/>
+                <w:webHidden/>
+              </w:rPr>
+              <w:fldChar w:fldCharType="separate"/>
+            </w:r>
+            <w:r>
+              <w:rPr>
+                <w:noProof/>
+                <w:webHidden/>
+              </w:rPr>
+              <w:t>12</w:t>
+            </w:r>
+            <w:r>
+              <w:rPr>
+                <w:noProof/>
+                <w:webHidden/>
+              </w:rPr>
+              <w:fldChar w:fldCharType="end"/>
+            </w:r>
+          </w:hyperlink>
+        </w:p>
+        <w:p>
+          <w:pPr>
+            <w:pStyle w:val="Sommario3"/>
+            <w:tabs>
+              <w:tab w:val="right" w:leader="dot" w:pos="9628"/>
+            </w:tabs>
+            <w:rPr>
+              <w:noProof/>
+            </w:rPr>
+          </w:pPr>
+          <w:hyperlink w:anchor="_Toc199316954" w:history="1">
+            <w:r>
+              <w:rPr>
+                <w:rStyle w:val="Collegamentoipertestuale"/>
+                <w:noProof/>
+              </w:rPr>
+              <w:t>Impostazioni</w:t>
+            </w:r>
+            <w:r>
+              <w:rPr>
+                <w:noProof/>
+                <w:webHidden/>
+              </w:rPr>
+              <w:tab/>
+            </w:r>
+            <w:r>
+              <w:rPr>
+                <w:noProof/>
+                <w:webHidden/>
+              </w:rPr>
+              <w:fldChar w:fldCharType="begin"/>
+            </w:r>
+            <w:r>
+              <w:rPr>
+                <w:noProof/>
+                <w:webHidden/>
+              </w:rPr>
+              <w:instrText xml:space="preserve"> PAGEREF _Toc199316954 \h </w:instrText>
+            </w:r>
+            <w:r>
+              <w:rPr>
+                <w:noProof/>
+                <w:webHidden/>
+              </w:rPr>
+            </w:r>
+            <w:r>
+              <w:rPr>
+                <w:noProof/>
+                <w:webHidden/>
+              </w:rPr>
+              <w:fldChar w:fldCharType="separate"/>
+            </w:r>
+            <w:r>
+              <w:rPr>
+                <w:noProof/>
+                <w:webHidden/>
+              </w:rPr>
+              <w:t>12</w:t>
+            </w:r>
+            <w:r>
+              <w:rPr>
+                <w:noProof/>
+                <w:webHidden/>
+              </w:rPr>
+              <w:fldChar w:fldCharType="end"/>
+            </w:r>
+          </w:hyperlink>
+        </w:p>
+        <w:p>
+          <w:pPr>
+            <w:pStyle w:val="Sommario2"/>
+            <w:tabs>
+              <w:tab w:val="right" w:leader="dot" w:pos="9628"/>
+            </w:tabs>
+            <w:rPr>
+              <w:noProof/>
+            </w:rPr>
+          </w:pPr>
+          <w:hyperlink w:anchor="_Toc199316955" w:history="1">
+            <w:r>
+              <w:rPr>
+                <w:rStyle w:val="Collegamentoipertestuale"/>
+                <w:noProof/>
+              </w:rPr>
+              <w:t>Gannt</w:t>
+            </w:r>
+            <w:r>
+              <w:rPr>
+                <w:noProof/>
+                <w:webHidden/>
+              </w:rPr>
+              <w:tab/>
+            </w:r>
+            <w:r>
+              <w:rPr>
+                <w:noProof/>
+                <w:webHidden/>
+              </w:rPr>
+              <w:fldChar w:fldCharType="begin"/>
+            </w:r>
+            <w:r>
+              <w:rPr>
+                <w:noProof/>
+                <w:webHidden/>
+              </w:rPr>
+              <w:instrText xml:space="preserve"> PAGEREF _Toc199316955 \h </w:instrText>
+            </w:r>
+            <w:r>
+              <w:rPr>
+                <w:noProof/>
+                <w:webHidden/>
+              </w:rPr>
+            </w:r>
+            <w:r>
+              <w:rPr>
+                <w:noProof/>
+                <w:webHidden/>
+              </w:rPr>
+              <w:fldChar w:fldCharType="separate"/>
+            </w:r>
+            <w:r>
+              <w:rPr>
+                <w:noProof/>
+                <w:webHidden/>
+              </w:rPr>
+              <w:t>13</w:t>
+            </w:r>
+            <w:r>
+              <w:rPr>
+                <w:noProof/>
+                <w:webHidden/>
+              </w:rPr>
+              <w:fldChar w:fldCharType="end"/>
+            </w:r>
+          </w:hyperlink>
+        </w:p>
+        <w:p>
+          <w:pPr>
+            <w:pStyle w:val="Sommario1"/>
+            <w:tabs>
+              <w:tab w:val="right" w:leader="dot" w:pos="9628"/>
+            </w:tabs>
+            <w:rPr>
+              <w:noProof/>
+            </w:rPr>
+          </w:pPr>
+          <w:hyperlink w:anchor="_Toc199316956" w:history="1">
+            <w:r>
+              <w:rPr>
+                <w:rStyle w:val="Collegamentoipertestuale"/>
+                <w:noProof/>
+              </w:rPr>
+              <w:t>Implementazione</w:t>
+            </w:r>
+            <w:r>
+              <w:rPr>
+                <w:noProof/>
+                <w:webHidden/>
+              </w:rPr>
+              <w:tab/>
+            </w:r>
+            <w:r>
+              <w:rPr>
+                <w:noProof/>
+                <w:webHidden/>
+              </w:rPr>
+              <w:fldChar w:fldCharType="begin"/>
+            </w:r>
+            <w:r>
+              <w:rPr>
+                <w:noProof/>
+                <w:webHidden/>
+              </w:rPr>
+              <w:instrText xml:space="preserve"> PAGEREF _Toc199316956 \h </w:instrText>
+            </w:r>
+            <w:r>
+              <w:rPr>
+                <w:noProof/>
+                <w:webHidden/>
+              </w:rPr>
+            </w:r>
+            <w:r>
+              <w:rPr>
+                <w:noProof/>
+                <w:webHidden/>
+              </w:rPr>
+              <w:fldChar w:fldCharType="separate"/>
+            </w:r>
+            <w:r>
+              <w:rPr>
+                <w:noProof/>
+                <w:webHidden/>
+              </w:rPr>
+              <w:t>14</w:t>
+            </w:r>
+            <w:r>
+              <w:rPr>
+                <w:noProof/>
+                <w:webHidden/>
+              </w:rPr>
+              <w:fldChar w:fldCharType="end"/>
+            </w:r>
+          </w:hyperlink>
+        </w:p>
+        <w:p>
+          <w:pPr>
+            <w:pStyle w:val="Sommario2"/>
+            <w:tabs>
+              <w:tab w:val="right" w:leader="dot" w:pos="9628"/>
+            </w:tabs>
+            <w:rPr>
+              <w:noProof/>
+            </w:rPr>
+          </w:pPr>
+          <w:hyperlink w:anchor="_Toc199316957" w:history="1">
+            <w:r>
+              <w:rPr>
+                <w:rStyle w:val="Collegamentoipertestuale"/>
+                <w:noProof/>
+              </w:rPr>
+              <w:t>Visualizzare pagina Home</w:t>
+            </w:r>
+            <w:r>
+              <w:rPr>
+                <w:noProof/>
+                <w:webHidden/>
+              </w:rPr>
+              <w:tab/>
+            </w:r>
+            <w:r>
+              <w:rPr>
+                <w:noProof/>
+                <w:webHidden/>
+              </w:rPr>
+              <w:fldChar w:fldCharType="begin"/>
+            </w:r>
+            <w:r>
+              <w:rPr>
+                <w:noProof/>
+                <w:webHidden/>
+              </w:rPr>
+              <w:instrText xml:space="preserve"> PAGEREF _Toc199316957 \h </w:instrText>
+            </w:r>
+            <w:r>
+              <w:rPr>
+                <w:noProof/>
+                <w:webHidden/>
+              </w:rPr>
+            </w:r>
+            <w:r>
+              <w:rPr>
+                <w:noProof/>
+                <w:webHidden/>
+              </w:rPr>
+              <w:fldChar w:fldCharType="separate"/>
+            </w:r>
+            <w:r>
+              <w:rPr>
+                <w:noProof/>
+                <w:webHidden/>
+              </w:rPr>
+              <w:t>14</w:t>
+            </w:r>
+            <w:r>
+              <w:rPr>
+                <w:noProof/>
+                <w:webHidden/>
+              </w:rPr>
+              <w:fldChar w:fldCharType="end"/>
+            </w:r>
+          </w:hyperlink>
+        </w:p>
+        <w:p>
+          <w:pPr>
+            <w:pStyle w:val="Sommario2"/>
+            <w:tabs>
+              <w:tab w:val="right" w:leader="dot" w:pos="9628"/>
+            </w:tabs>
+            <w:rPr>
+              <w:noProof/>
+            </w:rPr>
+          </w:pPr>
+          <w:hyperlink w:anchor="_Toc199316958" w:history="1">
+            <w:r>
+              <w:rPr>
+                <w:rStyle w:val="Collegamentoipertestuale"/>
+                <w:noProof/>
+              </w:rPr>
+              <w:t>Visualizzare pagina Login</w:t>
+            </w:r>
+            <w:r>
+              <w:rPr>
+                <w:noProof/>
+                <w:webHidden/>
+              </w:rPr>
+              <w:tab/>
+            </w:r>
+            <w:r>
+              <w:rPr>
+                <w:noProof/>
+                <w:webHidden/>
+              </w:rPr>
+              <w:fldChar w:fldCharType="begin"/>
+            </w:r>
+            <w:r>
+              <w:rPr>
+                <w:noProof/>
+                <w:webHidden/>
+              </w:rPr>
+              <w:instrText xml:space="preserve"> PAGEREF _Toc199316958 \h </w:instrText>
+            </w:r>
+            <w:r>
+              <w:rPr>
+                <w:noProof/>
+                <w:webHidden/>
+              </w:rPr>
+            </w:r>
+            <w:r>
+              <w:rPr>
+                <w:noProof/>
+                <w:webHidden/>
+              </w:rPr>
+              <w:fldChar w:fldCharType="separate"/>
+            </w:r>
+            <w:r>
+              <w:rPr>
+                <w:noProof/>
+                <w:webHidden/>
+              </w:rPr>
+              <w:t>14</w:t>
+            </w:r>
+            <w:r>
+              <w:rPr>
+                <w:noProof/>
+                <w:webHidden/>
+              </w:rPr>
+              <w:fldChar w:fldCharType="end"/>
+            </w:r>
+          </w:hyperlink>
+        </w:p>
+        <w:p>
+          <w:pPr>
+            <w:pStyle w:val="Sommario2"/>
+            <w:tabs>
+              <w:tab w:val="right" w:leader="dot" w:pos="9628"/>
+            </w:tabs>
+            <w:rPr>
+              <w:noProof/>
+            </w:rPr>
+          </w:pPr>
+          <w:hyperlink w:anchor="_Toc199316959" w:history="1">
+            <w:r>
+              <w:rPr>
+                <w:rStyle w:val="Collegamentoipertestuale"/>
+                <w:noProof/>
+              </w:rPr>
+              <w:t>Visualizzare pagina Catalogo</w:t>
+            </w:r>
+            <w:r>
+              <w:rPr>
+                <w:noProof/>
+                <w:webHidden/>
+              </w:rPr>
+              <w:tab/>
+            </w:r>
+            <w:r>
+              <w:rPr>
+                <w:noProof/>
+                <w:webHidden/>
+              </w:rPr>
+              <w:fldChar w:fldCharType="begin"/>
+            </w:r>
+            <w:r>
+              <w:rPr>
+                <w:noProof/>
+                <w:webHidden/>
+              </w:rPr>
+              <w:instrText xml:space="preserve"> PAGEREF _Toc199316959 \h </w:instrText>
+            </w:r>
+            <w:r>
+              <w:rPr>
+                <w:noProof/>
+                <w:webHidden/>
+              </w:rPr>
+            </w:r>
+            <w:r>
+              <w:rPr>
+                <w:noProof/>
+                <w:webHidden/>
+              </w:rPr>
+              <w:fldChar w:fldCharType="separate"/>
+            </w:r>
+            <w:r>
+              <w:rPr>
+                <w:noProof/>
+                <w:webHidden/>
+              </w:rPr>
+              <w:t>14</w:t>
+            </w:r>
+            <w:r>
+              <w:rPr>
+                <w:noProof/>
+                <w:webHidden/>
+              </w:rPr>
+              <w:fldChar w:fldCharType="end"/>
+            </w:r>
+          </w:hyperlink>
+        </w:p>
+        <w:p>
+          <w:pPr>
+            <w:pStyle w:val="Sommario2"/>
+            <w:tabs>
+              <w:tab w:val="right" w:leader="dot" w:pos="9628"/>
+            </w:tabs>
+            <w:rPr>
+              <w:noProof/>
+            </w:rPr>
+          </w:pPr>
+          <w:hyperlink w:anchor="_Toc199316960" w:history="1">
+            <w:r>
+              <w:rPr>
+                <w:rStyle w:val="Collegamentoipertestuale"/>
+                <w:noProof/>
+              </w:rPr>
+              <w:t>Visualizzare pagina Prodotto Specifico</w:t>
+            </w:r>
+            <w:r>
+              <w:rPr>
+                <w:noProof/>
+                <w:webHidden/>
+              </w:rPr>
+              <w:tab/>
+            </w:r>
+            <w:r>
+              <w:rPr>
+                <w:noProof/>
+                <w:webHidden/>
+              </w:rPr>
+              <w:fldChar w:fldCharType="begin"/>
+            </w:r>
+            <w:r>
+              <w:rPr>
+                <w:noProof/>
+                <w:webHidden/>
+              </w:rPr>
+              <w:instrText xml:space="preserve"> PAGEREF _Toc199316960 \h </w:instrText>
+            </w:r>
+            <w:r>
+              <w:rPr>
+                <w:noProof/>
+                <w:webHidden/>
+              </w:rPr>
+            </w:r>
+            <w:r>
+              <w:rPr>
+                <w:noProof/>
+                <w:webHidden/>
+              </w:rPr>
+              <w:fldChar w:fldCharType="separate"/>
+            </w:r>
+            <w:r>
+              <w:rPr>
+                <w:noProof/>
+                <w:webHidden/>
+              </w:rPr>
+              <w:t>14</w:t>
+            </w:r>
+            <w:r>
+              <w:rPr>
+                <w:noProof/>
+                <w:webHidden/>
+              </w:rPr>
+              <w:fldChar w:fldCharType="end"/>
+            </w:r>
+          </w:hyperlink>
+        </w:p>
+        <w:p>
+          <w:r>
+            <w:rPr>
+              <w:b/>
+              <w:bCs/>
+              <w:noProof/>
+              <w:lang w:val="it-IT"/>
+            </w:rPr>
+            <w:fldChar w:fldCharType="end"/>
+          </w:r>
         </w:p>
       </w:sdtContent>
     </w:sdt>
@@ -602,6 +2511,7 @@
           <w:u w:val="single"/>
         </w:rPr>
       </w:pPr>
+      <w:bookmarkStart w:id="0" w:name="_Toc199316933"/>
       <w:r>
         <w:rPr>
           <w:u w:val="single"/>
@@ -609,6 +2519,7 @@
         <w:lastRenderedPageBreak/>
         <w:t>Progettazione</w:t>
       </w:r>
+      <w:bookmarkEnd w:id="0"/>
     </w:p>
     <w:p>
       <w:pPr>
@@ -617,12 +2528,14 @@
           <w:u w:val="single"/>
         </w:rPr>
       </w:pPr>
+      <w:bookmarkStart w:id="1" w:name="_Toc199316934"/>
       <w:r>
         <w:rPr>
           <w:u w:val="single"/>
         </w:rPr>
         <w:t>Architettura</w:t>
       </w:r>
+      <w:bookmarkEnd w:id="1"/>
     </w:p>
     <w:p>
       <w:pPr>
@@ -784,10 +2697,12 @@
       <w:pPr>
         <w:pStyle w:val="Titolo2"/>
       </w:pPr>
+      <w:bookmarkStart w:id="2" w:name="_Toc199316935"/>
       <w:proofErr w:type="spellStart"/>
       <w:r>
         <w:t>Swimlanes</w:t>
       </w:r>
+      <w:bookmarkEnd w:id="2"/>
       <w:proofErr w:type="spellEnd"/>
     </w:p>
     <w:p>
@@ -797,12 +2712,14 @@
           <w:u w:val="single"/>
         </w:rPr>
       </w:pPr>
+      <w:bookmarkStart w:id="3" w:name="_Toc199316936"/>
       <w:r>
         <w:rPr>
           <w:u w:val="single"/>
         </w:rPr>
         <w:t>Cliente – Login</w:t>
       </w:r>
+      <w:bookmarkEnd w:id="3"/>
     </w:p>
     <w:p>
       <w:r>
@@ -877,6 +2794,7 @@
           <w:u w:val="single"/>
         </w:rPr>
       </w:pPr>
+      <w:bookmarkStart w:id="4" w:name="_Toc199316937"/>
       <w:r>
         <w:rPr>
           <w:u w:val="single"/>
@@ -884,6 +2802,7 @@
         <w:lastRenderedPageBreak/>
         <w:t>Cliente – Creazione Utente</w:t>
       </w:r>
+      <w:bookmarkEnd w:id="4"/>
     </w:p>
     <w:p>
       <w:pPr>
@@ -975,6 +2894,7 @@
           <w:u w:val="single"/>
         </w:rPr>
       </w:pPr>
+      <w:bookmarkStart w:id="5" w:name="_Toc199316938"/>
       <w:r>
         <w:rPr>
           <w:u w:val="single"/>
@@ -982,6 +2902,7 @@
         <w:lastRenderedPageBreak/>
         <w:t>Cliente – Acquisto prodotti</w:t>
       </w:r>
+      <w:bookmarkEnd w:id="5"/>
     </w:p>
     <w:p>
       <w:r>
@@ -1053,6 +2974,7 @@
           <w:u w:val="single"/>
         </w:rPr>
       </w:pPr>
+      <w:bookmarkStart w:id="6" w:name="_Toc199316939"/>
       <w:r>
         <w:rPr>
           <w:u w:val="single"/>
@@ -1071,6 +2993,7 @@
         </w:rPr>
         <w:t xml:space="preserve"> Login</w:t>
       </w:r>
+      <w:bookmarkEnd w:id="6"/>
     </w:p>
     <w:p>
       <w:r>
@@ -1145,6 +3068,7 @@
           <w:u w:val="single"/>
         </w:rPr>
       </w:pPr>
+      <w:bookmarkStart w:id="7" w:name="_Toc199316940"/>
       <w:r>
         <w:rPr>
           <w:u w:val="single"/>
@@ -1152,6 +3076,7 @@
         <w:lastRenderedPageBreak/>
         <w:t>Vendor – Gestione prodotti</w:t>
       </w:r>
+      <w:bookmarkEnd w:id="7"/>
     </w:p>
     <w:p>
       <w:r>
@@ -1235,6 +3160,7 @@
           <w:u w:val="single"/>
         </w:rPr>
       </w:pPr>
+      <w:bookmarkStart w:id="8" w:name="_Toc199316941"/>
       <w:r>
         <w:rPr>
           <w:u w:val="single"/>
@@ -1242,6 +3168,7 @@
         <w:lastRenderedPageBreak/>
         <w:t>Admin – Login</w:t>
       </w:r>
+      <w:bookmarkEnd w:id="8"/>
     </w:p>
     <w:p>
       <w:r>
@@ -1313,11 +3240,19 @@
           <w:u w:val="single"/>
         </w:rPr>
       </w:pPr>
+      <w:bookmarkStart w:id="9" w:name="_Toc199316942"/>
       <w:r>
         <w:rPr>
           <w:u w:val="single"/>
         </w:rPr>
-        <w:t xml:space="preserve">Admin – Gestione Utenti </w:t>
+        <w:t>Admin – Gestione Utenti</w:t>
+      </w:r>
+      <w:bookmarkEnd w:id="9"/>
+      <w:r>
+        <w:rPr>
+          <w:u w:val="single"/>
+        </w:rPr>
+        <w:t xml:space="preserve"> </w:t>
       </w:r>
     </w:p>
     <w:p>
@@ -1391,6 +3326,7 @@
           <w:u w:val="single"/>
         </w:rPr>
       </w:pPr>
+      <w:bookmarkStart w:id="10" w:name="_Toc199316943"/>
       <w:r>
         <w:rPr>
           <w:u w:val="single"/>
@@ -1405,6 +3341,7 @@
         </w:rPr>
         <w:t>Diagram</w:t>
       </w:r>
+      <w:bookmarkEnd w:id="10"/>
       <w:proofErr w:type="spellEnd"/>
     </w:p>
     <w:p>
@@ -1490,6 +3427,7 @@
           <w:u w:val="single"/>
         </w:rPr>
       </w:pPr>
+      <w:bookmarkStart w:id="11" w:name="_Toc199316944"/>
       <w:r>
         <w:rPr>
           <w:u w:val="single"/>
@@ -1497,6 +3435,7 @@
         <w:lastRenderedPageBreak/>
         <w:t>GUI</w:t>
       </w:r>
+      <w:bookmarkEnd w:id="11"/>
     </w:p>
     <w:p>
       <w:pPr>
@@ -1505,6 +3444,7 @@
           <w:u w:val="single"/>
         </w:rPr>
       </w:pPr>
+      <w:bookmarkStart w:id="12" w:name="_Toc199316945"/>
       <w:r>
         <w:rPr>
           <w:u w:val="single"/>
@@ -1531,6 +3471,7 @@
         </w:rPr>
         <w:t xml:space="preserve"> login)</w:t>
       </w:r>
+      <w:bookmarkEnd w:id="12"/>
     </w:p>
     <w:p>
       <w:r>
@@ -1608,12 +3549,14 @@
           <w:u w:val="single"/>
         </w:rPr>
       </w:pPr>
+      <w:bookmarkStart w:id="13" w:name="_Toc199316946"/>
       <w:r>
         <w:rPr>
           <w:u w:val="single"/>
         </w:rPr>
         <w:t>Home (with login)</w:t>
       </w:r>
+      <w:bookmarkEnd w:id="13"/>
     </w:p>
     <w:p>
       <w:r>
@@ -1693,6 +3636,7 @@
           <w:u w:val="single"/>
         </w:rPr>
       </w:pPr>
+      <w:bookmarkStart w:id="14" w:name="_Toc199316947"/>
       <w:r>
         <w:rPr>
           <w:u w:val="single"/>
@@ -1700,6 +3644,7 @@
         <w:lastRenderedPageBreak/>
         <w:t>Catalogo</w:t>
       </w:r>
+      <w:bookmarkEnd w:id="14"/>
     </w:p>
     <w:p>
       <w:r>
@@ -1771,12 +3716,14 @@
           <w:u w:val="single"/>
         </w:rPr>
       </w:pPr>
+      <w:bookmarkStart w:id="15" w:name="_Toc199316948"/>
       <w:r>
         <w:rPr>
           <w:u w:val="single"/>
         </w:rPr>
         <w:t>Registrazione</w:t>
       </w:r>
+      <w:bookmarkEnd w:id="15"/>
     </w:p>
     <w:p>
       <w:r>
@@ -1858,6 +3805,7 @@
           <w:u w:val="single"/>
         </w:rPr>
       </w:pPr>
+      <w:bookmarkStart w:id="16" w:name="_Toc199316949"/>
       <w:r>
         <w:rPr>
           <w:u w:val="single"/>
@@ -1865,6 +3813,7 @@
         <w:lastRenderedPageBreak/>
         <w:t>Login</w:t>
       </w:r>
+      <w:bookmarkEnd w:id="16"/>
     </w:p>
     <w:p>
       <w:r>
@@ -1937,12 +3886,14 @@
           <w:u w:val="single"/>
         </w:rPr>
       </w:pPr>
+      <w:bookmarkStart w:id="17" w:name="_Toc199316950"/>
       <w:r>
         <w:rPr>
           <w:u w:val="single"/>
         </w:rPr>
         <w:t>Prodotto</w:t>
       </w:r>
+      <w:bookmarkEnd w:id="17"/>
     </w:p>
     <w:p>
       <w:r>
@@ -2031,6 +3982,7 @@
           <w:u w:val="single"/>
         </w:rPr>
       </w:pPr>
+      <w:bookmarkStart w:id="18" w:name="_Toc199316951"/>
       <w:r>
         <w:rPr>
           <w:u w:val="single"/>
@@ -2038,6 +3990,7 @@
         <w:lastRenderedPageBreak/>
         <w:t>Amministrazione</w:t>
       </w:r>
+      <w:bookmarkEnd w:id="18"/>
     </w:p>
     <w:p>
       <w:r>
@@ -2140,12 +4093,14 @@
           <w:u w:val="single"/>
         </w:rPr>
       </w:pPr>
+      <w:bookmarkStart w:id="19" w:name="_Toc199316952"/>
       <w:r>
         <w:rPr>
           <w:u w:val="single"/>
         </w:rPr>
         <w:t>Vendor – Prodotti</w:t>
       </w:r>
+      <w:bookmarkEnd w:id="19"/>
     </w:p>
     <w:p>
       <w:r>
@@ -2225,6 +4180,7 @@
           <w:u w:val="single"/>
         </w:rPr>
       </w:pPr>
+      <w:bookmarkStart w:id="20" w:name="_Toc199316953"/>
       <w:r>
         <w:rPr>
           <w:u w:val="single"/>
@@ -2232,6 +4188,7 @@
         <w:lastRenderedPageBreak/>
         <w:t>Vendor – Vendite</w:t>
       </w:r>
+      <w:bookmarkEnd w:id="20"/>
     </w:p>
     <w:p>
       <w:r>
@@ -2314,12 +4271,14 @@
           <w:u w:val="single"/>
         </w:rPr>
       </w:pPr>
+      <w:bookmarkStart w:id="21" w:name="_Toc199316954"/>
       <w:r>
         <w:rPr>
           <w:u w:val="single"/>
         </w:rPr>
         <w:t>Impostazioni</w:t>
       </w:r>
+      <w:bookmarkEnd w:id="21"/>
     </w:p>
     <w:p>
       <w:r>
@@ -2394,6 +4353,7 @@
           <w:u w:val="single"/>
         </w:rPr>
       </w:pPr>
+      <w:bookmarkStart w:id="22" w:name="_Toc199316955"/>
       <w:proofErr w:type="spellStart"/>
       <w:r>
         <w:rPr>
@@ -2402,6 +4362,7 @@
         <w:lastRenderedPageBreak/>
         <w:t>Gannt</w:t>
       </w:r>
+      <w:bookmarkEnd w:id="22"/>
       <w:proofErr w:type="spellEnd"/>
     </w:p>
     <w:p>
@@ -2565,13 +4526,8 @@
           <w:numId w:val="3"/>
         </w:numPr>
       </w:pPr>
-      <w:proofErr w:type="spellStart"/>
-      <w:r>
-        <w:t>Swimlane</w:t>
-      </w:r>
-      <w:proofErr w:type="spellEnd"/>
-      <w:r>
-        <w:t xml:space="preserve"> </w:t>
+      <w:r>
+        <w:t xml:space="preserve">Swimlane </w:t>
       </w:r>
       <w:proofErr w:type="spellStart"/>
       <w:r>
@@ -2652,13 +4608,8 @@
           <w:numId w:val="4"/>
         </w:numPr>
       </w:pPr>
-      <w:proofErr w:type="spellStart"/>
-      <w:r>
-        <w:t>OAuth</w:t>
-      </w:r>
-      <w:proofErr w:type="spellEnd"/>
-      <w:r>
-        <w:t xml:space="preserve"> 2.0</w:t>
+      <w:r>
+        <w:t>OAuth 2.0</w:t>
       </w:r>
     </w:p>
     <w:p>
@@ -2803,78 +4754,973 @@
     <w:p>
       <w:pPr>
         <w:pStyle w:val="Titolo1"/>
-        <w:rPr>
-          <w:u w:val="single"/>
-        </w:rPr>
-      </w:pPr>
-      <w:r>
-        <w:rPr>
-          <w:u w:val="single"/>
-        </w:rPr>
+      </w:pPr>
+      <w:bookmarkStart w:id="23" w:name="_Toc199316956"/>
+      <w:r>
         <w:lastRenderedPageBreak/>
         <w:t>Implementazione</w:t>
       </w:r>
+      <w:bookmarkEnd w:id="23"/>
+    </w:p>
+    <w:p>
+      <w:r>
+        <w:t>Per</w:t>
+      </w:r>
+      <w:r>
+        <w:t xml:space="preserve"> la parte di implementazione è stato creato il progetto ed è</w:t>
+      </w:r>
+      <w:r>
+        <w:t xml:space="preserve"> stata implementata una semplice navigazione nelle pagine</w:t>
+      </w:r>
+      <w:r>
+        <w:t>.</w:t>
+      </w:r>
     </w:p>
     <w:p>
       <w:pPr>
         <w:pStyle w:val="Titolo2"/>
-        <w:rPr>
-          <w:u w:val="single"/>
-        </w:rPr>
-      </w:pPr>
-      <w:r>
-        <w:rPr>
-          <w:u w:val="single"/>
-        </w:rPr>
-        <w:t>Visualizzare pagina Home</w:t>
-      </w:r>
-    </w:p>
-    <w:p/>
+      </w:pPr>
+      <w:r>
+        <w:t>Inizializzazion</w:t>
+      </w:r>
+      <w:r>
+        <w:t>e</w:t>
+      </w:r>
+      <w:r>
+        <w:t xml:space="preserve"> progetto</w:t>
+      </w:r>
+    </w:p>
+    <w:p>
+      <w:pPr>
+        <w:pStyle w:val="Paragrafoelenco"/>
+        <w:numPr>
+          <w:ilvl w:val="0"/>
+          <w:numId w:val="6"/>
+        </w:numPr>
+      </w:pPr>
+      <w:r>
+        <w:t>Da terminale accedere alla directory del progetto</w:t>
+      </w:r>
+      <w:r>
+        <w:t xml:space="preserve"> e</w:t>
+      </w:r>
+      <w:r>
+        <w:t xml:space="preserve"> creare il progetto col seguente comando</w:t>
+      </w:r>
+      <w:r>
+        <w:t>:</w:t>
+      </w:r>
+    </w:p>
+    <w:p>
+      <w:pPr>
+        <w:pStyle w:val="Paragrafoelenco"/>
+        <w:numPr>
+          <w:ilvl w:val="1"/>
+          <w:numId w:val="6"/>
+        </w:numPr>
+        <w:rPr>
+          <w:lang w:val="fr-CH"/>
+        </w:rPr>
+      </w:pPr>
+      <w:r>
+        <w:rPr>
+          <w:lang w:val="fr-CH"/>
+        </w:rPr>
+        <w:t xml:space="preserve">composer </w:t>
+      </w:r>
+      <w:proofErr w:type="spellStart"/>
+      <w:r>
+        <w:rPr>
+          <w:lang w:val="fr-CH"/>
+        </w:rPr>
+        <w:t>create-project</w:t>
+      </w:r>
+      <w:proofErr w:type="spellEnd"/>
+      <w:r>
+        <w:rPr>
+          <w:lang w:val="fr-CH"/>
+        </w:rPr>
+        <w:t xml:space="preserve"> </w:t>
+      </w:r>
+      <w:proofErr w:type="spellStart"/>
+      <w:r>
+        <w:rPr>
+          <w:lang w:val="fr-CH"/>
+        </w:rPr>
+        <w:t>laravel</w:t>
+      </w:r>
+      <w:proofErr w:type="spellEnd"/>
+      <w:r>
+        <w:rPr>
+          <w:lang w:val="fr-CH"/>
+        </w:rPr>
+        <w:t>/</w:t>
+      </w:r>
+      <w:proofErr w:type="spellStart"/>
+      <w:r>
+        <w:rPr>
+          <w:lang w:val="fr-CH"/>
+        </w:rPr>
+        <w:t>laravel</w:t>
+      </w:r>
+      <w:proofErr w:type="spellEnd"/>
+      <w:r>
+        <w:rPr>
+          <w:lang w:val="fr-CH"/>
+        </w:rPr>
+        <w:t xml:space="preserve"> </w:t>
+      </w:r>
+      <w:r>
+        <w:rPr>
+          <w:lang w:val="fr-CH"/>
+        </w:rPr>
+        <w:t>Fyt</w:t>
+      </w:r>
+    </w:p>
+    <w:p>
+      <w:pPr>
+        <w:pStyle w:val="Paragrafoelenco"/>
+        <w:numPr>
+          <w:ilvl w:val="0"/>
+          <w:numId w:val="6"/>
+        </w:numPr>
+      </w:pPr>
+      <w:r>
+        <w:t>Entrare nella directory</w:t>
+      </w:r>
+      <w:r>
+        <w:t xml:space="preserve"> e avviare localmente</w:t>
+      </w:r>
+      <w:r>
+        <w:t>:</w:t>
+      </w:r>
+    </w:p>
+    <w:p>
+      <w:pPr>
+        <w:pStyle w:val="Paragrafoelenco"/>
+        <w:numPr>
+          <w:ilvl w:val="1"/>
+          <w:numId w:val="6"/>
+        </w:numPr>
+        <w:rPr>
+          <w:lang w:val="fr-CH"/>
+        </w:rPr>
+      </w:pPr>
+      <w:r>
+        <w:rPr>
+          <w:lang w:val="fr-CH"/>
+        </w:rPr>
+        <w:t>cd Fyt</w:t>
+      </w:r>
+    </w:p>
+    <w:p>
+      <w:pPr>
+        <w:pStyle w:val="Paragrafoelenco"/>
+        <w:numPr>
+          <w:ilvl w:val="1"/>
+          <w:numId w:val="6"/>
+        </w:numPr>
+        <w:rPr>
+          <w:lang w:val="fr-CH"/>
+        </w:rPr>
+      </w:pPr>
+      <w:proofErr w:type="spellStart"/>
+      <w:r>
+        <w:rPr>
+          <w:lang w:val="fr-CH"/>
+        </w:rPr>
+        <w:t>php</w:t>
+      </w:r>
+      <w:proofErr w:type="spellEnd"/>
+      <w:r>
+        <w:rPr>
+          <w:lang w:val="fr-CH"/>
+        </w:rPr>
+        <w:t xml:space="preserve"> artisan serve</w:t>
+      </w:r>
+    </w:p>
     <w:p>
       <w:pPr>
         <w:pStyle w:val="Titolo2"/>
-        <w:rPr>
-          <w:u w:val="single"/>
-        </w:rPr>
-      </w:pPr>
-      <w:r>
-        <w:rPr>
-          <w:u w:val="single"/>
-        </w:rPr>
-        <w:t>Visualizzare pagina Login</w:t>
-      </w:r>
-    </w:p>
-    <w:p/>
-    <w:p>
-      <w:pPr>
-        <w:pStyle w:val="Titolo2"/>
-        <w:rPr>
-          <w:u w:val="single"/>
-        </w:rPr>
-      </w:pPr>
-      <w:r>
-        <w:rPr>
-          <w:u w:val="single"/>
-        </w:rPr>
-        <w:t>Visualizzare pagina Catalogo</w:t>
-      </w:r>
-    </w:p>
-    <w:p/>
-    <w:p>
-      <w:pPr>
-        <w:pStyle w:val="Titolo2"/>
-        <w:rPr>
-          <w:u w:val="single"/>
-        </w:rPr>
-      </w:pPr>
-      <w:r>
-        <w:rPr>
-          <w:u w:val="single"/>
-        </w:rPr>
-        <w:t>Visualizzare pagina Prodotto Specifico</w:t>
-      </w:r>
-    </w:p>
-    <w:p/>
+      </w:pPr>
+      <w:r>
+        <w:t>Navigazione pagine</w:t>
+      </w:r>
+    </w:p>
+    <w:p>
+      <w:pPr>
+        <w:pStyle w:val="Paragrafoelenco"/>
+        <w:numPr>
+          <w:ilvl w:val="0"/>
+          <w:numId w:val="7"/>
+        </w:numPr>
+      </w:pPr>
+      <w:r>
+        <w:t>Prima di tutto bisogna creare le rotte delle pagine per permettere la restituzione delle pagine</w:t>
+      </w:r>
+      <w:r>
+        <w:t xml:space="preserve"> (</w:t>
+      </w:r>
+      <w:r>
+        <w:t xml:space="preserve">nel file </w:t>
+      </w:r>
+      <w:proofErr w:type="spellStart"/>
+      <w:r>
+        <w:t>routes</w:t>
+      </w:r>
+      <w:proofErr w:type="spellEnd"/>
+      <w:r>
+        <w:t>/</w:t>
+      </w:r>
+      <w:proofErr w:type="spellStart"/>
+      <w:r>
+        <w:t>web.php</w:t>
+      </w:r>
+      <w:proofErr w:type="spellEnd"/>
+      <w:r>
+        <w:t>)</w:t>
+      </w:r>
+    </w:p>
+    <w:p>
+      <w:pPr>
+        <w:jc w:val="center"/>
+      </w:pPr>
+      <w:r>
+        <w:rPr>
+          <w:noProof/>
+        </w:rPr>
+        <mc:AlternateContent>
+          <mc:Choice Requires="wps">
+            <w:drawing>
+              <wp:inline distT="0" distB="0" distL="0" distR="0" wp14:anchorId="583C67E6" wp14:editId="10857D8B">
+                <wp:extent cx="2429934" cy="745067"/>
+                <wp:effectExtent l="0" t="0" r="27940" b="17145"/>
+                <wp:docPr id="2" name="Casella di testo 2"/>
+                <wp:cNvGraphicFramePr/>
+                <a:graphic xmlns:a="http://schemas.openxmlformats.org/drawingml/2006/main">
+                  <a:graphicData uri="http://schemas.microsoft.com/office/word/2010/wordprocessingShape">
+                    <wps:wsp>
+                      <wps:cNvSpPr txBox="1"/>
+                      <wps:spPr>
+                        <a:xfrm>
+                          <a:off x="0" y="0"/>
+                          <a:ext cx="2429934" cy="745067"/>
+                        </a:xfrm>
+                        <a:prstGeom prst="rect">
+                          <a:avLst/>
+                        </a:prstGeom>
+                        <a:solidFill>
+                          <a:schemeClr val="lt1"/>
+                        </a:solidFill>
+                        <a:ln w="6350">
+                          <a:solidFill>
+                            <a:prstClr val="black"/>
+                          </a:solidFill>
+                        </a:ln>
+                      </wps:spPr>
+                      <wps:txbx>
+                        <w:txbxContent>
+                          <w:p>
+                            <w:pPr>
+                              <w:shd w:val="clear" w:color="auto" w:fill="141322"/>
+                              <w:spacing w:after="0" w:line="285" w:lineRule="atLeast"/>
+                              <w:rPr>
+                                <w:rFonts w:ascii="Consolas" w:eastAsia="Times New Roman" w:hAnsi="Consolas" w:cs="Times New Roman"/>
+                                <w:color w:val="94B4C4"/>
+                                <w:sz w:val="21"/>
+                                <w:szCs w:val="21"/>
+                                <w:lang w:val="fr-CH" w:eastAsia="it-CH"/>
+                              </w:rPr>
+                            </w:pPr>
+                            <w:proofErr w:type="gramStart"/>
+                            <w:r>
+                              <w:rPr>
+                                <w:rFonts w:ascii="Consolas" w:eastAsia="Times New Roman" w:hAnsi="Consolas" w:cs="Times New Roman"/>
+                                <w:color w:val="7CB3B6"/>
+                                <w:sz w:val="21"/>
+                                <w:szCs w:val="21"/>
+                                <w:lang w:val="fr-CH" w:eastAsia="it-CH"/>
+                              </w:rPr>
+                              <w:t>Route</w:t>
+                            </w:r>
+                            <w:r>
+                              <w:rPr>
+                                <w:rFonts w:ascii="Consolas" w:eastAsia="Times New Roman" w:hAnsi="Consolas" w:cs="Times New Roman"/>
+                                <w:color w:val="FE8DA5"/>
+                                <w:sz w:val="21"/>
+                                <w:szCs w:val="21"/>
+                                <w:lang w:val="fr-CH" w:eastAsia="it-CH"/>
+                              </w:rPr>
+                              <w:t>::</w:t>
+                            </w:r>
+                            <w:proofErr w:type="spellStart"/>
+                            <w:proofErr w:type="gramEnd"/>
+                            <w:r>
+                              <w:rPr>
+                                <w:rFonts w:ascii="Consolas" w:eastAsia="Times New Roman" w:hAnsi="Consolas" w:cs="Times New Roman"/>
+                                <w:color w:val="8CE1E7"/>
+                                <w:sz w:val="21"/>
+                                <w:szCs w:val="21"/>
+                                <w:lang w:val="fr-CH" w:eastAsia="it-CH"/>
+                              </w:rPr>
+                              <w:t>get</w:t>
+                            </w:r>
+                            <w:proofErr w:type="spellEnd"/>
+                            <w:r>
+                              <w:rPr>
+                                <w:rFonts w:ascii="Consolas" w:eastAsia="Times New Roman" w:hAnsi="Consolas" w:cs="Times New Roman"/>
+                                <w:color w:val="94B4C4"/>
+                                <w:sz w:val="21"/>
+                                <w:szCs w:val="21"/>
+                                <w:lang w:val="fr-CH" w:eastAsia="it-CH"/>
+                              </w:rPr>
+                              <w:t>(</w:t>
+                            </w:r>
+                            <w:r>
+                              <w:rPr>
+                                <w:rFonts w:ascii="Consolas" w:eastAsia="Times New Roman" w:hAnsi="Consolas" w:cs="Times New Roman"/>
+                                <w:color w:val="A9FEF7"/>
+                                <w:sz w:val="21"/>
+                                <w:szCs w:val="21"/>
+                                <w:lang w:val="fr-CH" w:eastAsia="it-CH"/>
+                              </w:rPr>
+                              <w:t>'/'</w:t>
+                            </w:r>
+                            <w:r>
+                              <w:rPr>
+                                <w:rFonts w:ascii="Consolas" w:eastAsia="Times New Roman" w:hAnsi="Consolas" w:cs="Times New Roman"/>
+                                <w:color w:val="94B4C4"/>
+                                <w:sz w:val="21"/>
+                                <w:szCs w:val="21"/>
+                                <w:lang w:val="fr-CH" w:eastAsia="it-CH"/>
+                              </w:rPr>
+                              <w:t xml:space="preserve">, </w:t>
+                            </w:r>
+                            <w:proofErr w:type="spellStart"/>
+                            <w:r>
+                              <w:rPr>
+                                <w:rFonts w:ascii="Consolas" w:eastAsia="Times New Roman" w:hAnsi="Consolas" w:cs="Times New Roman"/>
+                                <w:color w:val="FB4293"/>
+                                <w:sz w:val="21"/>
+                                <w:szCs w:val="21"/>
+                                <w:lang w:val="fr-CH" w:eastAsia="it-CH"/>
+                              </w:rPr>
+                              <w:t>function</w:t>
+                            </w:r>
+                            <w:proofErr w:type="spellEnd"/>
+                            <w:r>
+                              <w:rPr>
+                                <w:rFonts w:ascii="Consolas" w:eastAsia="Times New Roman" w:hAnsi="Consolas" w:cs="Times New Roman"/>
+                                <w:color w:val="94B4C4"/>
+                                <w:sz w:val="21"/>
+                                <w:szCs w:val="21"/>
+                                <w:lang w:val="fr-CH" w:eastAsia="it-CH"/>
+                              </w:rPr>
+                              <w:t xml:space="preserve"> () {</w:t>
+                            </w:r>
+                          </w:p>
+                          <w:p>
+                            <w:pPr>
+                              <w:shd w:val="clear" w:color="auto" w:fill="141322"/>
+                              <w:spacing w:after="0" w:line="285" w:lineRule="atLeast"/>
+                              <w:rPr>
+                                <w:rFonts w:ascii="Consolas" w:eastAsia="Times New Roman" w:hAnsi="Consolas" w:cs="Times New Roman"/>
+                                <w:color w:val="94B4C4"/>
+                                <w:sz w:val="21"/>
+                                <w:szCs w:val="21"/>
+                                <w:lang w:val="fr-CH" w:eastAsia="it-CH"/>
+                              </w:rPr>
+                            </w:pPr>
+                            <w:r>
+                              <w:rPr>
+                                <w:rFonts w:ascii="Consolas" w:eastAsia="Times New Roman" w:hAnsi="Consolas" w:cs="Times New Roman"/>
+                                <w:color w:val="94B4C4"/>
+                                <w:sz w:val="21"/>
+                                <w:szCs w:val="21"/>
+                                <w:lang w:val="fr-CH" w:eastAsia="it-CH"/>
+                              </w:rPr>
+                              <w:t xml:space="preserve">    </w:t>
+                            </w:r>
+                            <w:r>
+                              <w:rPr>
+                                <w:rFonts w:ascii="Consolas" w:eastAsia="Times New Roman" w:hAnsi="Consolas" w:cs="Times New Roman"/>
+                                <w:color w:val="FB4293"/>
+                                <w:sz w:val="21"/>
+                                <w:szCs w:val="21"/>
+                                <w:lang w:val="fr-CH" w:eastAsia="it-CH"/>
+                              </w:rPr>
+                              <w:t>return</w:t>
+                            </w:r>
+                            <w:r>
+                              <w:rPr>
+                                <w:rFonts w:ascii="Consolas" w:eastAsia="Times New Roman" w:hAnsi="Consolas" w:cs="Times New Roman"/>
+                                <w:color w:val="94B4C4"/>
+                                <w:sz w:val="21"/>
+                                <w:szCs w:val="21"/>
+                                <w:lang w:val="fr-CH" w:eastAsia="it-CH"/>
+                              </w:rPr>
+                              <w:t xml:space="preserve"> </w:t>
+                            </w:r>
+                            <w:proofErr w:type="spellStart"/>
+                            <w:r>
+                              <w:rPr>
+                                <w:rFonts w:ascii="Consolas" w:eastAsia="Times New Roman" w:hAnsi="Consolas" w:cs="Times New Roman"/>
+                                <w:color w:val="8CE1E7"/>
+                                <w:sz w:val="21"/>
+                                <w:szCs w:val="21"/>
+                                <w:lang w:val="fr-CH" w:eastAsia="it-CH"/>
+                              </w:rPr>
+                              <w:t>view</w:t>
+                            </w:r>
+                            <w:proofErr w:type="spellEnd"/>
+                            <w:r>
+                              <w:rPr>
+                                <w:rFonts w:ascii="Consolas" w:eastAsia="Times New Roman" w:hAnsi="Consolas" w:cs="Times New Roman"/>
+                                <w:color w:val="94B4C4"/>
+                                <w:sz w:val="21"/>
+                                <w:szCs w:val="21"/>
+                                <w:lang w:val="fr-CH" w:eastAsia="it-CH"/>
+                              </w:rPr>
+                              <w:t>(</w:t>
+                            </w:r>
+                            <w:r>
+                              <w:rPr>
+                                <w:rFonts w:ascii="Consolas" w:eastAsia="Times New Roman" w:hAnsi="Consolas" w:cs="Times New Roman"/>
+                                <w:color w:val="A9FEF7"/>
+                                <w:sz w:val="21"/>
+                                <w:szCs w:val="21"/>
+                                <w:lang w:val="fr-CH" w:eastAsia="it-CH"/>
+                              </w:rPr>
+                              <w:t>'home'</w:t>
+                            </w:r>
+                            <w:proofErr w:type="gramStart"/>
+                            <w:r>
+                              <w:rPr>
+                                <w:rFonts w:ascii="Consolas" w:eastAsia="Times New Roman" w:hAnsi="Consolas" w:cs="Times New Roman"/>
+                                <w:color w:val="94B4C4"/>
+                                <w:sz w:val="21"/>
+                                <w:szCs w:val="21"/>
+                                <w:lang w:val="fr-CH" w:eastAsia="it-CH"/>
+                              </w:rPr>
+                              <w:t>);</w:t>
+                            </w:r>
+                            <w:proofErr w:type="gramEnd"/>
+                          </w:p>
+                          <w:p>
+                            <w:pPr>
+                              <w:shd w:val="clear" w:color="auto" w:fill="141322"/>
+                              <w:spacing w:after="0" w:line="285" w:lineRule="atLeast"/>
+                              <w:rPr>
+                                <w:rFonts w:ascii="Consolas" w:eastAsia="Times New Roman" w:hAnsi="Consolas" w:cs="Times New Roman"/>
+                                <w:color w:val="94B4C4"/>
+                                <w:sz w:val="21"/>
+                                <w:szCs w:val="21"/>
+                                <w:lang w:val="fr-CH" w:eastAsia="it-CH"/>
+                              </w:rPr>
+                            </w:pPr>
+                            <w:proofErr w:type="gramStart"/>
+                            <w:r>
+                              <w:rPr>
+                                <w:rFonts w:ascii="Consolas" w:eastAsia="Times New Roman" w:hAnsi="Consolas" w:cs="Times New Roman"/>
+                                <w:color w:val="94B4C4"/>
+                                <w:sz w:val="21"/>
+                                <w:szCs w:val="21"/>
+                                <w:lang w:val="fr-CH" w:eastAsia="it-CH"/>
+                              </w:rPr>
+                              <w:t>})</w:t>
+                            </w:r>
+                            <w:r>
+                              <w:rPr>
+                                <w:rFonts w:ascii="Consolas" w:eastAsia="Times New Roman" w:hAnsi="Consolas" w:cs="Times New Roman"/>
+                                <w:color w:val="FE8DA5"/>
+                                <w:sz w:val="21"/>
+                                <w:szCs w:val="21"/>
+                                <w:lang w:val="fr-CH" w:eastAsia="it-CH"/>
+                              </w:rPr>
+                              <w:t>-</w:t>
+                            </w:r>
+                            <w:proofErr w:type="gramEnd"/>
+                            <w:r>
+                              <w:rPr>
+                                <w:rFonts w:ascii="Consolas" w:eastAsia="Times New Roman" w:hAnsi="Consolas" w:cs="Times New Roman"/>
+                                <w:color w:val="FE8DA5"/>
+                                <w:sz w:val="21"/>
+                                <w:szCs w:val="21"/>
+                                <w:lang w:val="fr-CH" w:eastAsia="it-CH"/>
+                              </w:rPr>
+                              <w:t>&gt;</w:t>
+                            </w:r>
+                            <w:proofErr w:type="spellStart"/>
+                            <w:r>
+                              <w:rPr>
+                                <w:rFonts w:ascii="Consolas" w:eastAsia="Times New Roman" w:hAnsi="Consolas" w:cs="Times New Roman"/>
+                                <w:color w:val="8CE1E7"/>
+                                <w:sz w:val="21"/>
+                                <w:szCs w:val="21"/>
+                                <w:lang w:val="fr-CH" w:eastAsia="it-CH"/>
+                              </w:rPr>
+                              <w:t>name</w:t>
+                            </w:r>
+                            <w:proofErr w:type="spellEnd"/>
+                            <w:r>
+                              <w:rPr>
+                                <w:rFonts w:ascii="Consolas" w:eastAsia="Times New Roman" w:hAnsi="Consolas" w:cs="Times New Roman"/>
+                                <w:color w:val="94B4C4"/>
+                                <w:sz w:val="21"/>
+                                <w:szCs w:val="21"/>
+                                <w:lang w:val="fr-CH" w:eastAsia="it-CH"/>
+                              </w:rPr>
+                              <w:t>(</w:t>
+                            </w:r>
+                            <w:r>
+                              <w:rPr>
+                                <w:rFonts w:ascii="Consolas" w:eastAsia="Times New Roman" w:hAnsi="Consolas" w:cs="Times New Roman"/>
+                                <w:color w:val="A9FEF7"/>
+                                <w:sz w:val="21"/>
+                                <w:szCs w:val="21"/>
+                                <w:lang w:val="fr-CH" w:eastAsia="it-CH"/>
+                              </w:rPr>
+                              <w:t>'home'</w:t>
+                            </w:r>
+                            <w:r>
+                              <w:rPr>
+                                <w:rFonts w:ascii="Consolas" w:eastAsia="Times New Roman" w:hAnsi="Consolas" w:cs="Times New Roman"/>
+                                <w:color w:val="94B4C4"/>
+                                <w:sz w:val="21"/>
+                                <w:szCs w:val="21"/>
+                                <w:lang w:val="fr-CH" w:eastAsia="it-CH"/>
+                              </w:rPr>
+                              <w:t>);</w:t>
+                            </w:r>
+                          </w:p>
+                        </w:txbxContent>
+                      </wps:txbx>
+                      <wps:bodyPr rot="0" spcFirstLastPara="0" vertOverflow="overflow" horzOverflow="overflow" vert="horz" wrap="square" lIns="91440" tIns="45720" rIns="91440" bIns="45720" numCol="1" spcCol="0" rtlCol="0" fromWordArt="0" anchor="t" anchorCtr="0" forceAA="0" compatLnSpc="1">
+                        <a:prstTxWarp prst="textNoShape">
+                          <a:avLst/>
+                        </a:prstTxWarp>
+                        <a:noAutofit/>
+                      </wps:bodyPr>
+                    </wps:wsp>
+                  </a:graphicData>
+                </a:graphic>
+              </wp:inline>
+            </w:drawing>
+          </mc:Choice>
+          <mc:Fallback>
+            <w:pict>
+              <v:shape w14:anchorId="583C67E6" id="Casella di testo 2" o:spid="_x0000_s1028" type="#_x0000_t202" style="width:191.35pt;height:58.65pt;visibility:visible;mso-wrap-style:square;mso-left-percent:-10001;mso-top-percent:-10001;mso-position-horizontal:absolute;mso-position-horizontal-relative:char;mso-position-vertical:absolute;mso-position-vertical-relative:line;mso-left-percent:-10001;mso-top-percent:-10001;v-text-anchor:top" o:gfxdata="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" fillcolor="white [3201]" strokeweight=".5pt">
+                <v:textbox>
+                  <w:txbxContent>
+                    <w:p>
+                      <w:pPr>
+                        <w:shd w:val="clear" w:color="auto" w:fill="141322"/>
+                        <w:spacing w:after="0" w:line="285" w:lineRule="atLeast"/>
+                        <w:rPr>
+                          <w:rFonts w:ascii="Consolas" w:eastAsia="Times New Roman" w:hAnsi="Consolas" w:cs="Times New Roman"/>
+                          <w:color w:val="94B4C4"/>
+                          <w:sz w:val="21"/>
+                          <w:szCs w:val="21"/>
+                          <w:lang w:val="fr-CH" w:eastAsia="it-CH"/>
+                        </w:rPr>
+                      </w:pPr>
+                      <w:proofErr w:type="gramStart"/>
+                      <w:r>
+                        <w:rPr>
+                          <w:rFonts w:ascii="Consolas" w:eastAsia="Times New Roman" w:hAnsi="Consolas" w:cs="Times New Roman"/>
+                          <w:color w:val="7CB3B6"/>
+                          <w:sz w:val="21"/>
+                          <w:szCs w:val="21"/>
+                          <w:lang w:val="fr-CH" w:eastAsia="it-CH"/>
+                        </w:rPr>
+                        <w:t>Route</w:t>
+                      </w:r>
+                      <w:r>
+                        <w:rPr>
+                          <w:rFonts w:ascii="Consolas" w:eastAsia="Times New Roman" w:hAnsi="Consolas" w:cs="Times New Roman"/>
+                          <w:color w:val="FE8DA5"/>
+                          <w:sz w:val="21"/>
+                          <w:szCs w:val="21"/>
+                          <w:lang w:val="fr-CH" w:eastAsia="it-CH"/>
+                        </w:rPr>
+                        <w:t>::</w:t>
+                      </w:r>
+                      <w:proofErr w:type="spellStart"/>
+                      <w:proofErr w:type="gramEnd"/>
+                      <w:r>
+                        <w:rPr>
+                          <w:rFonts w:ascii="Consolas" w:eastAsia="Times New Roman" w:hAnsi="Consolas" w:cs="Times New Roman"/>
+                          <w:color w:val="8CE1E7"/>
+                          <w:sz w:val="21"/>
+                          <w:szCs w:val="21"/>
+                          <w:lang w:val="fr-CH" w:eastAsia="it-CH"/>
+                        </w:rPr>
+                        <w:t>get</w:t>
+                      </w:r>
+                      <w:proofErr w:type="spellEnd"/>
+                      <w:r>
+                        <w:rPr>
+                          <w:rFonts w:ascii="Consolas" w:eastAsia="Times New Roman" w:hAnsi="Consolas" w:cs="Times New Roman"/>
+                          <w:color w:val="94B4C4"/>
+                          <w:sz w:val="21"/>
+                          <w:szCs w:val="21"/>
+                          <w:lang w:val="fr-CH" w:eastAsia="it-CH"/>
+                        </w:rPr>
+                        <w:t>(</w:t>
+                      </w:r>
+                      <w:r>
+                        <w:rPr>
+                          <w:rFonts w:ascii="Consolas" w:eastAsia="Times New Roman" w:hAnsi="Consolas" w:cs="Times New Roman"/>
+                          <w:color w:val="A9FEF7"/>
+                          <w:sz w:val="21"/>
+                          <w:szCs w:val="21"/>
+                          <w:lang w:val="fr-CH" w:eastAsia="it-CH"/>
+                        </w:rPr>
+                        <w:t>'/'</w:t>
+                      </w:r>
+                      <w:r>
+                        <w:rPr>
+                          <w:rFonts w:ascii="Consolas" w:eastAsia="Times New Roman" w:hAnsi="Consolas" w:cs="Times New Roman"/>
+                          <w:color w:val="94B4C4"/>
+                          <w:sz w:val="21"/>
+                          <w:szCs w:val="21"/>
+                          <w:lang w:val="fr-CH" w:eastAsia="it-CH"/>
+                        </w:rPr>
+                        <w:t xml:space="preserve">, </w:t>
+                      </w:r>
+                      <w:proofErr w:type="spellStart"/>
+                      <w:r>
+                        <w:rPr>
+                          <w:rFonts w:ascii="Consolas" w:eastAsia="Times New Roman" w:hAnsi="Consolas" w:cs="Times New Roman"/>
+                          <w:color w:val="FB4293"/>
+                          <w:sz w:val="21"/>
+                          <w:szCs w:val="21"/>
+                          <w:lang w:val="fr-CH" w:eastAsia="it-CH"/>
+                        </w:rPr>
+                        <w:t>function</w:t>
+                      </w:r>
+                      <w:proofErr w:type="spellEnd"/>
+                      <w:r>
+                        <w:rPr>
+                          <w:rFonts w:ascii="Consolas" w:eastAsia="Times New Roman" w:hAnsi="Consolas" w:cs="Times New Roman"/>
+                          <w:color w:val="94B4C4"/>
+                          <w:sz w:val="21"/>
+                          <w:szCs w:val="21"/>
+                          <w:lang w:val="fr-CH" w:eastAsia="it-CH"/>
+                        </w:rPr>
+                        <w:t xml:space="preserve"> () {</w:t>
+                      </w:r>
+                    </w:p>
+                    <w:p>
+                      <w:pPr>
+                        <w:shd w:val="clear" w:color="auto" w:fill="141322"/>
+                        <w:spacing w:after="0" w:line="285" w:lineRule="atLeast"/>
+                        <w:rPr>
+                          <w:rFonts w:ascii="Consolas" w:eastAsia="Times New Roman" w:hAnsi="Consolas" w:cs="Times New Roman"/>
+                          <w:color w:val="94B4C4"/>
+                          <w:sz w:val="21"/>
+                          <w:szCs w:val="21"/>
+                          <w:lang w:val="fr-CH" w:eastAsia="it-CH"/>
+                        </w:rPr>
+                      </w:pPr>
+                      <w:r>
+                        <w:rPr>
+                          <w:rFonts w:ascii="Consolas" w:eastAsia="Times New Roman" w:hAnsi="Consolas" w:cs="Times New Roman"/>
+                          <w:color w:val="94B4C4"/>
+                          <w:sz w:val="21"/>
+                          <w:szCs w:val="21"/>
+                          <w:lang w:val="fr-CH" w:eastAsia="it-CH"/>
+                        </w:rPr>
+                        <w:t xml:space="preserve">    </w:t>
+                      </w:r>
+                      <w:r>
+                        <w:rPr>
+                          <w:rFonts w:ascii="Consolas" w:eastAsia="Times New Roman" w:hAnsi="Consolas" w:cs="Times New Roman"/>
+                          <w:color w:val="FB4293"/>
+                          <w:sz w:val="21"/>
+                          <w:szCs w:val="21"/>
+                          <w:lang w:val="fr-CH" w:eastAsia="it-CH"/>
+                        </w:rPr>
+                        <w:t>return</w:t>
+                      </w:r>
+                      <w:r>
+                        <w:rPr>
+                          <w:rFonts w:ascii="Consolas" w:eastAsia="Times New Roman" w:hAnsi="Consolas" w:cs="Times New Roman"/>
+                          <w:color w:val="94B4C4"/>
+                          <w:sz w:val="21"/>
+                          <w:szCs w:val="21"/>
+                          <w:lang w:val="fr-CH" w:eastAsia="it-CH"/>
+                        </w:rPr>
+                        <w:t xml:space="preserve"> </w:t>
+                      </w:r>
+                      <w:proofErr w:type="spellStart"/>
+                      <w:r>
+                        <w:rPr>
+                          <w:rFonts w:ascii="Consolas" w:eastAsia="Times New Roman" w:hAnsi="Consolas" w:cs="Times New Roman"/>
+                          <w:color w:val="8CE1E7"/>
+                          <w:sz w:val="21"/>
+                          <w:szCs w:val="21"/>
+                          <w:lang w:val="fr-CH" w:eastAsia="it-CH"/>
+                        </w:rPr>
+                        <w:t>view</w:t>
+                      </w:r>
+                      <w:proofErr w:type="spellEnd"/>
+                      <w:r>
+                        <w:rPr>
+                          <w:rFonts w:ascii="Consolas" w:eastAsia="Times New Roman" w:hAnsi="Consolas" w:cs="Times New Roman"/>
+                          <w:color w:val="94B4C4"/>
+                          <w:sz w:val="21"/>
+                          <w:szCs w:val="21"/>
+                          <w:lang w:val="fr-CH" w:eastAsia="it-CH"/>
+                        </w:rPr>
+                        <w:t>(</w:t>
+                      </w:r>
+                      <w:r>
+                        <w:rPr>
+                          <w:rFonts w:ascii="Consolas" w:eastAsia="Times New Roman" w:hAnsi="Consolas" w:cs="Times New Roman"/>
+                          <w:color w:val="A9FEF7"/>
+                          <w:sz w:val="21"/>
+                          <w:szCs w:val="21"/>
+                          <w:lang w:val="fr-CH" w:eastAsia="it-CH"/>
+                        </w:rPr>
+                        <w:t>'home'</w:t>
+                      </w:r>
+                      <w:proofErr w:type="gramStart"/>
+                      <w:r>
+                        <w:rPr>
+                          <w:rFonts w:ascii="Consolas" w:eastAsia="Times New Roman" w:hAnsi="Consolas" w:cs="Times New Roman"/>
+                          <w:color w:val="94B4C4"/>
+                          <w:sz w:val="21"/>
+                          <w:szCs w:val="21"/>
+                          <w:lang w:val="fr-CH" w:eastAsia="it-CH"/>
+                        </w:rPr>
+                        <w:t>);</w:t>
+                      </w:r>
+                      <w:proofErr w:type="gramEnd"/>
+                    </w:p>
+                    <w:p>
+                      <w:pPr>
+                        <w:shd w:val="clear" w:color="auto" w:fill="141322"/>
+                        <w:spacing w:after="0" w:line="285" w:lineRule="atLeast"/>
+                        <w:rPr>
+                          <w:rFonts w:ascii="Consolas" w:eastAsia="Times New Roman" w:hAnsi="Consolas" w:cs="Times New Roman"/>
+                          <w:color w:val="94B4C4"/>
+                          <w:sz w:val="21"/>
+                          <w:szCs w:val="21"/>
+                          <w:lang w:val="fr-CH" w:eastAsia="it-CH"/>
+                        </w:rPr>
+                      </w:pPr>
+                      <w:proofErr w:type="gramStart"/>
+                      <w:r>
+                        <w:rPr>
+                          <w:rFonts w:ascii="Consolas" w:eastAsia="Times New Roman" w:hAnsi="Consolas" w:cs="Times New Roman"/>
+                          <w:color w:val="94B4C4"/>
+                          <w:sz w:val="21"/>
+                          <w:szCs w:val="21"/>
+                          <w:lang w:val="fr-CH" w:eastAsia="it-CH"/>
+                        </w:rPr>
+                        <w:t>})</w:t>
+                      </w:r>
+                      <w:r>
+                        <w:rPr>
+                          <w:rFonts w:ascii="Consolas" w:eastAsia="Times New Roman" w:hAnsi="Consolas" w:cs="Times New Roman"/>
+                          <w:color w:val="FE8DA5"/>
+                          <w:sz w:val="21"/>
+                          <w:szCs w:val="21"/>
+                          <w:lang w:val="fr-CH" w:eastAsia="it-CH"/>
+                        </w:rPr>
+                        <w:t>-</w:t>
+                      </w:r>
+                      <w:proofErr w:type="gramEnd"/>
+                      <w:r>
+                        <w:rPr>
+                          <w:rFonts w:ascii="Consolas" w:eastAsia="Times New Roman" w:hAnsi="Consolas" w:cs="Times New Roman"/>
+                          <w:color w:val="FE8DA5"/>
+                          <w:sz w:val="21"/>
+                          <w:szCs w:val="21"/>
+                          <w:lang w:val="fr-CH" w:eastAsia="it-CH"/>
+                        </w:rPr>
+                        <w:t>&gt;</w:t>
+                      </w:r>
+                      <w:proofErr w:type="spellStart"/>
+                      <w:r>
+                        <w:rPr>
+                          <w:rFonts w:ascii="Consolas" w:eastAsia="Times New Roman" w:hAnsi="Consolas" w:cs="Times New Roman"/>
+                          <w:color w:val="8CE1E7"/>
+                          <w:sz w:val="21"/>
+                          <w:szCs w:val="21"/>
+                          <w:lang w:val="fr-CH" w:eastAsia="it-CH"/>
+                        </w:rPr>
+                        <w:t>name</w:t>
+                      </w:r>
+                      <w:proofErr w:type="spellEnd"/>
+                      <w:r>
+                        <w:rPr>
+                          <w:rFonts w:ascii="Consolas" w:eastAsia="Times New Roman" w:hAnsi="Consolas" w:cs="Times New Roman"/>
+                          <w:color w:val="94B4C4"/>
+                          <w:sz w:val="21"/>
+                          <w:szCs w:val="21"/>
+                          <w:lang w:val="fr-CH" w:eastAsia="it-CH"/>
+                        </w:rPr>
+                        <w:t>(</w:t>
+                      </w:r>
+                      <w:r>
+                        <w:rPr>
+                          <w:rFonts w:ascii="Consolas" w:eastAsia="Times New Roman" w:hAnsi="Consolas" w:cs="Times New Roman"/>
+                          <w:color w:val="A9FEF7"/>
+                          <w:sz w:val="21"/>
+                          <w:szCs w:val="21"/>
+                          <w:lang w:val="fr-CH" w:eastAsia="it-CH"/>
+                        </w:rPr>
+                        <w:t>'home'</w:t>
+                      </w:r>
+                      <w:r>
+                        <w:rPr>
+                          <w:rFonts w:ascii="Consolas" w:eastAsia="Times New Roman" w:hAnsi="Consolas" w:cs="Times New Roman"/>
+                          <w:color w:val="94B4C4"/>
+                          <w:sz w:val="21"/>
+                          <w:szCs w:val="21"/>
+                          <w:lang w:val="fr-CH" w:eastAsia="it-CH"/>
+                        </w:rPr>
+                        <w:t>);</w:t>
+                      </w:r>
+                    </w:p>
+                  </w:txbxContent>
+                </v:textbox>
+                <w10:anchorlock/>
+              </v:shape>
+            </w:pict>
+          </mc:Fallback>
+        </mc:AlternateContent>
+      </w:r>
+    </w:p>
+    <w:p>
+      <w:pPr>
+        <w:pStyle w:val="Paragrafoelenco"/>
+        <w:numPr>
+          <w:ilvl w:val="0"/>
+          <w:numId w:val="7"/>
+        </w:numPr>
+      </w:pPr>
+      <w:r>
+        <w:t xml:space="preserve">Seguendo questa struttura creare le </w:t>
+      </w:r>
+      <w:proofErr w:type="spellStart"/>
+      <w:r>
+        <w:t>routes</w:t>
+      </w:r>
+      <w:proofErr w:type="spellEnd"/>
+      <w:r>
+        <w:t xml:space="preserve"> necessarie</w:t>
+      </w:r>
+    </w:p>
+    <w:p>
+      <w:pPr>
+        <w:pStyle w:val="Paragrafoelenco"/>
+        <w:numPr>
+          <w:ilvl w:val="0"/>
+          <w:numId w:val="7"/>
+        </w:numPr>
+      </w:pPr>
+      <w:r>
+        <w:t>Creare le view da restituire in “resources/views”</w:t>
+      </w:r>
+      <w:r>
+        <w:t xml:space="preserve"> (attenzione, si tratta di un formato apposta di </w:t>
+      </w:r>
+      <w:proofErr w:type="spellStart"/>
+      <w:r>
+        <w:t>laravel</w:t>
+      </w:r>
+      <w:proofErr w:type="spellEnd"/>
+      <w:r>
+        <w:t xml:space="preserve"> </w:t>
+      </w:r>
+      <w:proofErr w:type="spellStart"/>
+      <w:r>
+        <w:t>view.</w:t>
+      </w:r>
+      <w:r>
+        <w:rPr>
+          <w:b/>
+        </w:rPr>
+        <w:t>blade</w:t>
+      </w:r>
+      <w:r>
+        <w:t>.php</w:t>
+      </w:r>
+      <w:proofErr w:type="spellEnd"/>
+      <w:r>
+        <w:t>)</w:t>
+      </w:r>
+    </w:p>
+    <w:p>
+      <w:pPr>
+        <w:pStyle w:val="Paragrafoelenco"/>
+        <w:numPr>
+          <w:ilvl w:val="0"/>
+          <w:numId w:val="7"/>
+        </w:numPr>
+      </w:pPr>
+      <w:r>
+        <w:t xml:space="preserve">Infine per reindirizzare alle pagine create bisogna seguire la formattazione di </w:t>
+      </w:r>
+      <w:proofErr w:type="spellStart"/>
+      <w:r>
+        <w:t>laravel</w:t>
+      </w:r>
+      <w:proofErr w:type="spellEnd"/>
+      <w:r>
+        <w:t>:</w:t>
+      </w:r>
+    </w:p>
+    <w:p>
+      <w:pPr>
+        <w:pStyle w:val="Paragrafoelenco"/>
+        <w:numPr>
+          <w:ilvl w:val="1"/>
+          <w:numId w:val="7"/>
+        </w:numPr>
+      </w:pPr>
+      <w:r>
+        <w:t>&lt;a class="</w:t>
+      </w:r>
+      <w:proofErr w:type="spellStart"/>
+      <w:r>
+        <w:t>nav</w:t>
+      </w:r>
+      <w:proofErr w:type="spellEnd"/>
+      <w:r>
+        <w:t xml:space="preserve">-link" </w:t>
+      </w:r>
+      <w:proofErr w:type="spellStart"/>
+      <w:r>
+        <w:t>href</w:t>
+      </w:r>
+      <w:proofErr w:type="spellEnd"/>
+      <w:r>
+        <w:t>="</w:t>
+      </w:r>
+      <w:proofErr w:type="gramStart"/>
+      <w:r>
+        <w:rPr>
+          <w:b/>
+        </w:rPr>
+        <w:t>{{ route</w:t>
+      </w:r>
+      <w:proofErr w:type="gramEnd"/>
+      <w:r>
+        <w:rPr>
+          <w:b/>
+        </w:rPr>
+        <w:t>('home') }}</w:t>
+      </w:r>
+      <w:r>
+        <w:t>"&gt;Home&lt;/a&gt;</w:t>
+      </w:r>
+      <w:bookmarkStart w:id="24" w:name="_GoBack"/>
+      <w:bookmarkEnd w:id="24"/>
+    </w:p>
     <w:sectPr>
       <w:headerReference w:type="default" r:id="rId29"/>
       <w:footerReference w:type="default" r:id="rId30"/>
@@ -2944,27 +5790,14 @@
     <w:r>
       <w:t>/</w:t>
     </w:r>
-    <w:r>
-      <w:fldChar w:fldCharType="begin"/>
-    </w:r>
-    <w:r>
-      <w:instrText xml:space="preserve"> NUMPAGES   \* MERGEFORMAT </w:instrText>
-    </w:r>
-    <w:r>
-      <w:fldChar w:fldCharType="separate"/>
-    </w:r>
-    <w:r>
-      <w:rPr>
-        <w:noProof/>
-      </w:rPr>
-      <w:t>2</w:t>
-    </w:r>
-    <w:r>
-      <w:rPr>
-        <w:noProof/>
-      </w:rPr>
-      <w:fldChar w:fldCharType="end"/>
-    </w:r>
+    <w:fldSimple w:instr=" NUMPAGES   \* MERGEFORMAT ">
+      <w:r>
+        <w:rPr>
+          <w:noProof/>
+        </w:rPr>
+        <w:t>2</w:t>
+      </w:r>
+    </w:fldSimple>
   </w:p>
 </w:ftr>
 </file>
@@ -3356,6 +6189,181 @@
     </w:lvl>
   </w:abstractNum>
   <w:abstractNum w:abstractNumId="3" w15:restartNumberingAfterBreak="0">
+    <w:nsid w:val="6241294D"/>
+    <w:multiLevelType w:val="hybridMultilevel"/>
+    <w:tmpl w:val="73F87698"/>
+    <w:lvl w:ilvl="0" w:tplc="0810000F">
+      <w:start w:val="1"/>
+      <w:numFmt w:val="decimal"/>
+      <w:lvlText w:val="%1."/>
+      <w:lvlJc w:val="left"/>
+      <w:pPr>
+        <w:ind w:left="720" w:hanging="360"/>
+      </w:pPr>
+    </w:lvl>
+    <w:lvl w:ilvl="1" w:tplc="08100001">
+      <w:start w:val="1"/>
+      <w:numFmt w:val="bullet"/>
+      <w:lvlText w:val=""/>
+      <w:lvlJc w:val="left"/>
+      <w:pPr>
+        <w:ind w:left="1440" w:hanging="360"/>
+      </w:pPr>
+      <w:rPr>
+        <w:rFonts w:ascii="Symbol" w:hAnsi="Symbol" w:hint="default"/>
+      </w:rPr>
+    </w:lvl>
+    <w:lvl w:ilvl="2" w:tplc="0810001B" w:tentative="1">
+      <w:start w:val="1"/>
+      <w:numFmt w:val="lowerRoman"/>
+      <w:lvlText w:val="%3."/>
+      <w:lvlJc w:val="right"/>
+      <w:pPr>
+        <w:ind w:left="2160" w:hanging="180"/>
+      </w:pPr>
+    </w:lvl>
+    <w:lvl w:ilvl="3" w:tplc="0810000F" w:tentative="1">
+      <w:start w:val="1"/>
+      <w:numFmt w:val="decimal"/>
+      <w:lvlText w:val="%4."/>
+      <w:lvlJc w:val="left"/>
+      <w:pPr>
+        <w:ind w:left="2880" w:hanging="360"/>
+      </w:pPr>
+    </w:lvl>
+    <w:lvl w:ilvl="4" w:tplc="08100019" w:tentative="1">
+      <w:start w:val="1"/>
+      <w:numFmt w:val="lowerLetter"/>
+      <w:lvlText w:val="%5."/>
+      <w:lvlJc w:val="left"/>
+      <w:pPr>
+        <w:ind w:left="3600" w:hanging="360"/>
+      </w:pPr>
+    </w:lvl>
+    <w:lvl w:ilvl="5" w:tplc="0810001B" w:tentative="1">
+      <w:start w:val="1"/>
+      <w:numFmt w:val="lowerRoman"/>
+      <w:lvlText w:val="%6."/>
+      <w:lvlJc w:val="right"/>
+      <w:pPr>
+        <w:ind w:left="4320" w:hanging="180"/>
+      </w:pPr>
+    </w:lvl>
+    <w:lvl w:ilvl="6" w:tplc="0810000F" w:tentative="1">
+      <w:start w:val="1"/>
+      <w:numFmt w:val="decimal"/>
+      <w:lvlText w:val="%7."/>
+      <w:lvlJc w:val="left"/>
+      <w:pPr>
+        <w:ind w:left="5040" w:hanging="360"/>
+      </w:pPr>
+    </w:lvl>
+    <w:lvl w:ilvl="7" w:tplc="08100019" w:tentative="1">
+      <w:start w:val="1"/>
+      <w:numFmt w:val="lowerLetter"/>
+      <w:lvlText w:val="%8."/>
+      <w:lvlJc w:val="left"/>
+      <w:pPr>
+        <w:ind w:left="5760" w:hanging="360"/>
+      </w:pPr>
+    </w:lvl>
+    <w:lvl w:ilvl="8" w:tplc="0810001B" w:tentative="1">
+      <w:start w:val="1"/>
+      <w:numFmt w:val="lowerRoman"/>
+      <w:lvlText w:val="%9."/>
+      <w:lvlJc w:val="right"/>
+      <w:pPr>
+        <w:ind w:left="6480" w:hanging="180"/>
+      </w:pPr>
+    </w:lvl>
+  </w:abstractNum>
+  <w:abstractNum w:abstractNumId="4" w15:restartNumberingAfterBreak="0">
+    <w:nsid w:val="68100A0D"/>
+    <w:multiLevelType w:val="hybridMultilevel"/>
+    <w:tmpl w:val="AF422C6A"/>
+    <w:lvl w:ilvl="0" w:tplc="0810000F">
+      <w:start w:val="1"/>
+      <w:numFmt w:val="decimal"/>
+      <w:lvlText w:val="%1."/>
+      <w:lvlJc w:val="left"/>
+      <w:pPr>
+        <w:ind w:left="720" w:hanging="360"/>
+      </w:pPr>
+    </w:lvl>
+    <w:lvl w:ilvl="1" w:tplc="08100019">
+      <w:start w:val="1"/>
+      <w:numFmt w:val="lowerLetter"/>
+      <w:lvlText w:val="%2."/>
+      <w:lvlJc w:val="left"/>
+      <w:pPr>
+        <w:ind w:left="1440" w:hanging="360"/>
+      </w:pPr>
+    </w:lvl>
+    <w:lvl w:ilvl="2" w:tplc="0810001B" w:tentative="1">
+      <w:start w:val="1"/>
+      <w:numFmt w:val="lowerRoman"/>
+      <w:lvlText w:val="%3."/>
+      <w:lvlJc w:val="right"/>
+      <w:pPr>
+        <w:ind w:left="2160" w:hanging="180"/>
+      </w:pPr>
+    </w:lvl>
+    <w:lvl w:ilvl="3" w:tplc="0810000F" w:tentative="1">
+      <w:start w:val="1"/>
+      <w:numFmt w:val="decimal"/>
+      <w:lvlText w:val="%4."/>
+      <w:lvlJc w:val="left"/>
+      <w:pPr>
+        <w:ind w:left="2880" w:hanging="360"/>
+      </w:pPr>
+    </w:lvl>
+    <w:lvl w:ilvl="4" w:tplc="08100019" w:tentative="1">
+      <w:start w:val="1"/>
+      <w:numFmt w:val="lowerLetter"/>
+      <w:lvlText w:val="%5."/>
+      <w:lvlJc w:val="left"/>
+      <w:pPr>
+        <w:ind w:left="3600" w:hanging="360"/>
+      </w:pPr>
+    </w:lvl>
+    <w:lvl w:ilvl="5" w:tplc="0810001B" w:tentative="1">
+      <w:start w:val="1"/>
+      <w:numFmt w:val="lowerRoman"/>
+      <w:lvlText w:val="%6."/>
+      <w:lvlJc w:val="right"/>
+      <w:pPr>
+        <w:ind w:left="4320" w:hanging="180"/>
+      </w:pPr>
+    </w:lvl>
+    <w:lvl w:ilvl="6" w:tplc="0810000F" w:tentative="1">
+      <w:start w:val="1"/>
+      <w:numFmt w:val="decimal"/>
+      <w:lvlText w:val="%7."/>
+      <w:lvlJc w:val="left"/>
+      <w:pPr>
+        <w:ind w:left="5040" w:hanging="360"/>
+      </w:pPr>
+    </w:lvl>
+    <w:lvl w:ilvl="7" w:tplc="08100019" w:tentative="1">
+      <w:start w:val="1"/>
+      <w:numFmt w:val="lowerLetter"/>
+      <w:lvlText w:val="%8."/>
+      <w:lvlJc w:val="left"/>
+      <w:pPr>
+        <w:ind w:left="5760" w:hanging="360"/>
+      </w:pPr>
+    </w:lvl>
+    <w:lvl w:ilvl="8" w:tplc="0810001B" w:tentative="1">
+      <w:start w:val="1"/>
+      <w:numFmt w:val="lowerRoman"/>
+      <w:lvlText w:val="%9."/>
+      <w:lvlJc w:val="right"/>
+      <w:pPr>
+        <w:ind w:left="6480" w:hanging="180"/>
+      </w:pPr>
+    </w:lvl>
+  </w:abstractNum>
+  <w:abstractNum w:abstractNumId="5" w15:restartNumberingAfterBreak="0">
     <w:nsid w:val="761016D0"/>
     <w:multiLevelType w:val="hybridMultilevel"/>
     <w:tmpl w:val="A05ED30E"/>
@@ -3468,7 +6476,7 @@
       </w:rPr>
     </w:lvl>
   </w:abstractNum>
-  <w:abstractNum w:abstractNumId="4" w15:restartNumberingAfterBreak="0">
+  <w:abstractNum w:abstractNumId="6" w15:restartNumberingAfterBreak="0">
     <w:nsid w:val="79102060"/>
     <w:multiLevelType w:val="hybridMultilevel"/>
     <w:tmpl w:val="7870C630"/>
@@ -3582,19 +6590,25 @@
     </w:lvl>
   </w:abstractNum>
   <w:num w:numId="1">
-    <w:abstractNumId w:val="4"/>
+    <w:abstractNumId w:val="6"/>
   </w:num>
   <w:num w:numId="2">
     <w:abstractNumId w:val="2"/>
   </w:num>
   <w:num w:numId="3">
-    <w:abstractNumId w:val="3"/>
+    <w:abstractNumId w:val="5"/>
   </w:num>
   <w:num w:numId="4">
     <w:abstractNumId w:val="0"/>
   </w:num>
   <w:num w:numId="5">
     <w:abstractNumId w:val="1"/>
+  </w:num>
+  <w:num w:numId="6">
+    <w:abstractNumId w:val="4"/>
+  </w:num>
+  <w:num w:numId="7">
+    <w:abstractNumId w:val="3"/>
   </w:num>
 </w:numbering>
 </file>
@@ -4223,6 +7237,55 @@
       <w:szCs w:val="24"/>
     </w:rPr>
   </w:style>
+  <w:style w:type="paragraph" w:styleId="Sommario1">
+    <w:name w:val="toc 1"/>
+    <w:basedOn w:val="Normale"/>
+    <w:next w:val="Normale"/>
+    <w:autoRedefine/>
+    <w:uiPriority w:val="39"/>
+    <w:unhideWhenUsed/>
+    <w:rsid w:val="00687BED"/>
+    <w:pPr>
+      <w:spacing w:after="100"/>
+    </w:pPr>
+  </w:style>
+  <w:style w:type="paragraph" w:styleId="Sommario2">
+    <w:name w:val="toc 2"/>
+    <w:basedOn w:val="Normale"/>
+    <w:next w:val="Normale"/>
+    <w:autoRedefine/>
+    <w:uiPriority w:val="39"/>
+    <w:unhideWhenUsed/>
+    <w:rsid w:val="00687BED"/>
+    <w:pPr>
+      <w:spacing w:after="100"/>
+      <w:ind w:left="220"/>
+    </w:pPr>
+  </w:style>
+  <w:style w:type="paragraph" w:styleId="Sommario3">
+    <w:name w:val="toc 3"/>
+    <w:basedOn w:val="Normale"/>
+    <w:next w:val="Normale"/>
+    <w:autoRedefine/>
+    <w:uiPriority w:val="39"/>
+    <w:unhideWhenUsed/>
+    <w:rsid w:val="00687BED"/>
+    <w:pPr>
+      <w:spacing w:after="100"/>
+      <w:ind w:left="440"/>
+    </w:pPr>
+  </w:style>
+  <w:style w:type="character" w:styleId="Collegamentoipertestuale">
+    <w:name w:val="Hyperlink"/>
+    <w:basedOn w:val="Carpredefinitoparagrafo"/>
+    <w:uiPriority w:val="99"/>
+    <w:unhideWhenUsed/>
+    <w:rsid w:val="00687BED"/>
+    <w:rPr>
+      <w:color w:val="0563C1" w:themeColor="hyperlink"/>
+      <w:u w:val="single"/>
+    </w:rPr>
+  </w:style>
 </w:styles>
 </file>
 
@@ -4545,7 +7608,7 @@
 </file>
 
 <file path=customXml/itemProps2.xml><?xml version="1.0" encoding="utf-8"?>
-<ds:datastoreItem xmlns:ds="http://schemas.openxmlformats.org/officeDocument/2006/customXml" ds:itemID="{FD99B1B1-A6D8-4AE5-8D65-A082FC999186}">
+<ds:datastoreItem xmlns:ds="http://schemas.openxmlformats.org/officeDocument/2006/customXml" ds:itemID="{4BA7D46E-2F79-432F-A118-0C6F65E53148}">
   <ds:schemaRefs>
     <ds:schemaRef ds:uri="http://schemas.openxmlformats.org/officeDocument/2006/bibliography"/>
   </ds:schemaRefs>

</xml_diff>